<commit_message>
Mask phone number in public downloadable resume.
</commit_message>
<xml_diff>
--- a/个人简历.docx
+++ b/个人简历.docx
@@ -3735,21 +3735,7 @@
                                 <w:rFonts w:ascii="微软雅黑" w:hAnsi="微软雅黑" w:hint="eastAsia"/>
                                 <w:color w:val="262626" w:themeColor="text1" w:themeTint="D9"/>
                               </w:rPr>
-                              <w:t>姓    名：</w:t>
-                            </w:r>
-                            <w:r>
-                              <w:rPr>
-                                <w:rFonts w:ascii="微软雅黑" w:hAnsi="微软雅黑" w:hint="eastAsia"/>
-                                <w:color w:val="262626" w:themeColor="text1" w:themeTint="D9"/>
-                              </w:rPr>
-                              <w:t xml:space="preserve"> </w:t>
-                            </w:r>
-                            <w:r>
-                              <w:rPr>
-                                <w:rFonts w:ascii="微软雅黑" w:hAnsi="微软雅黑" w:hint="eastAsia"/>
-                                <w:color w:val="262626" w:themeColor="text1" w:themeTint="D9"/>
-                              </w:rPr>
-                              <w:t>朱轩慧</w:t>
+                              <w:t>姓    名： 朱轩慧</w:t>
                             </w:r>
                           </w:p>
                           <w:p>
@@ -3765,21 +3751,7 @@
                                 <w:rFonts w:ascii="微软雅黑" w:hAnsi="微软雅黑" w:hint="eastAsia"/>
                                 <w:color w:val="262626" w:themeColor="text1" w:themeTint="D9"/>
                               </w:rPr>
-                              <w:t>民    族：</w:t>
-                            </w:r>
-                            <w:r>
-                              <w:rPr>
-                                <w:rFonts w:ascii="微软雅黑" w:hAnsi="微软雅黑" w:hint="eastAsia"/>
-                                <w:color w:val="262626" w:themeColor="text1" w:themeTint="D9"/>
-                              </w:rPr>
-                              <w:t xml:space="preserve"> </w:t>
-                            </w:r>
-                            <w:r>
-                              <w:rPr>
-                                <w:rFonts w:ascii="微软雅黑" w:hAnsi="微软雅黑" w:hint="eastAsia"/>
-                                <w:color w:val="262626" w:themeColor="text1" w:themeTint="D9"/>
-                              </w:rPr>
-                              <w:t>汉族</w:t>
+                              <w:t>民    族： 汉族</w:t>
                             </w:r>
                           </w:p>
                           <w:p>
@@ -3795,14 +3767,7 @@
                                 <w:rFonts w:ascii="微软雅黑" w:hAnsi="微软雅黑" w:hint="eastAsia"/>
                                 <w:color w:val="262626" w:themeColor="text1" w:themeTint="D9"/>
                               </w:rPr>
-                              <w:t>电    话：</w:t>
-                            </w:r>
-                            <w:r>
-                              <w:rPr>
-                                <w:rFonts w:ascii="微软雅黑" w:hAnsi="微软雅黑" w:hint="eastAsia"/>
-                                <w:color w:val="262626" w:themeColor="text1" w:themeTint="D9"/>
-                              </w:rPr>
-                              <w:t>13201217105</w:t>
+                              <w:t>电    话：132****7105</w:t>
                             </w:r>
                           </w:p>
                           <w:p>
@@ -3818,28 +3783,7 @@
                                 <w:rFonts w:ascii="微软雅黑" w:hAnsi="微软雅黑" w:hint="eastAsia"/>
                                 <w:color w:val="262626" w:themeColor="text1" w:themeTint="D9"/>
                               </w:rPr>
-                              <w:t>邮    箱：</w:t>
-                            </w:r>
-                            <w:r>
-                              <w:rPr>
-                                <w:rFonts w:ascii="微软雅黑" w:hAnsi="微软雅黑" w:hint="eastAsia"/>
-                                <w:color w:val="262626" w:themeColor="text1" w:themeTint="D9"/>
-                              </w:rPr>
-                              <w:t>13201217105@163</w:t>
-                            </w:r>
-                            <w:r>
-                              <w:rPr>
-                                <w:rFonts w:ascii="微软雅黑" w:hAnsi="微软雅黑" w:hint="eastAsia"/>
-                                <w:color w:val="262626" w:themeColor="text1" w:themeTint="D9"/>
-                              </w:rPr>
-                              <w:t>.</w:t>
-                            </w:r>
-                            <w:r>
-                              <w:rPr>
-                                <w:rFonts w:ascii="微软雅黑" w:hAnsi="微软雅黑" w:hint="eastAsia"/>
-                                <w:color w:val="262626" w:themeColor="text1" w:themeTint="D9"/>
-                              </w:rPr>
-                              <w:t>com</w:t>
+                              <w:t>邮    箱：13201217105@163.com</w:t>
                             </w:r>
                           </w:p>
                         </w:txbxContent>
@@ -3871,21 +3815,7 @@
                           <w:rFonts w:ascii="微软雅黑" w:hAnsi="微软雅黑" w:hint="eastAsia"/>
                           <w:color w:val="262626" w:themeColor="text1" w:themeTint="D9"/>
                         </w:rPr>
-                        <w:t>姓    名：</w:t>
-                      </w:r>
-                      <w:r>
-                        <w:rPr>
-                          <w:rFonts w:ascii="微软雅黑" w:hAnsi="微软雅黑" w:hint="eastAsia"/>
-                          <w:color w:val="262626" w:themeColor="text1" w:themeTint="D9"/>
-                        </w:rPr>
-                        <w:t xml:space="preserve"> </w:t>
-                      </w:r>
-                      <w:r>
-                        <w:rPr>
-                          <w:rFonts w:ascii="微软雅黑" w:hAnsi="微软雅黑" w:hint="eastAsia"/>
-                          <w:color w:val="262626" w:themeColor="text1" w:themeTint="D9"/>
-                        </w:rPr>
-                        <w:t>朱轩慧</w:t>
+                        <w:t>姓    名： 朱轩慧</w:t>
                       </w:r>
                     </w:p>
                     <w:p>
@@ -3901,21 +3831,7 @@
                           <w:rFonts w:ascii="微软雅黑" w:hAnsi="微软雅黑" w:hint="eastAsia"/>
                           <w:color w:val="262626" w:themeColor="text1" w:themeTint="D9"/>
                         </w:rPr>
-                        <w:t>民    族：</w:t>
-                      </w:r>
-                      <w:r>
-                        <w:rPr>
-                          <w:rFonts w:ascii="微软雅黑" w:hAnsi="微软雅黑" w:hint="eastAsia"/>
-                          <w:color w:val="262626" w:themeColor="text1" w:themeTint="D9"/>
-                        </w:rPr>
-                        <w:t xml:space="preserve"> </w:t>
-                      </w:r>
-                      <w:r>
-                        <w:rPr>
-                          <w:rFonts w:ascii="微软雅黑" w:hAnsi="微软雅黑" w:hint="eastAsia"/>
-                          <w:color w:val="262626" w:themeColor="text1" w:themeTint="D9"/>
-                        </w:rPr>
-                        <w:t>汉族</w:t>
+                        <w:t>民    族： 汉族</w:t>
                       </w:r>
                     </w:p>
                     <w:p>
@@ -3931,14 +3847,7 @@
                           <w:rFonts w:ascii="微软雅黑" w:hAnsi="微软雅黑" w:hint="eastAsia"/>
                           <w:color w:val="262626" w:themeColor="text1" w:themeTint="D9"/>
                         </w:rPr>
-                        <w:t>电    话：</w:t>
-                      </w:r>
-                      <w:r>
-                        <w:rPr>
-                          <w:rFonts w:ascii="微软雅黑" w:hAnsi="微软雅黑" w:hint="eastAsia"/>
-                          <w:color w:val="262626" w:themeColor="text1" w:themeTint="D9"/>
-                        </w:rPr>
-                        <w:t>13201217105</w:t>
+                        <w:t>电    话：132****7105</w:t>
                       </w:r>
                     </w:p>
                     <w:p>
@@ -3954,28 +3863,7 @@
                           <w:rFonts w:ascii="微软雅黑" w:hAnsi="微软雅黑" w:hint="eastAsia"/>
                           <w:color w:val="262626" w:themeColor="text1" w:themeTint="D9"/>
                         </w:rPr>
-                        <w:t>邮    箱：</w:t>
-                      </w:r>
-                      <w:r>
-                        <w:rPr>
-                          <w:rFonts w:ascii="微软雅黑" w:hAnsi="微软雅黑" w:hint="eastAsia"/>
-                          <w:color w:val="262626" w:themeColor="text1" w:themeTint="D9"/>
-                        </w:rPr>
-                        <w:t>13201217105@163</w:t>
-                      </w:r>
-                      <w:r>
-                        <w:rPr>
-                          <w:rFonts w:ascii="微软雅黑" w:hAnsi="微软雅黑" w:hint="eastAsia"/>
-                          <w:color w:val="262626" w:themeColor="text1" w:themeTint="D9"/>
-                        </w:rPr>
-                        <w:t>.</w:t>
-                      </w:r>
-                      <w:r>
-                        <w:rPr>
-                          <w:rFonts w:ascii="微软雅黑" w:hAnsi="微软雅黑" w:hint="eastAsia"/>
-                          <w:color w:val="262626" w:themeColor="text1" w:themeTint="D9"/>
-                        </w:rPr>
-                        <w:t>com</w:t>
+                        <w:t>邮    箱：13201217105@163.com</w:t>
                       </w:r>
                     </w:p>
                   </w:txbxContent>

</xml_diff>

<commit_message>
Update AI resume copy and add PDF download.
</commit_message>
<xml_diff>
--- a/个人简历.docx
+++ b/个人简历.docx
@@ -3932,360 +3932,20 @@
     </w:p>
     <w:p>
       <w:pPr>
+        <w:spacing w:before="0" w:after="0" w:line="240" w:lineRule="auto"/>
+        <w:jc w:val="left"/>
         <w:rPr>
           <w:rFonts w:hint="eastAsia"/>
         </w:rPr>
       </w:pPr>
-      <w:r>
-        <w:rPr>
-          <w:noProof/>
-        </w:rPr>
-        <mc:AlternateContent>
-          <mc:Choice Requires="wpg">
-            <w:drawing>
-              <wp:anchor distT="0" distB="0" distL="114300" distR="114300" simplePos="0" relativeHeight="251666432" behindDoc="0" locked="0" layoutInCell="1" allowOverlap="1" wp14:anchorId="6EF7BFEE" wp14:editId="16C51E25">
-                <wp:simplePos x="0" y="0"/>
-                <wp:positionH relativeFrom="column">
-                  <wp:posOffset>-84801</wp:posOffset>
-                </wp:positionH>
-                <wp:positionV relativeFrom="paragraph">
-                  <wp:posOffset>171162</wp:posOffset>
-                </wp:positionV>
-                <wp:extent cx="6781800" cy="309880"/>
-                <wp:effectExtent l="0" t="0" r="0" b="10160"/>
-                <wp:wrapNone/>
-                <wp:docPr id="7" name="组合 31"/>
-                <wp:cNvGraphicFramePr/>
-                <a:graphic xmlns:a="http://schemas.openxmlformats.org/drawingml/2006/main">
-                  <a:graphicData uri="http://schemas.microsoft.com/office/word/2010/wordprocessingGroup">
-                    <wpg:wgp>
-                      <wpg:cNvGrpSpPr/>
-                      <wpg:grpSpPr>
-                        <a:xfrm>
-                          <a:off x="0" y="0"/>
-                          <a:ext cx="6781800" cy="309880"/>
-                          <a:chOff x="0" y="4811"/>
-                          <a:chExt cx="6781800" cy="279589"/>
-                        </a:xfrm>
-                      </wpg:grpSpPr>
-                      <wpg:grpSp>
-                        <wpg:cNvPr id="8" name="组合 81"/>
-                        <wpg:cNvGrpSpPr>
-                          <a:grpSpLocks noChangeAspect="1"/>
-                        </wpg:cNvGrpSpPr>
-                        <wpg:grpSpPr>
-                          <a:xfrm>
-                            <a:off x="0" y="4811"/>
-                            <a:ext cx="1256665" cy="279589"/>
-                            <a:chOff x="3" y="6660"/>
-                            <a:chExt cx="1256004" cy="387035"/>
-                          </a:xfrm>
-                        </wpg:grpSpPr>
-                        <wps:wsp>
-                          <wps:cNvPr id="11" name="任意多边形 2"/>
-                          <wps:cNvSpPr/>
-                          <wps:spPr bwMode="auto">
-                            <a:xfrm>
-                              <a:off x="3" y="6660"/>
-                              <a:ext cx="1256004" cy="281211"/>
-                            </a:xfrm>
-                            <a:custGeom>
-                              <a:avLst/>
-                              <a:gdLst>
-                                <a:gd name="T0" fmla="*/ 976122 w 1406296"/>
-                                <a:gd name="T1" fmla="*/ 0 h 288031"/>
-                                <a:gd name="T2" fmla="*/ 1045770 w 1406296"/>
-                                <a:gd name="T3" fmla="*/ 0 h 288031"/>
-                                <a:gd name="T4" fmla="*/ 1255739 w 1406296"/>
-                                <a:gd name="T5" fmla="*/ 287656 h 288031"/>
-                                <a:gd name="T6" fmla="*/ 1186091 w 1406296"/>
-                                <a:gd name="T7" fmla="*/ 287656 h 288031"/>
-                                <a:gd name="T8" fmla="*/ 919994 w 1406296"/>
-                                <a:gd name="T9" fmla="*/ 0 h 288031"/>
-                                <a:gd name="T10" fmla="*/ 955372 w 1406296"/>
-                                <a:gd name="T11" fmla="*/ 0 h 288031"/>
-                                <a:gd name="T12" fmla="*/ 1165341 w 1406296"/>
-                                <a:gd name="T13" fmla="*/ 287656 h 288031"/>
-                                <a:gd name="T14" fmla="*/ 1129963 w 1406296"/>
-                                <a:gd name="T15" fmla="*/ 287656 h 288031"/>
-                                <a:gd name="T16" fmla="*/ 0 w 1406296"/>
-                                <a:gd name="T17" fmla="*/ 0 h 288031"/>
-                                <a:gd name="T18" fmla="*/ 899245 w 1406296"/>
-                                <a:gd name="T19" fmla="*/ 0 h 288031"/>
-                                <a:gd name="T20" fmla="*/ 1109214 w 1406296"/>
-                                <a:gd name="T21" fmla="*/ 287656 h 288031"/>
-                                <a:gd name="T22" fmla="*/ 0 w 1406296"/>
-                                <a:gd name="T23" fmla="*/ 287656 h 288031"/>
-                                <a:gd name="T24" fmla="*/ 0 60000 65536"/>
-                                <a:gd name="T25" fmla="*/ 0 60000 65536"/>
-                                <a:gd name="T26" fmla="*/ 0 60000 65536"/>
-                                <a:gd name="T27" fmla="*/ 0 60000 65536"/>
-                                <a:gd name="T28" fmla="*/ 0 60000 65536"/>
-                                <a:gd name="T29" fmla="*/ 0 60000 65536"/>
-                                <a:gd name="T30" fmla="*/ 0 60000 65536"/>
-                                <a:gd name="T31" fmla="*/ 0 60000 65536"/>
-                                <a:gd name="T32" fmla="*/ 0 60000 65536"/>
-                                <a:gd name="T33" fmla="*/ 0 60000 65536"/>
-                                <a:gd name="T34" fmla="*/ 0 60000 65536"/>
-                                <a:gd name="T35" fmla="*/ 0 60000 65536"/>
-                                <a:gd name="T36" fmla="*/ 0 w 1406296"/>
-                                <a:gd name="T37" fmla="*/ 0 h 288031"/>
-                                <a:gd name="T38" fmla="*/ 1406296 w 1406296"/>
-                                <a:gd name="T39" fmla="*/ 288031 h 288031"/>
-                              </a:gdLst>
-                              <a:ahLst/>
-                              <a:cxnLst>
-                                <a:cxn ang="T24">
-                                  <a:pos x="T0" y="T1"/>
-                                </a:cxn>
-                                <a:cxn ang="T25">
-                                  <a:pos x="T2" y="T3"/>
-                                </a:cxn>
-                                <a:cxn ang="T26">
-                                  <a:pos x="T4" y="T5"/>
-                                </a:cxn>
-                                <a:cxn ang="T27">
-                                  <a:pos x="T6" y="T7"/>
-                                </a:cxn>
-                                <a:cxn ang="T28">
-                                  <a:pos x="T8" y="T9"/>
-                                </a:cxn>
-                                <a:cxn ang="T29">
-                                  <a:pos x="T10" y="T11"/>
-                                </a:cxn>
-                                <a:cxn ang="T30">
-                                  <a:pos x="T12" y="T13"/>
-                                </a:cxn>
-                                <a:cxn ang="T31">
-                                  <a:pos x="T14" y="T15"/>
-                                </a:cxn>
-                                <a:cxn ang="T32">
-                                  <a:pos x="T16" y="T17"/>
-                                </a:cxn>
-                                <a:cxn ang="T33">
-                                  <a:pos x="T18" y="T19"/>
-                                </a:cxn>
-                                <a:cxn ang="T34">
-                                  <a:pos x="T20" y="T21"/>
-                                </a:cxn>
-                                <a:cxn ang="T35">
-                                  <a:pos x="T22" y="T23"/>
-                                </a:cxn>
-                              </a:cxnLst>
-                              <a:rect l="T36" t="T37" r="T38" b="T39"/>
-                              <a:pathLst>
-                                <a:path w="1406296" h="288031">
-                                  <a:moveTo>
-                                    <a:pt x="1093154" y="0"/>
-                                  </a:moveTo>
-                                  <a:lnTo>
-                                    <a:pt x="1171153" y="0"/>
-                                  </a:lnTo>
-                                  <a:lnTo>
-                                    <a:pt x="1406296" y="288031"/>
-                                  </a:lnTo>
-                                  <a:lnTo>
-                                    <a:pt x="1328297" y="288031"/>
-                                  </a:lnTo>
-                                  <a:lnTo>
-                                    <a:pt x="1093154" y="0"/>
-                                  </a:lnTo>
-                                  <a:close/>
-                                  <a:moveTo>
-                                    <a:pt x="1030297" y="0"/>
-                                  </a:moveTo>
-                                  <a:lnTo>
-                                    <a:pt x="1069917" y="0"/>
-                                  </a:lnTo>
-                                  <a:lnTo>
-                                    <a:pt x="1305060" y="288031"/>
-                                  </a:lnTo>
-                                  <a:lnTo>
-                                    <a:pt x="1265440" y="288031"/>
-                                  </a:lnTo>
-                                  <a:lnTo>
-                                    <a:pt x="1030297" y="0"/>
-                                  </a:lnTo>
-                                  <a:close/>
-                                  <a:moveTo>
-                                    <a:pt x="0" y="0"/>
-                                  </a:moveTo>
-                                  <a:lnTo>
-                                    <a:pt x="1007060" y="0"/>
-                                  </a:lnTo>
-                                  <a:lnTo>
-                                    <a:pt x="1242203" y="288031"/>
-                                  </a:lnTo>
-                                  <a:lnTo>
-                                    <a:pt x="0" y="288031"/>
-                                  </a:lnTo>
-                                  <a:lnTo>
-                                    <a:pt x="0" y="0"/>
-                                  </a:lnTo>
-                                  <a:close/>
-                                </a:path>
-                              </a:pathLst>
-                            </a:custGeom>
-                            <a:solidFill>
-                              <a:srgbClr val="4E7282"/>
-                            </a:solidFill>
-                            <a:ln>
-                              <a:noFill/>
-                            </a:ln>
-                          </wps:spPr>
-                          <wps:txbx>
-                            <w:txbxContent>
-                              <w:p>
-                                <w:pPr>
-                                  <w:adjustRightInd w:val="0"/>
-                                  <w:snapToGrid w:val="0"/>
-                                  <w:spacing w:line="320" w:lineRule="exact"/>
-                                  <w:rPr>
-                                    <w:rFonts w:ascii="微软雅黑" w:hAnsi="微软雅黑" w:hint="eastAsia"/>
-                                    <w:color w:val="FFFFFF"/>
-                                    <w:sz w:val="24"/>
-                                    <w:szCs w:val="24"/>
-                                  </w:rPr>
-                                </w:pPr>
-                                <w:r>
-                                  <w:rPr>
-                                    <w:rFonts w:ascii="微软雅黑" w:hAnsi="微软雅黑" w:hint="eastAsia"/>
-                                    <w:color w:val="FFFFFF"/>
-                                    <w:sz w:val="24"/>
-                                    <w:szCs w:val="24"/>
-                                  </w:rPr>
-                                  <w:t>技能特长</w:t>
-                                </w:r>
-                              </w:p>
-                              <w:p>
-                                <w:pPr>
-                                  <w:adjustRightInd w:val="0"/>
-                                  <w:snapToGrid w:val="0"/>
-                                  <w:spacing w:line="320" w:lineRule="exact"/>
-                                  <w:rPr>
-                                    <w:rFonts w:ascii="微软雅黑" w:hAnsi="微软雅黑" w:hint="eastAsia"/>
-                                    <w:color w:val="FFFFFF"/>
-                                    <w:sz w:val="24"/>
-                                    <w:szCs w:val="24"/>
-                                  </w:rPr>
-                                </w:pPr>
-                              </w:p>
-                            </w:txbxContent>
-                          </wps:txbx>
-                          <wps:bodyPr rot="0" vert="horz" wrap="square" lIns="198000" tIns="0" rIns="91440" bIns="0" anchor="ctr" anchorCtr="0" upright="1">
-                            <a:noAutofit/>
-                          </wps:bodyPr>
-                        </wps:wsp>
-                        <wps:wsp>
-                          <wps:cNvPr id="16" name="直角三角形 3"/>
-                          <wps:cNvSpPr>
-                            <a:spLocks noChangeArrowheads="1"/>
-                          </wps:cNvSpPr>
-                          <wps:spPr bwMode="auto">
-                            <a:xfrm rot="10800000">
-                              <a:off x="234" y="287656"/>
-                              <a:ext cx="143935" cy="106039"/>
-                            </a:xfrm>
-                            <a:prstGeom prst="rtTriangle">
-                              <a:avLst/>
-                            </a:prstGeom>
-                            <a:solidFill>
-                              <a:srgbClr val="405E6C"/>
-                            </a:solidFill>
-                            <a:ln>
-                              <a:noFill/>
-                            </a:ln>
-                          </wps:spPr>
-                          <wps:bodyPr rot="0" vert="horz" wrap="square" lIns="91440" tIns="45720" rIns="91440" bIns="45720" anchor="t" anchorCtr="0" upright="1">
-                            <a:noAutofit/>
-                          </wps:bodyPr>
-                        </wps:wsp>
-                      </wpg:grpSp>
-                      <wps:wsp>
-                        <wps:cNvPr id="17" name="直接连接符 20"/>
-                        <wps:cNvCnPr>
-                          <a:cxnSpLocks noChangeShapeType="1"/>
-                        </wps:cNvCnPr>
-                        <wps:spPr bwMode="auto">
-                          <a:xfrm>
-                            <a:off x="133350" y="209550"/>
-                            <a:ext cx="6648450" cy="0"/>
-                          </a:xfrm>
-                          <a:prstGeom prst="line">
-                            <a:avLst/>
-                          </a:prstGeom>
-                          <a:noFill/>
-                          <a:ln w="9525" algn="ctr">
-                            <a:solidFill>
-                              <a:srgbClr val="4E7282"/>
-                            </a:solidFill>
-                            <a:round/>
-                          </a:ln>
-                        </wps:spPr>
-                        <wps:bodyPr/>
-                      </wps:wsp>
-                    </wpg:wgp>
-                  </a:graphicData>
-                </a:graphic>
-              </wp:anchor>
-            </w:drawing>
-          </mc:Choice>
-          <mc:Fallback>
-            <w:pict>
-              <v:group w14:anchorId="6EF7BFEE" id="组合 31" o:spid="_x0000_s1042" style="position:absolute;left:0;text-align:left;margin-left:-6.7pt;margin-top:13.5pt;width:534pt;height:24.4pt;z-index:251666432" coordorigin=",48" coordsize="67818,2795" o:gfxdata="UEsDBBQABgAIAAAAIQC2gziS/gAAAOEBAAATAAAAW0NvbnRlbnRfVHlwZXNdLnhtbJSRQU7DMBBF&#10;90jcwfIWJU67QAgl6YK0S0CoHGBkTxKLZGx5TGhvj5O2G0SRWNoz/78nu9wcxkFMGNg6quQqL6RA&#10;0s5Y6ir5vt9lD1JwBDIwOMJKHpHlpr69KfdHjyxSmriSfYz+USnWPY7AufNIadK6MEJMx9ApD/oD&#10;OlTrorhX2lFEilmcO2RdNtjC5xDF9pCuTyYBB5bi6bQ4syoJ3g9WQ0ymaiLzg5KdCXlKLjvcW893&#10;SUOqXwnz5DrgnHtJTxOsQfEKIT7DmDSUCaxw7Rqn8787ZsmRM9e2VmPeBN4uqYvTtW7jvijg9N/y&#10;JsXecLq0q+WD6m8AAAD//wMAUEsDBBQABgAIAAAAIQA4/SH/1gAAAJQBAAALAAAAX3JlbHMvLnJl&#10;bHOkkMFqwzAMhu+DvYPRfXGawxijTi+j0GvpHsDYimMaW0Yy2fr2M4PBMnrbUb/Q94l/f/hMi1qR&#10;JVI2sOt6UJgd+ZiDgffL8ekFlFSbvV0oo4EbChzGx4f9GRdb25HMsYhqlCwG5lrLq9biZkxWOiqY&#10;22YiTra2kYMu1l1tQD30/bPm3wwYN0x18gb45AdQl1tp5j/sFB2T0FQ7R0nTNEV3j6o9feQzro1i&#10;OWA14Fm+Q8a1a8+Bvu/d/dMb2JY5uiPbhG/ktn4cqGU/er3pcvwCAAD//wMAUEsDBBQABgAIAAAA&#10;IQBgZWR+ewYAAFwWAAAOAAAAZHJzL2Uyb0RvYy54bWy8WMuO40QU3SPxD5aXSExc5dixo0mPRj0P&#10;IQ3Q0oQPcDvOQzguU3Z30qxnARtALEFigXhsWLIAjYCfmddncG65yrGTtjszI9g4dnzq+t57Tt2q&#10;W7fvbNepdZnIYiWyic1uObaVZLGYrbLFxP5k+uD9wLaKMspmUSqyZGJfJYV95+Tdd25v8nHCxVKk&#10;s0RaMJIV400+sZdlmY8HgyJeJuuouCXyJMPLuZDrqMSjXAxmMtrA+jodcMfxBxshZ7kUcVIU+Pde&#10;9dI+Ufbn8yQuP57Pi6S00okN30p1lep6TtfBye1ovJBRvlzF2o3oDbxYR6sMH61N3YvKyLqQqwNT&#10;61UsRSHm5a1YrAdiPl/FiYoB0TBnL5qHUlzkKpbFeLPI6zQhtXt5emOz8UeXD2X+OD+TyMQmXyAX&#10;6oli2c7lmn7hpbVVKbuqU5ZsSyvGn/4oYIGDzMZ45zphEOicxkskfjdsGDBWJTte3r9uLB+FXhAS&#10;ZGC+PGj5Uz9UfsLxM2mtZhMbCsuiNbT18umT5998YQXqQwTfBVdRg8geifjTwsrE6TLKFsndIodC&#10;oFv13f0h9RfPZGc6dnGZjDDu+b7vVRnZRRWN64y4toVkAVSnymSExjrOUGczGDmu15sRzJliJ4vi&#10;7WTxeBnliVJbQZnT2QVtOr3Pnj598eTr5z999+rvP5//9aPFybVNrsC1gIpxAS1Z55sPxQyURBel&#10;UPNiT0v7KWgmr04ADxivVFNLAlm8KMqHiVDCjC4fFWU1g2e4UyTPtLdTaHK+TjGZ3xtY4chnnFsb&#10;iw0dn4c+eY65WmMRY411rKXFIWNX63WH4g0Uc4beaOR0m0SER5gE1TUK5HsjN+w2CU3VYB6MfM/v&#10;dNVvQBkLfCdk3XZHDfANdjHXahdCFobhsNts2MB2J5W1ePI8d9TH03FEsRZTzPfcYU/4rEnVDfGz&#10;FmGMh6HvdmeAvQZjrElZj65Yk62etDaZCsKQD70eP4+jijepYswJOeuhnze5uiGtvElYT/D8Naji&#10;TaocC3XVwRUCO5j9vElTP7JNUp/NNk19yCZT/V9v09Rj020y1WsTVW43o/uRbY76vt5kqd/m0Rxh&#10;ITzWzzZHnTXfbTPUVfTdJj16+eieSW6TomoVadVoLGQLs1RFS7N6xdtML1+4s7AxmdhTyJfWqFwU&#10;tImi1Qx7hmm1UcEquM3obQPuteDgiuCu3j0cwv0WHDQQ3Gw2DuGjFhwZJvio03rQgiODBDebu0Pr&#10;YQtOKwLh66X/YADk3cwNlXs1oDNcqLw1QMeL+lztNw+/wNsDdMQovl0D3PYAHTPrDNpt80u1lWJA&#10;1ez6wh7DOmiUxMYA6AuxaDFJ7G2p75mi5FHnMyXJo/eZkqbR/UyhVoyFyKKStGhurQ12xHqjZC0n&#10;tt4N0eu1uEymQgFL0iUWAZd5VTrVbhYO7DBp1sKyEWMeagPiNFiDML95ZdV8HMjdVgymDcz8arjL&#10;Ax4itiPh1/hsDMapKBKVk10U+iOO65iPGO93GDPeYP0wpIX65khdx3PQBxzrOve94fB4+DU+G0+7&#10;I63M3xyjMzKeG6yxbX51NviQc6fi/Qg2j46u7af5pokLaiFZq3ay1jdNj0b/UIh0NXuwSlMSdCEX&#10;56eptC4jTJnh/RE0pWdWC5aqwpsJGlZNPPoHrWrV+VQdUbk93+reFBh6dy5mV+iLpKhOIHBigpul&#10;kJ/b1ganDxO7+OwikoltpR9k6ONYiKYaAZbqCTdS3YRMsX9u/o2yGDYmdlxKG+sGPZyWeMaAi1yu&#10;FkvV21J0mbiLVmy+onZJOVs5pB/QRVZu/vftJEqR7ta///3Vr98+++NLXKmdVHWs0U4qTvb7dSnF&#10;ZplEM0qRYqc1wJBwfftZJZ85lFnkluzrkw2OYlzNQGqqqppYd6RDN6TNB51vMAi+qpkQkuloc1k1&#10;pBbdTGxZTuUKS3hKrXQ0Ni0qyVEDVWDdynO8+/7pGyvvNXWmBVXJDB0tLUPXSE2/MXIr315su7Od&#10;/0t4KMe18F589fOrf37A9eVvv1iIWU9SnHqcZtVhD1bR/cMidT4yvcpxrNHSXjWkX3sNsTHXdT2k&#10;mRYrJ/Rwi69HY6M33x8GQ3pPgjOFtUNr6SrrVVldpWjlpFU99KjXidIFzmqpZtwgxc4iiHPJbEaV&#10;hAwfVL9Kg6bQqNqi6MYRphqij1vpjLT5rOzsDoVP/gUAAP//AwBQSwMEFAAGAAgAAAAhAKkxck/h&#10;AAAACgEAAA8AAABkcnMvZG93bnJldi54bWxMj0FrwkAQhe+F/odlCr3pJmpU0mxEpO1JCtVC6W3M&#10;jkkwOxuyaxL/fddTexzm473vZZvRNKKnztWWFcTTCARxYXXNpYKv49tkDcJ5ZI2NZVJwIweb/PEh&#10;w1TbgT+pP/hShBB2KSqovG9TKV1RkUE3tS1x+J1tZ9CHsyul7nAI4aaRsyhaSoM1h4YKW9pVVFwO&#10;V6PgfcBhO49f+/3lvLv9HJOP731MSj0/jdsXEJ5G/wfDXT+oQx6cTvbK2olGwSSeLwKqYLYKm+5A&#10;lCyWIE4KVskaZJ7J/xPyXwAAAP//AwBQSwECLQAUAAYACAAAACEAtoM4kv4AAADhAQAAEwAAAAAA&#10;AAAAAAAAAAAAAAAAW0NvbnRlbnRfVHlwZXNdLnhtbFBLAQItABQABgAIAAAAIQA4/SH/1gAAAJQB&#10;AAALAAAAAAAAAAAAAAAAAC8BAABfcmVscy8ucmVsc1BLAQItABQABgAIAAAAIQBgZWR+ewYAAFwW&#10;AAAOAAAAAAAAAAAAAAAAAC4CAABkcnMvZTJvRG9jLnhtbFBLAQItABQABgAIAAAAIQCpMXJP4QAA&#10;AAoBAAAPAAAAAAAAAAAAAAAAANUIAABkcnMvZG93bnJldi54bWxQSwUGAAAAAAQABADzAAAA4wkA&#10;AAAA&#10;">
-                <v:group id="组合 81" o:spid="_x0000_s1043" style="position:absolute;top:48;width:12566;height:2796" coordorigin=",66" coordsize="12560,3870" o:gfxdata="UEsDBBQABgAIAAAAIQDb4fbL7gAAAIUBAAATAAAAW0NvbnRlbnRfVHlwZXNdLnhtbHyQz07DMAyH&#10;70i8Q+QralM4IITa7kDhCAiNB7ASt43WOlEcyvb2pNu4IODoPz9/n1xv9vOkForiPDdwXVagiI23&#10;jocG3rdPxR0oScgWJ8/UwIEENu3lRb09BBKV0ywNjCmFe63FjDSjlD4Q50nv44wpl3HQAc0OB9I3&#10;VXWrjedEnIq03oC27qjHjympx31un0wiTQLq4bS4shrAECZnMGVTvbD9QSnOhDInjzsyuiBXWQP0&#10;r4R18jfgnHvJr4nOknrFmJ5xzhraRtHWf3Kkpfz/yGo5S+H73hkquyhdjr3R8m2lj09svwAAAP//&#10;AwBQSwMEFAAGAAgAAAAhAFr0LFu/AAAAFQEAAAsAAABfcmVscy8ucmVsc2zPwWrDMAwG4Ptg72B0&#10;X5TuUMaI01uh19I+gLGVxCy2jGSy9e1nemrHjpL4P0nD4SetZiPRyNnCruvBUPYcYp4tXC/Htw8w&#10;Wl0ObuVMFm6kcBhfX4Yzra62kC6xqGlKVgtLreUTUf1CyWnHhXKbTCzJ1VbKjMX5LzcTvvf9HuXR&#10;gPHJNKdgQU5hB+ZyK23zHztFL6w81c5zQp6m6P9TMfB3PtPWFCczVQtB9N4U2rp2HOA44NMz4y8A&#10;AAD//wMAUEsDBBQABgAIAAAAIQDT2Cy2wQAAANoAAAAPAAAAZHJzL2Rvd25yZXYueG1sRE/LasJA&#10;FN0X/IfhCt3VSVoqEh2DiJUuQsEHiLtL5pqEZO6EzJjH33cWhS4P571JR9OInjpXWVYQLyIQxLnV&#10;FRcKrpevtxUI55E1NpZJwUQO0u3sZYOJtgOfqD/7QoQQdgkqKL1vEyldXpJBt7AtceAetjPoA+wK&#10;qTscQrhp5HsULaXBikNDiS3tS8rr89MoOA447D7iQ5/Vj/10v3z+3LKYlHqdj7s1CE+j/xf/ub+1&#10;grA1XAk3QG5/AQAA//8DAFBLAQItABQABgAIAAAAIQDb4fbL7gAAAIUBAAATAAAAAAAAAAAAAAAA&#10;AAAAAABbQ29udGVudF9UeXBlc10ueG1sUEsBAi0AFAAGAAgAAAAhAFr0LFu/AAAAFQEAAAsAAAAA&#10;AAAAAAAAAAAAHwEAAF9yZWxzLy5yZWxzUEsBAi0AFAAGAAgAAAAhANPYLLbBAAAA2gAAAA8AAAAA&#10;AAAAAAAAAAAABwIAAGRycy9kb3ducmV2LnhtbFBLBQYAAAAAAwADALcAAAD1AgAAAAA=&#10;">
-                  <o:lock v:ext="edit" aspectratio="t"/>
-                  <v:shape id="任意多边形 2" o:spid="_x0000_s1044" style="position:absolute;top:66;width:12560;height:2812;visibility:visible;mso-wrap-style:square;v-text-anchor:middle" coordsize="1406296,288031" o:spt="100" o:gfxdata="UEsDBBQABgAIAAAAIQDb4fbL7gAAAIUBAAATAAAAW0NvbnRlbnRfVHlwZXNdLnhtbHyQz07DMAyH&#10;70i8Q+QralM4IITa7kDhCAiNB7ASt43WOlEcyvb2pNu4IODoPz9/n1xv9vOkForiPDdwXVagiI23&#10;jocG3rdPxR0oScgWJ8/UwIEENu3lRb09BBKV0ywNjCmFe63FjDSjlD4Q50nv44wpl3HQAc0OB9I3&#10;VXWrjedEnIq03oC27qjHjympx31un0wiTQLq4bS4shrAECZnMGVTvbD9QSnOhDInjzsyuiBXWQP0&#10;r4R18jfgnHvJr4nOknrFmJ5xzhraRtHWf3Kkpfz/yGo5S+H73hkquyhdjr3R8m2lj09svwAAAP//&#10;AwBQSwMEFAAGAAgAAAAhAFr0LFu/AAAAFQEAAAsAAABfcmVscy8ucmVsc2zPwWrDMAwG4Ptg72B0&#10;X5TuUMaI01uh19I+gLGVxCy2jGSy9e1nemrHjpL4P0nD4SetZiPRyNnCruvBUPYcYp4tXC/Htw8w&#10;Wl0ObuVMFm6kcBhfX4Yzra62kC6xqGlKVgtLreUTUf1CyWnHhXKbTCzJ1VbKjMX5LzcTvvf9HuXR&#10;gPHJNKdgQU5hB+ZyK23zHztFL6w81c5zQp6m6P9TMfB3PtPWFCczVQtB9N4U2rp2HOA44NMz4y8A&#10;AAD//wMAUEsDBBQABgAIAAAAIQAle6R4wQAAANsAAAAPAAAAZHJzL2Rvd25yZXYueG1sRE/fa8Iw&#10;EH4f+D+EE3ybqYJzdEYZg4niS+3G2OPRnG1YcylNbOp/bwaDvd3H9/M2u9G2YqDeG8cKFvMMBHHl&#10;tOFawefH++MzCB+QNbaOScGNPOy2k4cN5tpFPtNQhlqkEPY5KmhC6HIpfdWQRT93HXHiLq63GBLs&#10;a6l7jCnctnKZZU/SouHU0GBHbw1VP+XVKiiP66IwMe5Xg/kqLldenr6jVWo2HV9fQAQaw7/4z33Q&#10;af4Cfn9JB8jtHQAA//8DAFBLAQItABQABgAIAAAAIQDb4fbL7gAAAIUBAAATAAAAAAAAAAAAAAAA&#10;AAAAAABbQ29udGVudF9UeXBlc10ueG1sUEsBAi0AFAAGAAgAAAAhAFr0LFu/AAAAFQEAAAsAAAAA&#10;AAAAAAAAAAAAHwEAAF9yZWxzLy5yZWxzUEsBAi0AFAAGAAgAAAAhACV7pHjBAAAA2wAAAA8AAAAA&#10;AAAAAAAAAAAABwIAAGRycy9kb3ducmV2LnhtbFBLBQYAAAAAAwADALcAAAD1AgAAAAA=&#10;" adj="-11796480,,5400" path="m1093154,r77999,l1406296,288031r-77999,l1093154,xm1030297,r39620,l1305060,288031r-39620,l1030297,xm,l1007060,r235143,288031l,288031,,xe" fillcolor="#4e7282" stroked="f">
-                    <v:stroke joinstyle="miter"/>
-                    <v:formulas/>
-                    <v:path arrowok="t" o:connecttype="custom" o:connectlocs="871803,0;934008,0;1121537,280845;1059332,280845;821673,0;853271,0;1040800,280845;1009203,280845;0,0;803142,0;990671,280845;0,280845" o:connectangles="0,0,0,0,0,0,0,0,0,0,0,0" textboxrect="0,0,1406296,288031"/>
-                    <v:textbox inset="5.5mm,0,,0">
-                      <w:txbxContent>
-                        <w:p>
-                          <w:pPr>
-                            <w:adjustRightInd w:val="0"/>
-                            <w:snapToGrid w:val="0"/>
-                            <w:spacing w:line="320" w:lineRule="exact"/>
-                            <w:rPr>
-                              <w:rFonts w:ascii="微软雅黑" w:hAnsi="微软雅黑" w:hint="eastAsia"/>
-                              <w:color w:val="FFFFFF"/>
-                              <w:sz w:val="24"/>
-                              <w:szCs w:val="24"/>
-                            </w:rPr>
-                          </w:pPr>
-                          <w:r>
-                            <w:rPr>
-                              <w:rFonts w:ascii="微软雅黑" w:hAnsi="微软雅黑" w:hint="eastAsia"/>
-                              <w:color w:val="FFFFFF"/>
-                              <w:sz w:val="24"/>
-                              <w:szCs w:val="24"/>
-                            </w:rPr>
-                            <w:t>技能特长</w:t>
-                          </w:r>
-                        </w:p>
-                        <w:p>
-                          <w:pPr>
-                            <w:adjustRightInd w:val="0"/>
-                            <w:snapToGrid w:val="0"/>
-                            <w:spacing w:line="320" w:lineRule="exact"/>
-                            <w:rPr>
-                              <w:rFonts w:ascii="微软雅黑" w:hAnsi="微软雅黑" w:hint="eastAsia"/>
-                              <w:color w:val="FFFFFF"/>
-                              <w:sz w:val="24"/>
-                              <w:szCs w:val="24"/>
-                            </w:rPr>
-                          </w:pPr>
-                        </w:p>
-                      </w:txbxContent>
-                    </v:textbox>
-                  </v:shape>
-                  <v:shape id="直角三角形 3" o:spid="_x0000_s1045" type="#_x0000_t6" style="position:absolute;left:2;top:2876;width:1439;height:1060;rotation:180;visibility:visible;mso-wrap-style:square;v-text-anchor:top" o:gfxdata="UEsDBBQABgAIAAAAIQDb4fbL7gAAAIUBAAATAAAAW0NvbnRlbnRfVHlwZXNdLnhtbHyQz07DMAyH&#10;70i8Q+QralM4IITa7kDhCAiNB7ASt43WOlEcyvb2pNu4IODoPz9/n1xv9vOkForiPDdwXVagiI23&#10;jocG3rdPxR0oScgWJ8/UwIEENu3lRb09BBKV0ywNjCmFe63FjDSjlD4Q50nv44wpl3HQAc0OB9I3&#10;VXWrjedEnIq03oC27qjHjympx31un0wiTQLq4bS4shrAECZnMGVTvbD9QSnOhDInjzsyuiBXWQP0&#10;r4R18jfgnHvJr4nOknrFmJ5xzhraRtHWf3Kkpfz/yGo5S+H73hkquyhdjr3R8m2lj09svwAAAP//&#10;AwBQSwMEFAAGAAgAAAAhAFr0LFu/AAAAFQEAAAsAAABfcmVscy8ucmVsc2zPwWrDMAwG4Ptg72B0&#10;X5TuUMaI01uh19I+gLGVxCy2jGSy9e1nemrHjpL4P0nD4SetZiPRyNnCruvBUPYcYp4tXC/Htw8w&#10;Wl0ObuVMFm6kcBhfX4Yzra62kC6xqGlKVgtLreUTUf1CyWnHhXKbTCzJ1VbKjMX5LzcTvvf9HuXR&#10;gPHJNKdgQU5hB+ZyK23zHztFL6w81c5zQp6m6P9TMfB3PtPWFCczVQtB9N4U2rp2HOA44NMz4y8A&#10;AAD//wMAUEsDBBQABgAIAAAAIQCOYVmKwgAAANsAAAAPAAAAZHJzL2Rvd25yZXYueG1sRE89a8Mw&#10;EN0L+Q/iCtkayR1CcKyEUBxqUiit4yXbYV1tU+tkLMVx/n1VKHS7x/u8bD/bXkw0+s6xhmSlQBDX&#10;znTcaKjOx6cNCB+QDfaOScOdPOx3i4cMU+Nu/ElTGRoRQ9inqKENYUil9HVLFv3KDcSR+3KjxRDh&#10;2Egz4i2G214+K7WWFjuODS0O9NJS/V1erYb8bXOpTu+5aj6wT15pKg6lKrRePs6HLYhAc/gX/7kL&#10;E+ev4feXeIDc/QAAAP//AwBQSwECLQAUAAYACAAAACEA2+H2y+4AAACFAQAAEwAAAAAAAAAAAAAA&#10;AAAAAAAAW0NvbnRlbnRfVHlwZXNdLnhtbFBLAQItABQABgAIAAAAIQBa9CxbvwAAABUBAAALAAAA&#10;AAAAAAAAAAAAAB8BAABfcmVscy8ucmVsc1BLAQItABQABgAIAAAAIQCOYVmKwgAAANsAAAAPAAAA&#10;AAAAAAAAAAAAAAcCAABkcnMvZG93bnJldi54bWxQSwUGAAAAAAMAAwC3AAAA9gIAAAAA&#10;" fillcolor="#405e6c" stroked="f"/>
-                </v:group>
-                <v:line id="直接连接符 20" o:spid="_x0000_s1046" style="position:absolute;visibility:visible;mso-wrap-style:square" from="1333,2095" to="67818,2095" o:connectortype="straight" o:gfxdata="UEsDBBQABgAIAAAAIQDb4fbL7gAAAIUBAAATAAAAW0NvbnRlbnRfVHlwZXNdLnhtbHyQz07DMAyH&#10;70i8Q+QralM4IITa7kDhCAiNB7ASt43WOlEcyvb2pNu4IODoPz9/n1xv9vOkForiPDdwXVagiI23&#10;jocG3rdPxR0oScgWJ8/UwIEENu3lRb09BBKV0ywNjCmFe63FjDSjlD4Q50nv44wpl3HQAc0OB9I3&#10;VXWrjedEnIq03oC27qjHjympx31un0wiTQLq4bS4shrAECZnMGVTvbD9QSnOhDInjzsyuiBXWQP0&#10;r4R18jfgnHvJr4nOknrFmJ5xzhraRtHWf3Kkpfz/yGo5S+H73hkquyhdjr3R8m2lj09svwAAAP//&#10;AwBQSwMEFAAGAAgAAAAhAFr0LFu/AAAAFQEAAAsAAABfcmVscy8ucmVsc2zPwWrDMAwG4Ptg72B0&#10;X5TuUMaI01uh19I+gLGVxCy2jGSy9e1nemrHjpL4P0nD4SetZiPRyNnCruvBUPYcYp4tXC/Htw8w&#10;Wl0ObuVMFm6kcBhfX4Yzra62kC6xqGlKVgtLreUTUf1CyWnHhXKbTCzJ1VbKjMX5LzcTvvf9HuXR&#10;gPHJNKdgQU5hB+ZyK23zHztFL6w81c5zQp6m6P9TMfB3PtPWFCczVQtB9N4U2rp2HOA44NMz4y8A&#10;AAD//wMAUEsDBBQABgAIAAAAIQBbnUgcwQAAANsAAAAPAAAAZHJzL2Rvd25yZXYueG1sRE9LawIx&#10;EL4X+h/CFLzV7HqosjWKFApatPii52EzZpfdTJYkuuu/N4VCb/PxPWe+HGwrbuRD7VhBPs5AEJdO&#10;12wUnE+frzMQISJrbB2TgjsFWC6en+ZYaNfzgW7HaEQK4VCggirGrpAylBVZDGPXESfu4rzFmKA3&#10;UnvsU7ht5STL3qTFmlNDhR19VFQ2x6tVIP2uNZk7/YSv773NzbbZdP1ZqdHLsHoHEWmI/+I/91qn&#10;+VP4/SUdIBcPAAAA//8DAFBLAQItABQABgAIAAAAIQDb4fbL7gAAAIUBAAATAAAAAAAAAAAAAAAA&#10;AAAAAABbQ29udGVudF9UeXBlc10ueG1sUEsBAi0AFAAGAAgAAAAhAFr0LFu/AAAAFQEAAAsAAAAA&#10;AAAAAAAAAAAAHwEAAF9yZWxzLy5yZWxzUEsBAi0AFAAGAAgAAAAhAFudSBzBAAAA2wAAAA8AAAAA&#10;AAAAAAAAAAAABwIAAGRycy9kb3ducmV2LnhtbFBLBQYAAAAAAwADALcAAAD1AgAAAAA=&#10;" strokecolor="#4e7282"/>
-              </v:group>
-            </w:pict>
-          </mc:Fallback>
-        </mc:AlternateContent>
+      <w:r/>
+      <w:r>
+        <w:rPr>
+          <w:rFonts w:ascii="微软雅黑" w:hAnsi="微软雅黑"/>
+          <w:b w:val="0"/>
+          <w:sz w:val="17"/>
+        </w:rPr>
+        <w:t>聚焦 AI 应用开发、LLM 工程化与全栈敏捷交付，具备 Python、FastAPI、RAG、LangChain、LangGraph、Supabase 等项目实践，能够围绕真实业务痛点完成从模型编排、后端服务、前端交互到云端部署上线的闭环落地；熟悉 Trae、Cursor、Copilot 等 AI 辅助开发工具驱动 MVP 快速迭代，并具备挪威 UiT 全英文交换经历与跨文化技术沟通能力。</w:t>
       </w:r>
     </w:p>
     <w:p>
@@ -4986,207 +4646,227 @@
     </w:p>
     <w:p>
       <w:pPr>
-        <w:rPr>
-          <w:rFonts w:hint="eastAsia"/>
-        </w:rPr>
+        <w:spacing w:before="0" w:after="0" w:line="240" w:lineRule="auto"/>
+        <w:jc w:val="left"/>
       </w:pPr>
-      <w:r>
-        <w:rPr>
-          <w:rFonts w:hint="eastAsia"/>
-        </w:rPr>
-        <w:t xml:space="preserve">1. </w:t>
-      </w:r>
-      <w:r>
-        <w:rPr>
-          <w:rFonts w:hint="eastAsia"/>
-        </w:rPr>
-        <w:t>多源文档智能检索与问答平台（项目实践）</w:t>
+      <w:r/>
+      <w:r>
+        <w:rPr>
+          <w:rFonts w:ascii="微软雅黑" w:hAnsi="微软雅黑"/>
+          <w:b/>
+          <w:sz w:val="18"/>
+        </w:rPr>
+        <w:t>1. 多源文档智能检索与问答平台（项目实践）</w:t>
       </w:r>
     </w:p>
     <w:p>
       <w:pPr>
-        <w:rPr>
-          <w:rFonts w:hint="eastAsia"/>
-        </w:rPr>
+        <w:spacing w:before="0" w:after="0" w:line="240" w:lineRule="auto"/>
+        <w:jc w:val="left"/>
       </w:pPr>
-      <w:r>
-        <w:rPr>
-          <w:rFonts w:hint="eastAsia"/>
-        </w:rPr>
-        <w:t>技术栈</w:t>
-      </w:r>
-      <w:r>
-        <w:rPr>
-          <w:rFonts w:hint="eastAsia"/>
-        </w:rPr>
-        <w:t>: Python, FastAPI, LangChain, LangGraph, ChromaDB, Redis, Docker</w:t>
+      <w:r/>
+      <w:r>
+        <w:rPr>
+          <w:rFonts w:ascii="微软雅黑" w:hAnsi="微软雅黑"/>
+          <w:b w:val="0"/>
+          <w:sz w:val="17"/>
+        </w:rPr>
+        <w:t>技术栈: Python, FastAPI, LangChain, LangGraph, ChromaDB, Redis, Docker</w:t>
       </w:r>
     </w:p>
     <w:p>
       <w:pPr>
-        <w:rPr>
-          <w:rFonts w:hint="eastAsia"/>
-        </w:rPr>
+        <w:spacing w:before="0" w:after="0" w:line="240" w:lineRule="auto"/>
+        <w:jc w:val="left"/>
       </w:pPr>
-      <w:r>
-        <w:rPr>
-          <w:rFonts w:hint="eastAsia"/>
-        </w:rPr>
-        <w:t>围绕</w:t>
-      </w:r>
-      <w:r>
-        <w:rPr>
-          <w:rFonts w:hint="eastAsia"/>
-        </w:rPr>
-        <w:t xml:space="preserve"> PDF</w:t>
-      </w:r>
-      <w:r>
-        <w:rPr>
-          <w:rFonts w:hint="eastAsia"/>
-        </w:rPr>
-        <w:t>、网页与</w:t>
-      </w:r>
-      <w:r>
-        <w:rPr>
-          <w:rFonts w:hint="eastAsia"/>
-        </w:rPr>
-        <w:t xml:space="preserve"> Markdown </w:t>
-      </w:r>
-      <w:r>
-        <w:rPr>
-          <w:rFonts w:hint="eastAsia"/>
-        </w:rPr>
-        <w:t>等多源文档构建</w:t>
-      </w:r>
-      <w:r>
-        <w:rPr>
-          <w:rFonts w:hint="eastAsia"/>
-        </w:rPr>
-        <w:t xml:space="preserve"> RAG </w:t>
-      </w:r>
-      <w:r>
-        <w:rPr>
-          <w:rFonts w:hint="eastAsia"/>
-        </w:rPr>
-        <w:t>问答链路，完成文档解析、文本切分、向量化入库、语义检索与答案生成等核心模块；结合多轮会话记忆、来源引用与检索结果重排机制，提升复杂问题下的回答相关性与可解</w:t>
-      </w:r>
-      <w:r>
-        <w:rPr>
-          <w:rFonts w:hint="eastAsia"/>
-        </w:rPr>
-        <w:lastRenderedPageBreak/>
-        <w:t>释性，并基于</w:t>
-      </w:r>
-      <w:r>
-        <w:rPr>
-          <w:rFonts w:hint="eastAsia"/>
-        </w:rPr>
-        <w:t xml:space="preserve"> FastAPI </w:t>
-      </w:r>
-      <w:r>
-        <w:rPr>
-          <w:rFonts w:hint="eastAsia"/>
-        </w:rPr>
-        <w:t>完成接口封装与本地部署。</w:t>
+      <w:r/>
+      <w:r>
+        <w:rPr>
+          <w:rFonts w:ascii="微软雅黑" w:hAnsi="微软雅黑"/>
+          <w:b w:val="0"/>
+          <w:sz w:val="17"/>
+        </w:rPr>
+        <w:t>- 设计混合检索与 Rerank 召回链路，结合向量检索、关键词召回与重排机制抑制长文档噪声和语义漂移，提升复杂问答的相关性与抗幻觉能力。</w:t>
       </w:r>
     </w:p>
     <w:p>
       <w:pPr>
-        <w:rPr>
-          <w:rFonts w:hint="eastAsia"/>
-        </w:rPr>
+        <w:spacing w:before="0" w:after="0" w:line="240" w:lineRule="auto"/>
+        <w:jc w:val="left"/>
       </w:pPr>
-      <w:r>
-        <w:rPr>
-          <w:rFonts w:hint="eastAsia"/>
-        </w:rPr>
-        <w:t xml:space="preserve">2. </w:t>
-      </w:r>
-      <w:r>
-        <w:rPr>
-          <w:rFonts w:hint="eastAsia"/>
-        </w:rPr>
-        <w:t>基于</w:t>
-      </w:r>
-      <w:r>
-        <w:rPr>
-          <w:rFonts w:hint="eastAsia"/>
-        </w:rPr>
-        <w:t xml:space="preserve"> LangGraph </w:t>
-      </w:r>
-      <w:r>
-        <w:rPr>
-          <w:rFonts w:hint="eastAsia"/>
-        </w:rPr>
-        <w:t>的多智能体任务编排系统（项目实践）</w:t>
+      <w:r/>
+      <w:r>
+        <w:rPr>
+          <w:rFonts w:ascii="微软雅黑" w:hAnsi="微软雅黑"/>
+          <w:b w:val="0"/>
+          <w:sz w:val="17"/>
+        </w:rPr>
+        <w:t>- 引入 Redis 多轮会话缓存与上下文隔离策略，复用历史记忆并减少重复检索开销，优化高并发场景下的响应速度与对话连续性。</w:t>
       </w:r>
     </w:p>
     <w:p>
       <w:pPr>
-        <w:rPr>
-          <w:rFonts w:hint="eastAsia"/>
-        </w:rPr>
+        <w:spacing w:before="0" w:after="0" w:line="240" w:lineRule="auto"/>
+        <w:jc w:val="left"/>
       </w:pPr>
-      <w:r>
-        <w:rPr>
-          <w:rFonts w:hint="eastAsia"/>
-        </w:rPr>
-        <w:t>技术栈</w:t>
-      </w:r>
-      <w:r>
-        <w:rPr>
-          <w:rFonts w:hint="eastAsia"/>
-        </w:rPr>
-        <w:t>: Python, FastAPI, LangGraph, LangChain, Pydantic, SSE</w:t>
+      <w:r/>
+      <w:r>
+        <w:rPr>
+          <w:rFonts w:ascii="微软雅黑" w:hAnsi="微软雅黑"/>
+          <w:b w:val="0"/>
+          <w:sz w:val="17"/>
+        </w:rPr>
+        <w:t>- 封装 FastAPI 服务并完成 Docker 容器化部署，统一开发、测试与交付环境，降低环境差异带来的部署成本和维护复杂度。</w:t>
       </w:r>
     </w:p>
     <w:p>
       <w:pPr>
-        <w:rPr>
-          <w:rFonts w:hint="eastAsia"/>
-        </w:rPr>
+        <w:spacing w:before="0" w:after="0" w:line="240" w:lineRule="auto"/>
+        <w:jc w:val="left"/>
       </w:pPr>
-      <w:r>
-        <w:rPr>
-          <w:rFonts w:hint="eastAsia"/>
-        </w:rPr>
-        <w:t>基于状态图设计</w:t>
-      </w:r>
-      <w:r>
-        <w:rPr>
-          <w:rFonts w:hint="eastAsia"/>
-        </w:rPr>
-        <w:t xml:space="preserve"> Planner</w:t>
-      </w:r>
-      <w:r>
-        <w:rPr>
-          <w:rFonts w:hint="eastAsia"/>
-        </w:rPr>
-        <w:t>、</w:t>
-      </w:r>
-      <w:r>
-        <w:rPr>
-          <w:rFonts w:hint="eastAsia"/>
-        </w:rPr>
-        <w:t>Router</w:t>
-      </w:r>
-      <w:r>
-        <w:rPr>
-          <w:rFonts w:hint="eastAsia"/>
-        </w:rPr>
-        <w:t>、</w:t>
-      </w:r>
-      <w:r>
-        <w:rPr>
-          <w:rFonts w:hint="eastAsia"/>
-        </w:rPr>
-        <w:t xml:space="preserve">Executor </w:t>
-      </w:r>
-      <w:r>
-        <w:rPr>
-          <w:rFonts w:hint="eastAsia"/>
-        </w:rPr>
-        <w:t>等智能体协作流程，完成任务拆解、节点流转、上下文管理与流式输出机制实现；围绕工具调用、对话状态维护与结果汇总等环节进行工程化实践，能够支撑复杂任务的分步执行与结构化结果生成。</w:t>
+      <w:r/>
+      <w:r>
+        <w:rPr>
+          <w:rFonts w:ascii="微软雅黑" w:hAnsi="微软雅黑"/>
+          <w:b/>
+          <w:sz w:val="18"/>
+        </w:rPr>
+        <w:t>2. 基于 LangGraph 的多智能体任务编排系统（项目实践）</w:t>
+      </w:r>
+    </w:p>
+    <w:p>
+      <w:pPr>
+        <w:spacing w:before="0" w:after="0" w:line="240" w:lineRule="auto"/>
+        <w:jc w:val="left"/>
+      </w:pPr>
+      <w:r/>
+      <w:r>
+        <w:rPr>
+          <w:rFonts w:ascii="微软雅黑" w:hAnsi="微软雅黑"/>
+          <w:b w:val="0"/>
+          <w:sz w:val="17"/>
+        </w:rPr>
+        <w:t>技术栈: Python, FastAPI, LangGraph, LangChain, Pydantic, SSE</w:t>
+      </w:r>
+    </w:p>
+    <w:p>
+      <w:pPr>
+        <w:spacing w:before="0" w:after="0" w:line="240" w:lineRule="auto"/>
+        <w:jc w:val="left"/>
+      </w:pPr>
+      <w:r/>
+      <w:r>
+        <w:rPr>
+          <w:rFonts w:ascii="微软雅黑" w:hAnsi="微软雅黑"/>
+          <w:b w:val="0"/>
+          <w:sz w:val="17"/>
+        </w:rPr>
+        <w:t>- 构建基于 LangGraph State Graph 的 Planner / Router / Executor 协同架构，将任务拆解、路由决策与执行状态解耦，提升复杂任务流的可扩展性与容错性。</w:t>
+      </w:r>
+    </w:p>
+    <w:p>
+      <w:pPr>
+        <w:spacing w:before="0" w:after="0" w:line="240" w:lineRule="auto"/>
+        <w:jc w:val="left"/>
+      </w:pPr>
+      <w:r/>
+      <w:r>
+        <w:rPr>
+          <w:rFonts w:ascii="微软雅黑" w:hAnsi="微软雅黑"/>
+          <w:b w:val="0"/>
+          <w:sz w:val="17"/>
+        </w:rPr>
+        <w:t>- 使用 Pydantic 约束 Agent 间输入输出协议与状态持久化结构，减少多角色协作中的状态污染和结果不确定性，提升链路稳定性。</w:t>
+      </w:r>
+    </w:p>
+    <w:p>
+      <w:pPr>
+        <w:spacing w:before="0" w:after="0" w:line="240" w:lineRule="auto"/>
+        <w:jc w:val="left"/>
+      </w:pPr>
+      <w:r/>
+      <w:r>
+        <w:rPr>
+          <w:rFonts w:ascii="微软雅黑" w:hAnsi="微软雅黑"/>
+          <w:b w:val="0"/>
+          <w:sz w:val="17"/>
+        </w:rPr>
+        <w:t>- 实现基于 SSE 的打字机式流式响应与上下文持久化机制，缩短用户等待感知，并保持长链路任务的连续反馈体验。</w:t>
+      </w:r>
+    </w:p>
+    <w:p>
+      <w:pPr>
+        <w:spacing w:before="0" w:after="0" w:line="240" w:lineRule="auto"/>
+        <w:jc w:val="left"/>
+      </w:pPr>
+      <w:r/>
+      <w:r>
+        <w:rPr>
+          <w:rFonts w:ascii="微软雅黑" w:hAnsi="微软雅黑"/>
+          <w:b/>
+          <w:sz w:val="18"/>
+        </w:rPr>
+        <w:t>3. 《新世界庄园：破笼之宴》沉浸式 RPG 交互与数据平台（在线项目）</w:t>
+      </w:r>
+    </w:p>
+    <w:p>
+      <w:pPr>
+        <w:spacing w:before="0" w:after="0" w:line="240" w:lineRule="auto"/>
+        <w:jc w:val="left"/>
+      </w:pPr>
+      <w:r/>
+      <w:r>
+        <w:rPr>
+          <w:rFonts w:ascii="微软雅黑" w:hAnsi="微软雅黑"/>
+          <w:b w:val="0"/>
+          <w:sz w:val="17"/>
+        </w:rPr>
+        <w:t>技术栈: HTML5, CSS3, JavaScript, Supabase, Vercel, DNS / 域名工程化</w:t>
+      </w:r>
+    </w:p>
+    <w:p>
+      <w:pPr>
+        <w:spacing w:before="0" w:after="0" w:line="240" w:lineRule="auto"/>
+        <w:jc w:val="left"/>
+      </w:pPr>
+      <w:r/>
+      <w:r>
+        <w:rPr>
+          <w:rFonts w:ascii="微软雅黑" w:hAnsi="微软雅黑"/>
+          <w:b w:val="0"/>
+          <w:sz w:val="17"/>
+        </w:rPr>
+        <w:t>- 基于 Supabase 搭建 Serverless 数据底座，完成云端数据库、鉴权与 RLS 行级安全策略设计，实现交互数据的秒级响应、持久化存储与权限隔离。</w:t>
+      </w:r>
+    </w:p>
+    <w:p>
+      <w:pPr>
+        <w:spacing w:before="0" w:after="0" w:line="240" w:lineRule="auto"/>
+        <w:jc w:val="left"/>
+      </w:pPr>
+      <w:r/>
+      <w:r>
+        <w:rPr>
+          <w:rFonts w:ascii="微软雅黑" w:hAnsi="微软雅黑"/>
+          <w:b w:val="0"/>
+          <w:sz w:val="17"/>
+        </w:rPr>
+        <w:t>- 独立完成前端页面实现与 BaaS 能力接入，围绕沉浸式 RPG 场景快速迭代 MVP，验证从创意原型到在线产品的全栈敏捷交付能力。</w:t>
+      </w:r>
+    </w:p>
+    <w:p>
+      <w:pPr>
+        <w:spacing w:before="0" w:after="0" w:line="240" w:lineRule="auto"/>
+        <w:jc w:val="left"/>
+      </w:pPr>
+      <w:r/>
+      <w:r>
+        <w:rPr>
+          <w:rFonts w:ascii="微软雅黑" w:hAnsi="微软雅黑"/>
+          <w:b w:val="0"/>
+          <w:sz w:val="17"/>
+        </w:rPr>
+        <w:t>- 打通 www.xinshijie1945.com 域名解析、A/CNAME 配置、HTTPS 证书启用与 Vercel CI/CD 自动化部署链路，形成从 0 到 1 的产品上线闭环经验。</w:t>
       </w:r>
     </w:p>
     <w:p>

</xml_diff>

<commit_message>
Fix Word resume compatibility by preserving original template XML.
</commit_message>
<xml_diff>
--- a/个人简历.docx
+++ b/个人简历.docx
@@ -3932,20 +3932,377 @@
     </w:p>
     <w:p>
       <w:pPr>
-        <w:spacing w:before="0" w:after="0" w:line="240" w:lineRule="auto"/>
-        <w:jc w:val="left"/>
         <w:rPr>
           <w:rFonts w:hint="eastAsia"/>
         </w:rPr>
       </w:pPr>
-      <w:r/>
-      <w:r>
-        <w:rPr>
-          <w:rFonts w:ascii="微软雅黑" w:hAnsi="微软雅黑"/>
-          <w:b w:val="0"/>
-          <w:sz w:val="17"/>
-        </w:rPr>
-        <w:t>聚焦 AI 应用开发、LLM 工程化与全栈敏捷交付，具备 Python、FastAPI、RAG、LangChain、LangGraph、Supabase 等项目实践，能够围绕真实业务痛点完成从模型编排、后端服务、前端交互到云端部署上线的闭环落地；熟悉 Trae、Cursor、Copilot 等 AI 辅助开发工具驱动 MVP 快速迭代，并具备挪威 UiT 全英文交换经历与跨文化技术沟通能力。</w:t>
+      <w:r>
+        <w:rPr>
+          <w:noProof/>
+        </w:rPr>
+        <mc:AlternateContent>
+          <mc:Choice Requires="wpg">
+            <w:drawing>
+              <wp:anchor distT="0" distB="0" distL="114300" distR="114300" simplePos="0" relativeHeight="251666432" behindDoc="0" locked="0" layoutInCell="1" allowOverlap="1" wp14:anchorId="6EF7BFEE" wp14:editId="16C51E25">
+                <wp:simplePos x="0" y="0"/>
+                <wp:positionH relativeFrom="column">
+                  <wp:posOffset>-84801</wp:posOffset>
+                </wp:positionH>
+                <wp:positionV relativeFrom="paragraph">
+                  <wp:posOffset>171162</wp:posOffset>
+                </wp:positionV>
+                <wp:extent cx="6781800" cy="309880"/>
+                <wp:effectExtent l="0" t="0" r="0" b="10160"/>
+                <wp:wrapNone/>
+                <wp:docPr id="7" name="组合 31"/>
+                <wp:cNvGraphicFramePr/>
+                <a:graphic xmlns:a="http://schemas.openxmlformats.org/drawingml/2006/main">
+                  <a:graphicData uri="http://schemas.microsoft.com/office/word/2010/wordprocessingGroup">
+                    <wpg:wgp>
+                      <wpg:cNvGrpSpPr/>
+                      <wpg:grpSpPr>
+                        <a:xfrm>
+                          <a:off x="0" y="0"/>
+                          <a:ext cx="6781800" cy="309880"/>
+                          <a:chOff x="0" y="4811"/>
+                          <a:chExt cx="6781800" cy="279589"/>
+                        </a:xfrm>
+                      </wpg:grpSpPr>
+                      <wpg:grpSp>
+                        <wpg:cNvPr id="8" name="组合 81"/>
+                        <wpg:cNvGrpSpPr>
+                          <a:grpSpLocks noChangeAspect="1"/>
+                        </wpg:cNvGrpSpPr>
+                        <wpg:grpSpPr>
+                          <a:xfrm>
+                            <a:off x="0" y="4811"/>
+                            <a:ext cx="1256665" cy="279589"/>
+                            <a:chOff x="3" y="6660"/>
+                            <a:chExt cx="1256004" cy="387035"/>
+                          </a:xfrm>
+                        </wpg:grpSpPr>
+                        <wps:wsp>
+                          <wps:cNvPr id="11" name="任意多边形 2"/>
+                          <wps:cNvSpPr/>
+                          <wps:spPr bwMode="auto">
+                            <a:xfrm>
+                              <a:off x="3" y="6660"/>
+                              <a:ext cx="1256004" cy="281211"/>
+                            </a:xfrm>
+                            <a:custGeom>
+                              <a:avLst/>
+                              <a:gdLst>
+                                <a:gd name="T0" fmla="*/ 976122 w 1406296"/>
+                                <a:gd name="T1" fmla="*/ 0 h 288031"/>
+                                <a:gd name="T2" fmla="*/ 1045770 w 1406296"/>
+                                <a:gd name="T3" fmla="*/ 0 h 288031"/>
+                                <a:gd name="T4" fmla="*/ 1255739 w 1406296"/>
+                                <a:gd name="T5" fmla="*/ 287656 h 288031"/>
+                                <a:gd name="T6" fmla="*/ 1186091 w 1406296"/>
+                                <a:gd name="T7" fmla="*/ 287656 h 288031"/>
+                                <a:gd name="T8" fmla="*/ 919994 w 1406296"/>
+                                <a:gd name="T9" fmla="*/ 0 h 288031"/>
+                                <a:gd name="T10" fmla="*/ 955372 w 1406296"/>
+                                <a:gd name="T11" fmla="*/ 0 h 288031"/>
+                                <a:gd name="T12" fmla="*/ 1165341 w 1406296"/>
+                                <a:gd name="T13" fmla="*/ 287656 h 288031"/>
+                                <a:gd name="T14" fmla="*/ 1129963 w 1406296"/>
+                                <a:gd name="T15" fmla="*/ 287656 h 288031"/>
+                                <a:gd name="T16" fmla="*/ 0 w 1406296"/>
+                                <a:gd name="T17" fmla="*/ 0 h 288031"/>
+                                <a:gd name="T18" fmla="*/ 899245 w 1406296"/>
+                                <a:gd name="T19" fmla="*/ 0 h 288031"/>
+                                <a:gd name="T20" fmla="*/ 1109214 w 1406296"/>
+                                <a:gd name="T21" fmla="*/ 287656 h 288031"/>
+                                <a:gd name="T22" fmla="*/ 0 w 1406296"/>
+                                <a:gd name="T23" fmla="*/ 287656 h 288031"/>
+                                <a:gd name="T24" fmla="*/ 0 60000 65536"/>
+                                <a:gd name="T25" fmla="*/ 0 60000 65536"/>
+                                <a:gd name="T26" fmla="*/ 0 60000 65536"/>
+                                <a:gd name="T27" fmla="*/ 0 60000 65536"/>
+                                <a:gd name="T28" fmla="*/ 0 60000 65536"/>
+                                <a:gd name="T29" fmla="*/ 0 60000 65536"/>
+                                <a:gd name="T30" fmla="*/ 0 60000 65536"/>
+                                <a:gd name="T31" fmla="*/ 0 60000 65536"/>
+                                <a:gd name="T32" fmla="*/ 0 60000 65536"/>
+                                <a:gd name="T33" fmla="*/ 0 60000 65536"/>
+                                <a:gd name="T34" fmla="*/ 0 60000 65536"/>
+                                <a:gd name="T35" fmla="*/ 0 60000 65536"/>
+                                <a:gd name="T36" fmla="*/ 0 w 1406296"/>
+                                <a:gd name="T37" fmla="*/ 0 h 288031"/>
+                                <a:gd name="T38" fmla="*/ 1406296 w 1406296"/>
+                                <a:gd name="T39" fmla="*/ 288031 h 288031"/>
+                              </a:gdLst>
+                              <a:ahLst/>
+                              <a:cxnLst>
+                                <a:cxn ang="T24">
+                                  <a:pos x="T0" y="T1"/>
+                                </a:cxn>
+                                <a:cxn ang="T25">
+                                  <a:pos x="T2" y="T3"/>
+                                </a:cxn>
+                                <a:cxn ang="T26">
+                                  <a:pos x="T4" y="T5"/>
+                                </a:cxn>
+                                <a:cxn ang="T27">
+                                  <a:pos x="T6" y="T7"/>
+                                </a:cxn>
+                                <a:cxn ang="T28">
+                                  <a:pos x="T8" y="T9"/>
+                                </a:cxn>
+                                <a:cxn ang="T29">
+                                  <a:pos x="T10" y="T11"/>
+                                </a:cxn>
+                                <a:cxn ang="T30">
+                                  <a:pos x="T12" y="T13"/>
+                                </a:cxn>
+                                <a:cxn ang="T31">
+                                  <a:pos x="T14" y="T15"/>
+                                </a:cxn>
+                                <a:cxn ang="T32">
+                                  <a:pos x="T16" y="T17"/>
+                                </a:cxn>
+                                <a:cxn ang="T33">
+                                  <a:pos x="T18" y="T19"/>
+                                </a:cxn>
+                                <a:cxn ang="T34">
+                                  <a:pos x="T20" y="T21"/>
+                                </a:cxn>
+                                <a:cxn ang="T35">
+                                  <a:pos x="T22" y="T23"/>
+                                </a:cxn>
+                              </a:cxnLst>
+                              <a:rect l="T36" t="T37" r="T38" b="T39"/>
+                              <a:pathLst>
+                                <a:path w="1406296" h="288031">
+                                  <a:moveTo>
+                                    <a:pt x="1093154" y="0"/>
+                                  </a:moveTo>
+                                  <a:lnTo>
+                                    <a:pt x="1171153" y="0"/>
+                                  </a:lnTo>
+                                  <a:lnTo>
+                                    <a:pt x="1406296" y="288031"/>
+                                  </a:lnTo>
+                                  <a:lnTo>
+                                    <a:pt x="1328297" y="288031"/>
+                                  </a:lnTo>
+                                  <a:lnTo>
+                                    <a:pt x="1093154" y="0"/>
+                                  </a:lnTo>
+                                  <a:close/>
+                                  <a:moveTo>
+                                    <a:pt x="1030297" y="0"/>
+                                  </a:moveTo>
+                                  <a:lnTo>
+                                    <a:pt x="1069917" y="0"/>
+                                  </a:lnTo>
+                                  <a:lnTo>
+                                    <a:pt x="1305060" y="288031"/>
+                                  </a:lnTo>
+                                  <a:lnTo>
+                                    <a:pt x="1265440" y="288031"/>
+                                  </a:lnTo>
+                                  <a:lnTo>
+                                    <a:pt x="1030297" y="0"/>
+                                  </a:lnTo>
+                                  <a:close/>
+                                  <a:moveTo>
+                                    <a:pt x="0" y="0"/>
+                                  </a:moveTo>
+                                  <a:lnTo>
+                                    <a:pt x="1007060" y="0"/>
+                                  </a:lnTo>
+                                  <a:lnTo>
+                                    <a:pt x="1242203" y="288031"/>
+                                  </a:lnTo>
+                                  <a:lnTo>
+                                    <a:pt x="0" y="288031"/>
+                                  </a:lnTo>
+                                  <a:lnTo>
+                                    <a:pt x="0" y="0"/>
+                                  </a:lnTo>
+                                  <a:close/>
+                                </a:path>
+                              </a:pathLst>
+                            </a:custGeom>
+                            <a:solidFill>
+                              <a:srgbClr val="4E7282"/>
+                            </a:solidFill>
+                            <a:ln>
+                              <a:noFill/>
+                            </a:ln>
+                          </wps:spPr>
+                          <wps:txbx>
+                            <w:txbxContent>
+                              <w:p>
+                                <w:pPr>
+                                  <w:adjustRightInd w:val="0"/>
+                                  <w:snapToGrid w:val="0"/>
+                                  <w:spacing w:line="320" w:lineRule="exact"/>
+                                  <w:rPr>
+                                    <w:rFonts w:ascii="微软雅黑" w:hAnsi="微软雅黑" w:hint="eastAsia"/>
+                                    <w:color w:val="FFFFFF"/>
+                                    <w:sz w:val="24"/>
+                                    <w:szCs w:val="24"/>
+                                  </w:rPr>
+                                </w:pPr>
+                                <w:r>
+                                  <w:rPr>
+                                    <w:rFonts w:ascii="微软雅黑" w:hAnsi="微软雅黑" w:hint="eastAsia"/>
+                                    <w:color w:val="FFFFFF"/>
+                                    <w:sz w:val="24"/>
+                                    <w:szCs w:val="24"/>
+                                  </w:rPr>
+                                  <w:t>技能特长</w:t>
+                                </w:r>
+                              </w:p>
+                              <w:p>
+                                <w:pPr>
+                                  <w:adjustRightInd w:val="0"/>
+                                  <w:snapToGrid w:val="0"/>
+                                  <w:spacing w:line="320" w:lineRule="exact"/>
+                                  <w:rPr>
+                                    <w:rFonts w:ascii="微软雅黑" w:hAnsi="微软雅黑" w:hint="eastAsia"/>
+                                    <w:color w:val="FFFFFF"/>
+                                    <w:sz w:val="24"/>
+                                    <w:szCs w:val="24"/>
+                                  </w:rPr>
+                                </w:pPr>
+                              </w:p>
+                            </w:txbxContent>
+                          </wps:txbx>
+                          <wps:bodyPr rot="0" vert="horz" wrap="square" lIns="198000" tIns="0" rIns="91440" bIns="0" anchor="ctr" anchorCtr="0" upright="1">
+                            <a:noAutofit/>
+                          </wps:bodyPr>
+                        </wps:wsp>
+                        <wps:wsp>
+                          <wps:cNvPr id="16" name="直角三角形 3"/>
+                          <wps:cNvSpPr>
+                            <a:spLocks noChangeArrowheads="1"/>
+                          </wps:cNvSpPr>
+                          <wps:spPr bwMode="auto">
+                            <a:xfrm rot="10800000">
+                              <a:off x="234" y="287656"/>
+                              <a:ext cx="143935" cy="106039"/>
+                            </a:xfrm>
+                            <a:prstGeom prst="rtTriangle">
+                              <a:avLst/>
+                            </a:prstGeom>
+                            <a:solidFill>
+                              <a:srgbClr val="405E6C"/>
+                            </a:solidFill>
+                            <a:ln>
+                              <a:noFill/>
+                            </a:ln>
+                          </wps:spPr>
+                          <wps:bodyPr rot="0" vert="horz" wrap="square" lIns="91440" tIns="45720" rIns="91440" bIns="45720" anchor="t" anchorCtr="0" upright="1">
+                            <a:noAutofit/>
+                          </wps:bodyPr>
+                        </wps:wsp>
+                      </wpg:grpSp>
+                      <wps:wsp>
+                        <wps:cNvPr id="17" name="直接连接符 20"/>
+                        <wps:cNvCnPr>
+                          <a:cxnSpLocks noChangeShapeType="1"/>
+                        </wps:cNvCnPr>
+                        <wps:spPr bwMode="auto">
+                          <a:xfrm>
+                            <a:off x="133350" y="209550"/>
+                            <a:ext cx="6648450" cy="0"/>
+                          </a:xfrm>
+                          <a:prstGeom prst="line">
+                            <a:avLst/>
+                          </a:prstGeom>
+                          <a:noFill/>
+                          <a:ln w="9525" algn="ctr">
+                            <a:solidFill>
+                              <a:srgbClr val="4E7282"/>
+                            </a:solidFill>
+                            <a:round/>
+                          </a:ln>
+                        </wps:spPr>
+                        <wps:bodyPr/>
+                      </wps:wsp>
+                    </wpg:wgp>
+                  </a:graphicData>
+                </a:graphic>
+              </wp:anchor>
+            </w:drawing>
+          </mc:Choice>
+          <mc:Fallback>
+            <w:pict>
+              <v:group w14:anchorId="6EF7BFEE" id="组合 31" o:spid="_x0000_s1042" style="position:absolute;left:0;text-align:left;margin-left:-6.7pt;margin-top:13.5pt;width:534pt;height:24.4pt;z-index:251666432" coordorigin=",48" coordsize="67818,2795" o:gfxdata="UEsDBBQABgAIAAAAIQC2gziS/gAAAOEBAAATAAAAW0NvbnRlbnRfVHlwZXNdLnhtbJSRQU7DMBBF&#10;90jcwfIWJU67QAgl6YK0S0CoHGBkTxKLZGx5TGhvj5O2G0SRWNoz/78nu9wcxkFMGNg6quQqL6RA&#10;0s5Y6ir5vt9lD1JwBDIwOMJKHpHlpr69KfdHjyxSmriSfYz+USnWPY7AufNIadK6MEJMx9ApD/oD&#10;OlTrorhX2lFEilmcO2RdNtjC5xDF9pCuTyYBB5bi6bQ4syoJ3g9WQ0ymaiLzg5KdCXlKLjvcW893&#10;SUOqXwnz5DrgnHtJTxOsQfEKIT7DmDSUCaxw7Rqn8787ZsmRM9e2VmPeBN4uqYvTtW7jvijg9N/y&#10;JsXecLq0q+WD6m8AAAD//wMAUEsDBBQABgAIAAAAIQA4/SH/1gAAAJQBAAALAAAAX3JlbHMvLnJl&#10;bHOkkMFqwzAMhu+DvYPRfXGawxijTi+j0GvpHsDYimMaW0Yy2fr2M4PBMnrbUb/Q94l/f/hMi1qR&#10;JVI2sOt6UJgd+ZiDgffL8ekFlFSbvV0oo4EbChzGx4f9GRdb25HMsYhqlCwG5lrLq9biZkxWOiqY&#10;22YiTra2kYMu1l1tQD30/bPm3wwYN0x18gb45AdQl1tp5j/sFB2T0FQ7R0nTNEV3j6o9feQzro1i&#10;OWA14Fm+Q8a1a8+Bvu/d/dMb2JY5uiPbhG/ktn4cqGU/er3pcvwCAAD//wMAUEsDBBQABgAIAAAA&#10;IQBgZWR+ewYAAFwWAAAOAAAAZHJzL2Uyb0RvYy54bWy8WMuO40QU3SPxD5aXSExc5dixo0mPRj0P&#10;IQ3Q0oQPcDvOQzguU3Z30qxnARtALEFigXhsWLIAjYCfmddncG65yrGTtjszI9g4dnzq+t57Tt2q&#10;W7fvbNepdZnIYiWyic1uObaVZLGYrbLFxP5k+uD9wLaKMspmUSqyZGJfJYV95+Tdd25v8nHCxVKk&#10;s0RaMJIV400+sZdlmY8HgyJeJuuouCXyJMPLuZDrqMSjXAxmMtrA+jodcMfxBxshZ7kUcVIU+Pde&#10;9dI+Ufbn8yQuP57Pi6S00okN30p1lep6TtfBye1ovJBRvlzF2o3oDbxYR6sMH61N3YvKyLqQqwNT&#10;61UsRSHm5a1YrAdiPl/FiYoB0TBnL5qHUlzkKpbFeLPI6zQhtXt5emOz8UeXD2X+OD+TyMQmXyAX&#10;6oli2c7lmn7hpbVVKbuqU5ZsSyvGn/4oYIGDzMZ45zphEOicxkskfjdsGDBWJTte3r9uLB+FXhAS&#10;ZGC+PGj5Uz9UfsLxM2mtZhMbCsuiNbT18umT5998YQXqQwTfBVdRg8geifjTwsrE6TLKFsndIodC&#10;oFv13f0h9RfPZGc6dnGZjDDu+b7vVRnZRRWN64y4toVkAVSnymSExjrOUGczGDmu15sRzJliJ4vi&#10;7WTxeBnliVJbQZnT2QVtOr3Pnj598eTr5z999+rvP5//9aPFybVNrsC1gIpxAS1Z55sPxQyURBel&#10;UPNiT0v7KWgmr04ADxivVFNLAlm8KMqHiVDCjC4fFWU1g2e4UyTPtLdTaHK+TjGZ3xtY4chnnFsb&#10;iw0dn4c+eY65WmMRY411rKXFIWNX63WH4g0Uc4beaOR0m0SER5gE1TUK5HsjN+w2CU3VYB6MfM/v&#10;dNVvQBkLfCdk3XZHDfANdjHXahdCFobhsNts2MB2J5W1ePI8d9TH03FEsRZTzPfcYU/4rEnVDfGz&#10;FmGMh6HvdmeAvQZjrElZj65Yk62etDaZCsKQD70eP4+jijepYswJOeuhnze5uiGtvElYT/D8Naji&#10;TaocC3XVwRUCO5j9vElTP7JNUp/NNk19yCZT/V9v09Rj020y1WsTVW43o/uRbY76vt5kqd/m0Rxh&#10;ITzWzzZHnTXfbTPUVfTdJj16+eieSW6TomoVadVoLGQLs1RFS7N6xdtML1+4s7AxmdhTyJfWqFwU&#10;tImi1Qx7hmm1UcEquM3obQPuteDgiuCu3j0cwv0WHDQQ3Gw2DuGjFhwZJvio03rQgiODBDebu0Pr&#10;YQtOKwLh66X/YADk3cwNlXs1oDNcqLw1QMeL+lztNw+/wNsDdMQovl0D3PYAHTPrDNpt80u1lWJA&#10;1ez6wh7DOmiUxMYA6AuxaDFJ7G2p75mi5FHnMyXJo/eZkqbR/UyhVoyFyKKStGhurQ12xHqjZC0n&#10;tt4N0eu1uEymQgFL0iUWAZd5VTrVbhYO7DBp1sKyEWMeagPiNFiDML95ZdV8HMjdVgymDcz8arjL&#10;Ax4itiPh1/hsDMapKBKVk10U+iOO65iPGO93GDPeYP0wpIX65khdx3PQBxzrOve94fB4+DU+G0+7&#10;I63M3xyjMzKeG6yxbX51NviQc6fi/Qg2j46u7af5pokLaiFZq3ay1jdNj0b/UIh0NXuwSlMSdCEX&#10;56eptC4jTJnh/RE0pWdWC5aqwpsJGlZNPPoHrWrV+VQdUbk93+reFBh6dy5mV+iLpKhOIHBigpul&#10;kJ/b1ganDxO7+OwikoltpR9k6ONYiKYaAZbqCTdS3YRMsX9u/o2yGDYmdlxKG+sGPZyWeMaAi1yu&#10;FkvV21J0mbiLVmy+onZJOVs5pB/QRVZu/vftJEqR7ta///3Vr98+++NLXKmdVHWs0U4qTvb7dSnF&#10;ZplEM0qRYqc1wJBwfftZJZ85lFnkluzrkw2OYlzNQGqqqppYd6RDN6TNB51vMAi+qpkQkuloc1k1&#10;pBbdTGxZTuUKS3hKrXQ0Ni0qyVEDVWDdynO8+/7pGyvvNXWmBVXJDB0tLUPXSE2/MXIr315su7Od&#10;/0t4KMe18F589fOrf37A9eVvv1iIWU9SnHqcZtVhD1bR/cMidT4yvcpxrNHSXjWkX3sNsTHXdT2k&#10;mRYrJ/Rwi69HY6M33x8GQ3pPgjOFtUNr6SrrVVldpWjlpFU99KjXidIFzmqpZtwgxc4iiHPJbEaV&#10;hAwfVL9Kg6bQqNqi6MYRphqij1vpjLT5rOzsDoVP/gUAAP//AwBQSwMEFAAGAAgAAAAhAKkxck/h&#10;AAAACgEAAA8AAABkcnMvZG93bnJldi54bWxMj0FrwkAQhe+F/odlCr3pJmpU0mxEpO1JCtVC6W3M&#10;jkkwOxuyaxL/fddTexzm473vZZvRNKKnztWWFcTTCARxYXXNpYKv49tkDcJ5ZI2NZVJwIweb/PEh&#10;w1TbgT+pP/hShBB2KSqovG9TKV1RkUE3tS1x+J1tZ9CHsyul7nAI4aaRsyhaSoM1h4YKW9pVVFwO&#10;V6PgfcBhO49f+/3lvLv9HJOP731MSj0/jdsXEJ5G/wfDXT+oQx6cTvbK2olGwSSeLwKqYLYKm+5A&#10;lCyWIE4KVskaZJ7J/xPyXwAAAP//AwBQSwECLQAUAAYACAAAACEAtoM4kv4AAADhAQAAEwAAAAAA&#10;AAAAAAAAAAAAAAAAW0NvbnRlbnRfVHlwZXNdLnhtbFBLAQItABQABgAIAAAAIQA4/SH/1gAAAJQB&#10;AAALAAAAAAAAAAAAAAAAAC8BAABfcmVscy8ucmVsc1BLAQItABQABgAIAAAAIQBgZWR+ewYAAFwW&#10;AAAOAAAAAAAAAAAAAAAAAC4CAABkcnMvZTJvRG9jLnhtbFBLAQItABQABgAIAAAAIQCpMXJP4QAA&#10;AAoBAAAPAAAAAAAAAAAAAAAAANUIAABkcnMvZG93bnJldi54bWxQSwUGAAAAAAQABADzAAAA4wkA&#10;AAAA&#10;">
+                <v:group id="组合 81" o:spid="_x0000_s1043" style="position:absolute;top:48;width:12566;height:2796" coordorigin=",66" coordsize="12560,3870" o:gfxdata="UEsDBBQABgAIAAAAIQDb4fbL7gAAAIUBAAATAAAAW0NvbnRlbnRfVHlwZXNdLnhtbHyQz07DMAyH&#10;70i8Q+QralM4IITa7kDhCAiNB7ASt43WOlEcyvb2pNu4IODoPz9/n1xv9vOkForiPDdwXVagiI23&#10;jocG3rdPxR0oScgWJ8/UwIEENu3lRb09BBKV0ywNjCmFe63FjDSjlD4Q50nv44wpl3HQAc0OB9I3&#10;VXWrjedEnIq03oC27qjHjympx31un0wiTQLq4bS4shrAECZnMGVTvbD9QSnOhDInjzsyuiBXWQP0&#10;r4R18jfgnHvJr4nOknrFmJ5xzhraRtHWf3Kkpfz/yGo5S+H73hkquyhdjr3R8m2lj09svwAAAP//&#10;AwBQSwMEFAAGAAgAAAAhAFr0LFu/AAAAFQEAAAsAAABfcmVscy8ucmVsc2zPwWrDMAwG4Ptg72B0&#10;X5TuUMaI01uh19I+gLGVxCy2jGSy9e1nemrHjpL4P0nD4SetZiPRyNnCruvBUPYcYp4tXC/Htw8w&#10;Wl0ObuVMFm6kcBhfX4Yzra62kC6xqGlKVgtLreUTUf1CyWnHhXKbTCzJ1VbKjMX5LzcTvvf9HuXR&#10;gPHJNKdgQU5hB+ZyK23zHztFL6w81c5zQp6m6P9TMfB3PtPWFCczVQtB9N4U2rp2HOA44NMz4y8A&#10;AAD//wMAUEsDBBQABgAIAAAAIQDT2Cy2wQAAANoAAAAPAAAAZHJzL2Rvd25yZXYueG1sRE/LasJA&#10;FN0X/IfhCt3VSVoqEh2DiJUuQsEHiLtL5pqEZO6EzJjH33cWhS4P571JR9OInjpXWVYQLyIQxLnV&#10;FRcKrpevtxUI55E1NpZJwUQO0u3sZYOJtgOfqD/7QoQQdgkqKL1vEyldXpJBt7AtceAetjPoA+wK&#10;qTscQrhp5HsULaXBikNDiS3tS8rr89MoOA447D7iQ5/Vj/10v3z+3LKYlHqdj7s1CE+j/xf/ub+1&#10;grA1XAk3QG5/AQAA//8DAFBLAQItABQABgAIAAAAIQDb4fbL7gAAAIUBAAATAAAAAAAAAAAAAAAA&#10;AAAAAABbQ29udGVudF9UeXBlc10ueG1sUEsBAi0AFAAGAAgAAAAhAFr0LFu/AAAAFQEAAAsAAAAA&#10;AAAAAAAAAAAAHwEAAF9yZWxzLy5yZWxzUEsBAi0AFAAGAAgAAAAhANPYLLbBAAAA2gAAAA8AAAAA&#10;AAAAAAAAAAAABwIAAGRycy9kb3ducmV2LnhtbFBLBQYAAAAAAwADALcAAAD1AgAAAAA=&#10;">
+                  <o:lock v:ext="edit" aspectratio="t"/>
+                  <v:shape id="任意多边形 2" o:spid="_x0000_s1044" style="position:absolute;top:66;width:12560;height:2812;visibility:visible;mso-wrap-style:square;v-text-anchor:middle" coordsize="1406296,288031" o:spt="100" o:gfxdata="UEsDBBQABgAIAAAAIQDb4fbL7gAAAIUBAAATAAAAW0NvbnRlbnRfVHlwZXNdLnhtbHyQz07DMAyH&#10;70i8Q+QralM4IITa7kDhCAiNB7ASt43WOlEcyvb2pNu4IODoPz9/n1xv9vOkForiPDdwXVagiI23&#10;jocG3rdPxR0oScgWJ8/UwIEENu3lRb09BBKV0ywNjCmFe63FjDSjlD4Q50nv44wpl3HQAc0OB9I3&#10;VXWrjedEnIq03oC27qjHjympx31un0wiTQLq4bS4shrAECZnMGVTvbD9QSnOhDInjzsyuiBXWQP0&#10;r4R18jfgnHvJr4nOknrFmJ5xzhraRtHWf3Kkpfz/yGo5S+H73hkquyhdjr3R8m2lj09svwAAAP//&#10;AwBQSwMEFAAGAAgAAAAhAFr0LFu/AAAAFQEAAAsAAABfcmVscy8ucmVsc2zPwWrDMAwG4Ptg72B0&#10;X5TuUMaI01uh19I+gLGVxCy2jGSy9e1nemrHjpL4P0nD4SetZiPRyNnCruvBUPYcYp4tXC/Htw8w&#10;Wl0ObuVMFm6kcBhfX4Yzra62kC6xqGlKVgtLreUTUf1CyWnHhXKbTCzJ1VbKjMX5LzcTvvf9HuXR&#10;gPHJNKdgQU5hB+ZyK23zHztFL6w81c5zQp6m6P9TMfB3PtPWFCczVQtB9N4U2rp2HOA44NMz4y8A&#10;AAD//wMAUEsDBBQABgAIAAAAIQAle6R4wQAAANsAAAAPAAAAZHJzL2Rvd25yZXYueG1sRE/fa8Iw&#10;EH4f+D+EE3ybqYJzdEYZg4niS+3G2OPRnG1YcylNbOp/bwaDvd3H9/M2u9G2YqDeG8cKFvMMBHHl&#10;tOFawefH++MzCB+QNbaOScGNPOy2k4cN5tpFPtNQhlqkEPY5KmhC6HIpfdWQRT93HXHiLq63GBLs&#10;a6l7jCnctnKZZU/SouHU0GBHbw1VP+XVKiiP66IwMe5Xg/kqLldenr6jVWo2HV9fQAQaw7/4z33Q&#10;af4Cfn9JB8jtHQAA//8DAFBLAQItABQABgAIAAAAIQDb4fbL7gAAAIUBAAATAAAAAAAAAAAAAAAA&#10;AAAAAABbQ29udGVudF9UeXBlc10ueG1sUEsBAi0AFAAGAAgAAAAhAFr0LFu/AAAAFQEAAAsAAAAA&#10;AAAAAAAAAAAAHwEAAF9yZWxzLy5yZWxzUEsBAi0AFAAGAAgAAAAhACV7pHjBAAAA2wAAAA8AAAAA&#10;AAAAAAAAAAAABwIAAGRycy9kb3ducmV2LnhtbFBLBQYAAAAAAwADALcAAAD1AgAAAAA=&#10;" adj="-11796480,,5400" path="m1093154,r77999,l1406296,288031r-77999,l1093154,xm1030297,r39620,l1305060,288031r-39620,l1030297,xm,l1007060,r235143,288031l,288031,,xe" fillcolor="#4e7282" stroked="f">
+                    <v:stroke joinstyle="miter"/>
+                    <v:formulas/>
+                    <v:path arrowok="t" o:connecttype="custom" o:connectlocs="871803,0;934008,0;1121537,280845;1059332,280845;821673,0;853271,0;1040800,280845;1009203,280845;0,0;803142,0;990671,280845;0,280845" o:connectangles="0,0,0,0,0,0,0,0,0,0,0,0" textboxrect="0,0,1406296,288031"/>
+                    <v:textbox inset="5.5mm,0,,0">
+                      <w:txbxContent>
+                        <w:p>
+                          <w:pPr>
+                            <w:adjustRightInd w:val="0"/>
+                            <w:snapToGrid w:val="0"/>
+                            <w:spacing w:line="320" w:lineRule="exact"/>
+                            <w:rPr>
+                              <w:rFonts w:ascii="微软雅黑" w:hAnsi="微软雅黑" w:hint="eastAsia"/>
+                              <w:color w:val="FFFFFF"/>
+                              <w:sz w:val="24"/>
+                              <w:szCs w:val="24"/>
+                            </w:rPr>
+                          </w:pPr>
+                          <w:r>
+                            <w:rPr>
+                              <w:rFonts w:ascii="微软雅黑" w:hAnsi="微软雅黑" w:hint="eastAsia"/>
+                              <w:color w:val="FFFFFF"/>
+                              <w:sz w:val="24"/>
+                              <w:szCs w:val="24"/>
+                            </w:rPr>
+                            <w:t>技能特长</w:t>
+                          </w:r>
+                        </w:p>
+                        <w:p>
+                          <w:pPr>
+                            <w:adjustRightInd w:val="0"/>
+                            <w:snapToGrid w:val="0"/>
+                            <w:spacing w:line="320" w:lineRule="exact"/>
+                            <w:rPr>
+                              <w:rFonts w:ascii="微软雅黑" w:hAnsi="微软雅黑" w:hint="eastAsia"/>
+                              <w:color w:val="FFFFFF"/>
+                              <w:sz w:val="24"/>
+                              <w:szCs w:val="24"/>
+                            </w:rPr>
+                          </w:pPr>
+                        </w:p>
+                      </w:txbxContent>
+                    </v:textbox>
+                  </v:shape>
+                  <v:shape id="直角三角形 3" o:spid="_x0000_s1045" type="#_x0000_t6" style="position:absolute;left:2;top:2876;width:1439;height:1060;rotation:180;visibility:visible;mso-wrap-style:square;v-text-anchor:top" o:gfxdata="UEsDBBQABgAIAAAAIQDb4fbL7gAAAIUBAAATAAAAW0NvbnRlbnRfVHlwZXNdLnhtbHyQz07DMAyH&#10;70i8Q+QralM4IITa7kDhCAiNB7ASt43WOlEcyvb2pNu4IODoPz9/n1xv9vOkForiPDdwXVagiI23&#10;jocG3rdPxR0oScgWJ8/UwIEENu3lRb09BBKV0ywNjCmFe63FjDSjlD4Q50nv44wpl3HQAc0OB9I3&#10;VXWrjedEnIq03oC27qjHjympx31un0wiTQLq4bS4shrAECZnMGVTvbD9QSnOhDInjzsyuiBXWQP0&#10;r4R18jfgnHvJr4nOknrFmJ5xzhraRtHWf3Kkpfz/yGo5S+H73hkquyhdjr3R8m2lj09svwAAAP//&#10;AwBQSwMEFAAGAAgAAAAhAFr0LFu/AAAAFQEAAAsAAABfcmVscy8ucmVsc2zPwWrDMAwG4Ptg72B0&#10;X5TuUMaI01uh19I+gLGVxCy2jGSy9e1nemrHjpL4P0nD4SetZiPRyNnCruvBUPYcYp4tXC/Htw8w&#10;Wl0ObuVMFm6kcBhfX4Yzra62kC6xqGlKVgtLreUTUf1CyWnHhXKbTCzJ1VbKjMX5LzcTvvf9HuXR&#10;gPHJNKdgQU5hB+ZyK23zHztFL6w81c5zQp6m6P9TMfB3PtPWFCczVQtB9N4U2rp2HOA44NMz4y8A&#10;AAD//wMAUEsDBBQABgAIAAAAIQCOYVmKwgAAANsAAAAPAAAAZHJzL2Rvd25yZXYueG1sRE89a8Mw&#10;EN0L+Q/iCtkayR1CcKyEUBxqUiit4yXbYV1tU+tkLMVx/n1VKHS7x/u8bD/bXkw0+s6xhmSlQBDX&#10;znTcaKjOx6cNCB+QDfaOScOdPOx3i4cMU+Nu/ElTGRoRQ9inqKENYUil9HVLFv3KDcSR+3KjxRDh&#10;2Egz4i2G214+K7WWFjuODS0O9NJS/V1erYb8bXOpTu+5aj6wT15pKg6lKrRePs6HLYhAc/gX/7kL&#10;E+ev4feXeIDc/QAAAP//AwBQSwECLQAUAAYACAAAACEA2+H2y+4AAACFAQAAEwAAAAAAAAAAAAAA&#10;AAAAAAAAW0NvbnRlbnRfVHlwZXNdLnhtbFBLAQItABQABgAIAAAAIQBa9CxbvwAAABUBAAALAAAA&#10;AAAAAAAAAAAAAB8BAABfcmVscy8ucmVsc1BLAQItABQABgAIAAAAIQCOYVmKwgAAANsAAAAPAAAA&#10;AAAAAAAAAAAAAAcCAABkcnMvZG93bnJldi54bWxQSwUGAAAAAAMAAwC3AAAA9gIAAAAA&#10;" fillcolor="#405e6c" stroked="f"/>
+                </v:group>
+                <v:line id="直接连接符 20" o:spid="_x0000_s1046" style="position:absolute;visibility:visible;mso-wrap-style:square" from="1333,2095" to="67818,2095" o:connectortype="straight" o:gfxdata="UEsDBBQABgAIAAAAIQDb4fbL7gAAAIUBAAATAAAAW0NvbnRlbnRfVHlwZXNdLnhtbHyQz07DMAyH&#10;70i8Q+QralM4IITa7kDhCAiNB7ASt43WOlEcyvb2pNu4IODoPz9/n1xv9vOkForiPDdwXVagiI23&#10;jocG3rdPxR0oScgWJ8/UwIEENu3lRb09BBKV0ywNjCmFe63FjDSjlD4Q50nv44wpl3HQAc0OB9I3&#10;VXWrjedEnIq03oC27qjHjympx31un0wiTQLq4bS4shrAECZnMGVTvbD9QSnOhDInjzsyuiBXWQP0&#10;r4R18jfgnHvJr4nOknrFmJ5xzhraRtHWf3Kkpfz/yGo5S+H73hkquyhdjr3R8m2lj09svwAAAP//&#10;AwBQSwMEFAAGAAgAAAAhAFr0LFu/AAAAFQEAAAsAAABfcmVscy8ucmVsc2zPwWrDMAwG4Ptg72B0&#10;X5TuUMaI01uh19I+gLGVxCy2jGSy9e1nemrHjpL4P0nD4SetZiPRyNnCruvBUPYcYp4tXC/Htw8w&#10;Wl0ObuVMFm6kcBhfX4Yzra62kC6xqGlKVgtLreUTUf1CyWnHhXKbTCzJ1VbKjMX5LzcTvvf9HuXR&#10;gPHJNKdgQU5hB+ZyK23zHztFL6w81c5zQp6m6P9TMfB3PtPWFCczVQtB9N4U2rp2HOA44NMz4y8A&#10;AAD//wMAUEsDBBQABgAIAAAAIQBbnUgcwQAAANsAAAAPAAAAZHJzL2Rvd25yZXYueG1sRE9LawIx&#10;EL4X+h/CFLzV7HqosjWKFApatPii52EzZpfdTJYkuuu/N4VCb/PxPWe+HGwrbuRD7VhBPs5AEJdO&#10;12wUnE+frzMQISJrbB2TgjsFWC6en+ZYaNfzgW7HaEQK4VCggirGrpAylBVZDGPXESfu4rzFmKA3&#10;UnvsU7ht5STL3qTFmlNDhR19VFQ2x6tVIP2uNZk7/YSv773NzbbZdP1ZqdHLsHoHEWmI/+I/91qn&#10;+VP4/SUdIBcPAAAA//8DAFBLAQItABQABgAIAAAAIQDb4fbL7gAAAIUBAAATAAAAAAAAAAAAAAAA&#10;AAAAAABbQ29udGVudF9UeXBlc10ueG1sUEsBAi0AFAAGAAgAAAAhAFr0LFu/AAAAFQEAAAsAAAAA&#10;AAAAAAAAAAAAHwEAAF9yZWxzLy5yZWxzUEsBAi0AFAAGAAgAAAAhAFudSBzBAAAA2wAAAA8AAAAA&#10;AAAAAAAAAAAABwIAAGRycy9kb3ducmV2LnhtbFBLBQYAAAAAAwADALcAAAD1AgAAAAA=&#10;" strokecolor="#4e7282"/>
+              </v:group>
+            </w:pict>
+          </mc:Fallback>
+        </mc:AlternateContent>
+      </w:r>
+    </w:p>
+    <w:p>
+      <w:pPr>
+        <w:rPr>
+          <w:rFonts w:hint="eastAsia"/>
+          <w:b/>
+          <w:bCs/>
+        </w:rPr>
+      </w:pPr>
+      <w:r>
+        <w:rPr>
+          <w:rFonts w:hint="eastAsia"/>
+          <w:b/>
+          <w:bCs/>
+        </w:rPr>
+        <w:t xml:space="preserve">个人简介：聚焦 AI 应用开发、LLM 工程化与全栈敏捷交付，具备 Python、FastAPI、RAG、LangChain、LangGraph、Supabase 等项目实践，能够围绕真实业务痛点完成从模型编排、后端服务、前端交互到云端部署上线的闭环落地；熟悉 Trae、Cursor、Copilot 等 AI 辅助开发工具驱动 MVP 快速迭代，并具备挪威 UiT 全英文交换经历与跨文化技术沟通能力。</w:t>
       </w:r>
     </w:p>
     <w:p>
@@ -4646,231 +5003,6 @@
     </w:p>
     <w:p>
       <w:pPr>
-        <w:spacing w:before="0" w:after="0" w:line="240" w:lineRule="auto"/>
-        <w:jc w:val="left"/>
-      </w:pPr>
-      <w:r/>
-      <w:r>
-        <w:rPr>
-          <w:rFonts w:ascii="微软雅黑" w:hAnsi="微软雅黑"/>
-          <w:b/>
-          <w:sz w:val="18"/>
-        </w:rPr>
-        <w:t>1. 多源文档智能检索与问答平台（项目实践）</w:t>
-      </w:r>
-    </w:p>
-    <w:p>
-      <w:pPr>
-        <w:spacing w:before="0" w:after="0" w:line="240" w:lineRule="auto"/>
-        <w:jc w:val="left"/>
-      </w:pPr>
-      <w:r/>
-      <w:r>
-        <w:rPr>
-          <w:rFonts w:ascii="微软雅黑" w:hAnsi="微软雅黑"/>
-          <w:b w:val="0"/>
-          <w:sz w:val="17"/>
-        </w:rPr>
-        <w:t>技术栈: Python, FastAPI, LangChain, LangGraph, ChromaDB, Redis, Docker</w:t>
-      </w:r>
-    </w:p>
-    <w:p>
-      <w:pPr>
-        <w:spacing w:before="0" w:after="0" w:line="240" w:lineRule="auto"/>
-        <w:jc w:val="left"/>
-      </w:pPr>
-      <w:r/>
-      <w:r>
-        <w:rPr>
-          <w:rFonts w:ascii="微软雅黑" w:hAnsi="微软雅黑"/>
-          <w:b w:val="0"/>
-          <w:sz w:val="17"/>
-        </w:rPr>
-        <w:t>- 设计混合检索与 Rerank 召回链路，结合向量检索、关键词召回与重排机制抑制长文档噪声和语义漂移，提升复杂问答的相关性与抗幻觉能力。</w:t>
-      </w:r>
-    </w:p>
-    <w:p>
-      <w:pPr>
-        <w:spacing w:before="0" w:after="0" w:line="240" w:lineRule="auto"/>
-        <w:jc w:val="left"/>
-      </w:pPr>
-      <w:r/>
-      <w:r>
-        <w:rPr>
-          <w:rFonts w:ascii="微软雅黑" w:hAnsi="微软雅黑"/>
-          <w:b w:val="0"/>
-          <w:sz w:val="17"/>
-        </w:rPr>
-        <w:t>- 引入 Redis 多轮会话缓存与上下文隔离策略，复用历史记忆并减少重复检索开销，优化高并发场景下的响应速度与对话连续性。</w:t>
-      </w:r>
-    </w:p>
-    <w:p>
-      <w:pPr>
-        <w:spacing w:before="0" w:after="0" w:line="240" w:lineRule="auto"/>
-        <w:jc w:val="left"/>
-      </w:pPr>
-      <w:r/>
-      <w:r>
-        <w:rPr>
-          <w:rFonts w:ascii="微软雅黑" w:hAnsi="微软雅黑"/>
-          <w:b w:val="0"/>
-          <w:sz w:val="17"/>
-        </w:rPr>
-        <w:t>- 封装 FastAPI 服务并完成 Docker 容器化部署，统一开发、测试与交付环境，降低环境差异带来的部署成本和维护复杂度。</w:t>
-      </w:r>
-    </w:p>
-    <w:p>
-      <w:pPr>
-        <w:spacing w:before="0" w:after="0" w:line="240" w:lineRule="auto"/>
-        <w:jc w:val="left"/>
-      </w:pPr>
-      <w:r/>
-      <w:r>
-        <w:rPr>
-          <w:rFonts w:ascii="微软雅黑" w:hAnsi="微软雅黑"/>
-          <w:b/>
-          <w:sz w:val="18"/>
-        </w:rPr>
-        <w:t>2. 基于 LangGraph 的多智能体任务编排系统（项目实践）</w:t>
-      </w:r>
-    </w:p>
-    <w:p>
-      <w:pPr>
-        <w:spacing w:before="0" w:after="0" w:line="240" w:lineRule="auto"/>
-        <w:jc w:val="left"/>
-      </w:pPr>
-      <w:r/>
-      <w:r>
-        <w:rPr>
-          <w:rFonts w:ascii="微软雅黑" w:hAnsi="微软雅黑"/>
-          <w:b w:val="0"/>
-          <w:sz w:val="17"/>
-        </w:rPr>
-        <w:t>技术栈: Python, FastAPI, LangGraph, LangChain, Pydantic, SSE</w:t>
-      </w:r>
-    </w:p>
-    <w:p>
-      <w:pPr>
-        <w:spacing w:before="0" w:after="0" w:line="240" w:lineRule="auto"/>
-        <w:jc w:val="left"/>
-      </w:pPr>
-      <w:r/>
-      <w:r>
-        <w:rPr>
-          <w:rFonts w:ascii="微软雅黑" w:hAnsi="微软雅黑"/>
-          <w:b w:val="0"/>
-          <w:sz w:val="17"/>
-        </w:rPr>
-        <w:t>- 构建基于 LangGraph State Graph 的 Planner / Router / Executor 协同架构，将任务拆解、路由决策与执行状态解耦，提升复杂任务流的可扩展性与容错性。</w:t>
-      </w:r>
-    </w:p>
-    <w:p>
-      <w:pPr>
-        <w:spacing w:before="0" w:after="0" w:line="240" w:lineRule="auto"/>
-        <w:jc w:val="left"/>
-      </w:pPr>
-      <w:r/>
-      <w:r>
-        <w:rPr>
-          <w:rFonts w:ascii="微软雅黑" w:hAnsi="微软雅黑"/>
-          <w:b w:val="0"/>
-          <w:sz w:val="17"/>
-        </w:rPr>
-        <w:t>- 使用 Pydantic 约束 Agent 间输入输出协议与状态持久化结构，减少多角色协作中的状态污染和结果不确定性，提升链路稳定性。</w:t>
-      </w:r>
-    </w:p>
-    <w:p>
-      <w:pPr>
-        <w:spacing w:before="0" w:after="0" w:line="240" w:lineRule="auto"/>
-        <w:jc w:val="left"/>
-      </w:pPr>
-      <w:r/>
-      <w:r>
-        <w:rPr>
-          <w:rFonts w:ascii="微软雅黑" w:hAnsi="微软雅黑"/>
-          <w:b w:val="0"/>
-          <w:sz w:val="17"/>
-        </w:rPr>
-        <w:t>- 实现基于 SSE 的打字机式流式响应与上下文持久化机制，缩短用户等待感知，并保持长链路任务的连续反馈体验。</w:t>
-      </w:r>
-    </w:p>
-    <w:p>
-      <w:pPr>
-        <w:spacing w:before="0" w:after="0" w:line="240" w:lineRule="auto"/>
-        <w:jc w:val="left"/>
-      </w:pPr>
-      <w:r/>
-      <w:r>
-        <w:rPr>
-          <w:rFonts w:ascii="微软雅黑" w:hAnsi="微软雅黑"/>
-          <w:b/>
-          <w:sz w:val="18"/>
-        </w:rPr>
-        <w:t>3. 《新世界庄园：破笼之宴》沉浸式 RPG 交互与数据平台（在线项目）</w:t>
-      </w:r>
-    </w:p>
-    <w:p>
-      <w:pPr>
-        <w:spacing w:before="0" w:after="0" w:line="240" w:lineRule="auto"/>
-        <w:jc w:val="left"/>
-      </w:pPr>
-      <w:r/>
-      <w:r>
-        <w:rPr>
-          <w:rFonts w:ascii="微软雅黑" w:hAnsi="微软雅黑"/>
-          <w:b w:val="0"/>
-          <w:sz w:val="17"/>
-        </w:rPr>
-        <w:t>技术栈: HTML5, CSS3, JavaScript, Supabase, Vercel, DNS / 域名工程化</w:t>
-      </w:r>
-    </w:p>
-    <w:p>
-      <w:pPr>
-        <w:spacing w:before="0" w:after="0" w:line="240" w:lineRule="auto"/>
-        <w:jc w:val="left"/>
-      </w:pPr>
-      <w:r/>
-      <w:r>
-        <w:rPr>
-          <w:rFonts w:ascii="微软雅黑" w:hAnsi="微软雅黑"/>
-          <w:b w:val="0"/>
-          <w:sz w:val="17"/>
-        </w:rPr>
-        <w:t>- 基于 Supabase 搭建 Serverless 数据底座，完成云端数据库、鉴权与 RLS 行级安全策略设计，实现交互数据的秒级响应、持久化存储与权限隔离。</w:t>
-      </w:r>
-    </w:p>
-    <w:p>
-      <w:pPr>
-        <w:spacing w:before="0" w:after="0" w:line="240" w:lineRule="auto"/>
-        <w:jc w:val="left"/>
-      </w:pPr>
-      <w:r/>
-      <w:r>
-        <w:rPr>
-          <w:rFonts w:ascii="微软雅黑" w:hAnsi="微软雅黑"/>
-          <w:b w:val="0"/>
-          <w:sz w:val="17"/>
-        </w:rPr>
-        <w:t>- 独立完成前端页面实现与 BaaS 能力接入，围绕沉浸式 RPG 场景快速迭代 MVP，验证从创意原型到在线产品的全栈敏捷交付能力。</w:t>
-      </w:r>
-    </w:p>
-    <w:p>
-      <w:pPr>
-        <w:spacing w:before="0" w:after="0" w:line="240" w:lineRule="auto"/>
-        <w:jc w:val="left"/>
-      </w:pPr>
-      <w:r/>
-      <w:r>
-        <w:rPr>
-          <w:rFonts w:ascii="微软雅黑" w:hAnsi="微软雅黑"/>
-          <w:b w:val="0"/>
-          <w:sz w:val="17"/>
-        </w:rPr>
-        <w:t>- 打通 www.xinshijie1945.com 域名解析、A/CNAME 配置、HTTPS 证书启用与 Vercel CI/CD 自动化部署链路，形成从 0 到 1 的产品上线闭环经验。</w:t>
-      </w:r>
-    </w:p>
-    <w:p>
-      <w:pPr>
         <w:rPr>
           <w:rFonts w:hint="eastAsia"/>
         </w:rPr>
@@ -5074,6 +5206,201 @@
                           </wps:spPr>
                           <wps:txbx>
                             <w:txbxContent>
+                              <w:p>
+                                <w:pPr>
+                                  <w:rPr>
+                                    <w:rFonts w:hint="eastAsia"/>
+                                  </w:rPr>
+                                </w:pPr>
+                                <w:r>
+                                  <w:rPr>
+                                    <w:rFonts w:hint="eastAsia"/>
+                                  </w:rPr>
+                                  <w:t xml:space="preserve">1. 多源文档智能检索与问答平台（项目实践）</w:t>
+                                </w:r>
+                              </w:p>
+                              <w:p>
+                                <w:pPr>
+                                  <w:rPr>
+                                    <w:rFonts w:hint="eastAsia"/>
+                                  </w:rPr>
+                                </w:pPr>
+                                <w:r>
+                                  <w:rPr>
+                                    <w:rFonts w:hint="eastAsia"/>
+                                  </w:rPr>
+                                  <w:t xml:space="preserve">技术栈: Python, FastAPI, LangChain, LangGraph, ChromaDB, Redis, Docker</w:t>
+                                </w:r>
+                              </w:p>
+                              <w:p>
+                                <w:pPr>
+                                  <w:rPr>
+                                    <w:rFonts w:hint="eastAsia"/>
+                                  </w:rPr>
+                                </w:pPr>
+                                <w:r>
+                                  <w:rPr>
+                                    <w:rFonts w:hint="eastAsia"/>
+                                  </w:rPr>
+                                  <w:t xml:space="preserve">• 设计混合检索与 Rerank 召回链路，结合向量检索、关键词召回与重排机制抑制长文档噪声和语义漂移，提升复杂问答的相关性与抗幻觉能力。</w:t>
+                                </w:r>
+                              </w:p>
+                              <w:p>
+                                <w:pPr>
+                                  <w:rPr>
+                                    <w:rFonts w:hint="eastAsia"/>
+                                  </w:rPr>
+                                </w:pPr>
+                                <w:r>
+                                  <w:rPr>
+                                    <w:rFonts w:hint="eastAsia"/>
+                                  </w:rPr>
+                                  <w:t xml:space="preserve">• 引入 Redis 多轮会话缓存与上下文隔离策略，复用历史记忆并减少重复检索开销，优化高并发场景下的响应速度与对话连续性。</w:t>
+                                </w:r>
+                              </w:p>
+                              <w:p>
+                                <w:pPr>
+                                  <w:rPr>
+                                    <w:rFonts w:hint="eastAsia"/>
+                                  </w:rPr>
+                                </w:pPr>
+                                <w:r>
+                                  <w:rPr>
+                                    <w:rFonts w:hint="eastAsia"/>
+                                  </w:rPr>
+                                  <w:t xml:space="preserve">• 封装 FastAPI 服务并完成 Docker 容器化部署，统一开发、测试与交付环境，降低环境差异带来的部署成本和维护复杂度。</w:t>
+                                </w:r>
+                              </w:p>
+                              <w:p>
+                                <w:pPr>
+                                  <w:rPr>
+                                    <w:rFonts w:hint="eastAsia"/>
+                                  </w:rPr>
+                                </w:pPr>
+                                <w:r>
+                                  <w:rPr>
+                                    <w:rFonts w:hint="eastAsia"/>
+                                  </w:rPr>
+                                  <w:t xml:space="preserve">2. 基于 LangGraph 的多智能体任务编排系统（项目实践）</w:t>
+                                </w:r>
+                              </w:p>
+                              <w:p>
+                                <w:pPr>
+                                  <w:rPr>
+                                    <w:rFonts w:hint="eastAsia"/>
+                                  </w:rPr>
+                                </w:pPr>
+                                <w:r>
+                                  <w:rPr>
+                                    <w:rFonts w:hint="eastAsia"/>
+                                  </w:rPr>
+                                  <w:t xml:space="preserve">技术栈: Python, FastAPI, LangGraph, LangChain, Pydantic, SSE</w:t>
+                                </w:r>
+                              </w:p>
+                              <w:p>
+                                <w:pPr>
+                                  <w:rPr>
+                                    <w:rFonts w:hint="eastAsia"/>
+                                  </w:rPr>
+                                </w:pPr>
+                                <w:r>
+                                  <w:rPr>
+                                    <w:rFonts w:hint="eastAsia"/>
+                                  </w:rPr>
+                                  <w:t xml:space="preserve">• 构建基于 LangGraph State Graph 的 Planner / Router / Executor 协同架构，将任务拆解、路由决策与执行状态解耦，提升复杂任务流的可扩展性与容错性。</w:t>
+                                </w:r>
+                              </w:p>
+                              <w:p>
+                                <w:pPr>
+                                  <w:rPr>
+                                    <w:rFonts w:hint="eastAsia"/>
+                                  </w:rPr>
+                                </w:pPr>
+                                <w:r>
+                                  <w:rPr>
+                                    <w:rFonts w:hint="eastAsia"/>
+                                  </w:rPr>
+                                  <w:t xml:space="preserve">• 使用 Pydantic 约束 Agent 间输入输出协议与状态持久化结构，减少多角色协作中的状态污染和结果不确定性，提升链路稳定性。</w:t>
+                                </w:r>
+                              </w:p>
+                              <w:p>
+                                <w:pPr>
+                                  <w:rPr>
+                                    <w:rFonts w:hint="eastAsia"/>
+                                  </w:rPr>
+                                </w:pPr>
+                                <w:r>
+                                  <w:rPr>
+                                    <w:rFonts w:hint="eastAsia"/>
+                                  </w:rPr>
+                                  <w:t xml:space="preserve">• 实现基于 SSE 的打字机式流式响应与上下文持久化机制，缩短用户等待感知，并保持长链路任务的连续反馈体验。</w:t>
+                                </w:r>
+                              </w:p>
+                              <w:p>
+                                <w:pPr>
+                                  <w:rPr>
+                                    <w:rFonts w:hint="eastAsia"/>
+                                  </w:rPr>
+                                </w:pPr>
+                                <w:r>
+                                  <w:rPr>
+                                    <w:rFonts w:hint="eastAsia"/>
+                                  </w:rPr>
+                                  <w:t xml:space="preserve">3. 《新世界庄园：破笼之宴》沉浸式 RPG 交互与数据平台（在线项目）</w:t>
+                                </w:r>
+                              </w:p>
+                              <w:p>
+                                <w:pPr>
+                                  <w:rPr>
+                                    <w:rFonts w:hint="eastAsia"/>
+                                  </w:rPr>
+                                </w:pPr>
+                                <w:r>
+                                  <w:rPr>
+                                    <w:rFonts w:hint="eastAsia"/>
+                                  </w:rPr>
+                                  <w:t xml:space="preserve">技术栈: HTML5, CSS3, JavaScript, Supabase, Vercel, DNS / 域名工程化</w:t>
+                                </w:r>
+                              </w:p>
+                              <w:p>
+                                <w:pPr>
+                                  <w:rPr>
+                                    <w:rFonts w:hint="eastAsia"/>
+                                  </w:rPr>
+                                </w:pPr>
+                                <w:r>
+                                  <w:rPr>
+                                    <w:rFonts w:hint="eastAsia"/>
+                                  </w:rPr>
+                                  <w:t xml:space="preserve">• 基于 Supabase 搭建 Serverless 数据底座，完成云端数据库、鉴权与 RLS 行级安全策略设计，实现交互数据的秒级响应、持久化存储与权限隔离。</w:t>
+                                </w:r>
+                              </w:p>
+                              <w:p>
+                                <w:pPr>
+                                  <w:rPr>
+                                    <w:rFonts w:hint="eastAsia"/>
+                                  </w:rPr>
+                                </w:pPr>
+                                <w:r>
+                                  <w:rPr>
+                                    <w:rFonts w:hint="eastAsia"/>
+                                  </w:rPr>
+                                  <w:t xml:space="preserve">• 独立完成前端页面实现与 BaaS 能力接入，围绕沉浸式 RPG 场景快速迭代 MVP，验证从创意原型到在线产品的全栈敏捷交付能力。</w:t>
+                                </w:r>
+                              </w:p>
+                              <w:p>
+                                <w:pPr>
+                                  <w:rPr>
+                                    <w:rFonts w:hint="eastAsia"/>
+                                  </w:rPr>
+                                </w:pPr>
+                                <w:r>
+                                  <w:rPr>
+                                    <w:rFonts w:hint="eastAsia"/>
+                                  </w:rPr>
+                                  <w:t xml:space="preserve">• 打通 www.xinshijie1945.com 域名解析、A/CNAME 配置、HTTPS 证书启用与 Vercel CI/CD 自动化部署链路，形成从 0 到 1 的产品上线闭环经验。</w:t>
+                                </w:r>
+                              </w:p>
                               <w:p>
                                 <w:pPr>
                                   <w:adjustRightInd w:val="0"/>

</xml_diff>

<commit_message>
Update resume content and downloadable files
</commit_message>
<xml_diff>
--- a/个人简历.docx
+++ b/个人简历.docx
@@ -1357,7 +1357,7 @@
         <mc:AlternateContent>
           <mc:Choice Requires="wps">
             <w:drawing>
-              <wp:anchor distT="0" distB="0" distL="114300" distR="114300" simplePos="0" relativeHeight="251661312" behindDoc="0" locked="0" layoutInCell="1" allowOverlap="1" wp14:anchorId="3030C4E8" wp14:editId="59FECE2F">
+              <wp:anchor distT="0" distB="0" distL="114300" distR="114300" simplePos="0" relativeHeight="251661312" behindDoc="0" locked="0" layoutInCell="1" allowOverlap="1" wp14:anchorId="3030C4E8" wp14:editId="4E9D0A65">
                 <wp:simplePos x="0" y="0"/>
                 <wp:positionH relativeFrom="column">
                   <wp:posOffset>5314950</wp:posOffset>
@@ -1366,7 +1366,7 @@
                   <wp:posOffset>409575</wp:posOffset>
                 </wp:positionV>
                 <wp:extent cx="281305" cy="287655"/>
-                <wp:effectExtent l="0" t="0" r="0" b="0"/>
+                <wp:effectExtent l="0" t="0" r="4445" b="0"/>
                 <wp:wrapNone/>
                 <wp:docPr id="10" name="Freeform 13"/>
                 <wp:cNvGraphicFramePr>
@@ -1848,6 +1848,15 @@
                           <a:noFill/>
                         </a:ln>
                       </wps:spPr>
+                      <wps:txbx>
+                        <w:txbxContent>
+                          <w:p>
+                            <w:pPr>
+                              <w:jc w:val="center"/>
+                            </w:pPr>
+                          </w:p>
+                        </w:txbxContent>
+                      </wps:txbx>
                       <wps:bodyPr vert="horz" wrap="square" lIns="91440" tIns="45720" rIns="91440" bIns="45720" numCol="1" anchor="t" anchorCtr="0" compatLnSpc="1"/>
                     </wps:wsp>
                   </a:graphicData>
@@ -1855,14 +1864,23 @@
               </wp:anchor>
             </w:drawing>
           </mc:Choice>
-          <mc:Fallback xmlns:wpsCustomData="http://www.wps.cn/officeDocument/2013/wpsCustomData">
+          <mc:Fallback>
             <w:pict>
-              <v:shape id="Freeform 13" o:spid="_x0000_s1026" o:spt="100" style="position:absolute;left:0pt;margin-left:418.5pt;margin-top:32.25pt;height:22.65pt;width:22.15pt;mso-position-vertical-relative:page;z-index:251661312;mso-width-relative:page;mso-height-relative:page;" fillcolor="#C19F67" filled="t" stroked="f" coordsize="192,196" o:gfxdata="UEsDBAoAAAAAAIdO4kAAAAAAAAAAAAAAAAAEAAAAZHJzL1BLAwQUAAAACACHTuJACaSEkdgAAAAK&#10;AQAADwAAAGRycy9kb3ducmV2LnhtbE2PQU7DMBBF90jcwRokNhW1Q6GYEKcLSsQSpXAAN544EbEd&#10;xW4aOD3DCpajefr//WK3uIHNOMU+eAXZWgBD3wTTe6vg4726kcBi0t7oIXhU8IURduXlRaFzE86+&#10;xvmQLKMQH3OtoEtpzDmPTYdOx3UY0dOvDZPTic7JcjPpM4W7gd8KseVO954aOj3ic4fN5+HkFLTf&#10;r4vb1xXW7Zu2dv+ymqp5pdT1VSaegCVc0h8Mv/qkDiU5HcPJm8gGBXLzQFuSgu3dPTACpMw2wI5E&#10;ikcJvCz4/wnlD1BLAwQUAAAACACHTuJA6jnmtpAIAADFKQAADgAAAGRycy9lMm9Eb2MueG1szVrb&#10;jts4En0fYP9B8OMAG4uyro10BjOdzWKA7EyAZD5ALcttY23JK6nbnfn6PUVSctGt6qaBeZiXpE0X&#10;D+scksUqmu9/ej7sg6e663dtc7tQ78JFUDdVu941D7eLP759+me+CPqhbNblvm3q28X3ul/89OEf&#10;P7w/HW/qqN22+3XdBQBp+pvT8XaxHYbjzXLZV9v6UPbv2mPd4MtN2x3KAR+7h+W6K09AP+yXURim&#10;y1PbrY9dW9V9j9aP5suFRex8ANvNZlfVH9vq8VA3g0Ht6n05gFK/3R37xQft7WZTV8Pvm01fD8H+&#10;dgGmg/4Xg+Dve/p3+eF9efPQlcftrrIulD4uXHA6lLsGg05QH8uhDB673Quow67q2r7dDO+q9rA0&#10;RLQiYKHCC22+bstjrblA6v44id7/dbDVb09fumC3xkqAJE15wIx/6uqa5i9QK9LndOxvYPb1+KUj&#10;hv3xc1v9tw+a9m5bNg/1z/0RKqM/urf/Wu+GL+2uGeCios5Lpzd96IET3J/+064xVPk4tFq35013&#10;IHQoEjzr6fk+TU/9PAQVGqNcrcJkEVT4KsqzNEn0COXN2Ll67Id/160GKp8+94OZ3TX+0nOztgS/&#10;germsMdE/7gMwuAUqCKyK2EyAZ3JpMiDLWzSS5uI26TzOCtmE87DxMwEnszjgPeb/qTcRvAnYzag&#10;NO8RQsA0mKBPwUwkfWhJTTgqzeaZKS51Wsx7pLjWMhRXW4Ry9E5zwSsueBYLXnHFVagEKK55kQlQ&#10;XPMiFpAc1QWkiKueFPNIERc9F5ZBxEXHJM9ulIhrnglLPOKaF5JPXPI0mdcp4pKLSFxxEclRPBHY&#10;ccXT1bxPK654LLBbOYpHAhJXXETiiueST1zxWNjEK664CiUoLnksLM0Vl1yFwjZecc1jYb+suOZK&#10;CQsh5qKvBKiYi64SQfWYqx4JWsVcdRULWybmsq8ErWJHdiVBcdkjYVXFXrLHXHbRK0f2UNAq4bLH&#10;0mHFZc+FmJA4qgvHVcJVl8JwwkWPJCQuunQ2JFzzYjUfExKueSwsz4RLLh4NCddcgkq55OLZl3LN&#10;JX4p11w6ZVKuuQqF5Zly0UUoLroMxVUXtUq57DKWo7sUrVKuO1Ku2fQuc3SXoDKuuxitMi68kuJx&#10;5igfKcEvrnwiHFyZo3wkhPaMK4/wOHvCZ47wSgjtGRde9IrrrpRAMOfCJ0Jozx3dpbMr57qLUFx2&#10;aTXkXHVpveeO6tLWybnqIpSjugjFVRehHNU51BIV61gelduxYqqeG1sy4a8ARR6VYlRBHdueqjOq&#10;n1CDfTMVXnkDK/pWMMYMkLGuJTHe68YQmYzHyu51Y8hIxpktA183hlBkXHgZU+VC1qhNqIh9y2uq&#10;TrS5H0llWSo/msryVH5ElWWq/KhSuUC+oyLwoUo1gTb3o0qJvzb3o0rZvTb3oxpZqpEfVcrTCR2p&#10;uA/V1bhy/aiuLFUk1V7olioSZy9zSxXJsY85ZcdEFQmwl7mliiTXy9xSRSLrZW6pIln1MrdUYz+q&#10;lJES1cSPKqWd2tyPKuWW2tyPKiWQ2tyPKmWJ2tyPKmWCZI5cz0dIyva0uR9Vyui0uR/V1FJFXubl&#10;jKWK1MvHnJIvcgbplZe5pYoMysvcUkWW5GVuqSIT8jK3VDM/qpTuEFVkND7olNJocz+qlLdocz+q&#10;lJtocz+quaWaO1TNgWlziA7Xw5fX752+fr8nvsgqyoFSj/HP4IS7Y1zIBlv6P9WJx6F9qr+12mI4&#10;3w8XuRXs/HX1eL+rfqn/fGmMytyMpgGomgdN+wPAUbdhrKmNGDhQ7ifTQSFCTT3AQ6No1wHtjje2&#10;Ti67eO4nFwjXFtzzcdDpPtpx3rZ6uW81uAAyi/FiUNMoOb9v+1pre54HS4FqNmgx7fmzwSxjx3wS&#10;1KPVi6+iIgzeILSwlTC16u10HtQs7EyvGj/4lHeZB5paQ1QvcKWYdtmbiw2muofeaCMOZmSm0ez4&#10;a7B5jwl7rpEuLOA3ogQk9JLF6TFizzZaMmZ6vLAL441ZXiO2Cs1qNefS2DqaTlHwbcEtuO4xCzPb&#10;eJXjzpqzM4zrF7Y8C1SUtIOmYP+237zH5OJcow1fOFB8J9PpMWK/2ujvtw1Hud4SE7bdJ27wtjEq&#10;vBpchS6QWeK4TOKS0x0uJMcltr8utgsKQTZ3Y4BFvcdbDSVcFfnDm8CFnz8dIDto7HhPvzOQ9+bU&#10;8FqNkQktCpk08zMa4Z2IY8tFXIB7e4/qTHuEAonB2+pKYRjeOgrpDz8SdlUeB3VnZGy9YmqnLrMq&#10;myU4rlZbAqrQf0fZLoWrgtmtF1vBLAJki9DLa17pdw0K1s60zjbauvuK045+QAS2ybdH/mOjM6DF&#10;nnIA9+R3P5m0wekxYZvszI31hUnjznXo29HRrHU3O7OZn9uIi2hN8Qpwt8voudDqpDUv51NMqrBU&#10;9HYyQQsdX0+qXPPRJ5/Wlz456tq802QgKtS5+ARvJuuidRTCxlsv/Is+4wBSs43d5j2H3wBOlwn/&#10;1dZrYreySMpc350HMEtXIaCy+IefBszsnq/jHNHntovCOx0TYJ0QZctKtXJa8WhG2+Jne98wYq9A&#10;FK7+mKf0yxydM67/9nZFnS8f33R/hHf1Gf10o/rUOpXKb8Nbwu4CHQfFeyLOyZ6dVyQWuHUyu1Hr&#10;Oc7uq61XLE6LMz5PMltuttHd0C9X/t8unMBFKvz1UTbdAGi/z4+4+na/W3/a7fdU+ffdw/3dvgue&#10;Srzlu1PFJ5Pgo4tjtte/RTQtdTMrnFr0OzR6embes9236+94hoZnkHi5tm27PxfBCY8Abxf9/x7L&#10;rl4E+18bPGErsHmxHwf9IU4ySn46/s09/6Z5PNy18A0romwqoN4uhvHPu8E8OsSrP5D93Hw9VmRI&#10;DtKjOLzu00LYl4j0fJB/1lbn15cf/g9QSwMECgAAAAAAh07iQAAAAAAAAAAAAAAAAAYAAABfcmVs&#10;cy9QSwMEFAAAAAgAh07iQIoUZjzRAAAAlAEAAAsAAABfcmVscy8ucmVsc6WQwWrDMAyG74O9g9F9&#10;cZrDGKNOL6PQa+kewNiKYxpbRjLZ+vbzDoNl9LajfqHvE//+8JkWtSJLpGxg1/WgMDvyMQcD75fj&#10;0wsoqTZ7u1BGAzcUOIyPD/szLra2I5ljEdUoWQzMtZZXrcXNmKx0VDC3zUScbG0jB12su9qAeuj7&#10;Z82/GTBumOrkDfDJD6Aut9LMf9gpOiahqXaOkqZpiu4eVQe2ZY7uyDbhG7lGsxywGvAsGgdqWdd+&#10;BH1fv/un3tNHPuO61X6HjOuPV2+6HL8AUEsDBBQAAAAIAIdO4kB+5uUg9wAAAOEBAAATAAAAW0Nv&#10;bnRlbnRfVHlwZXNdLnhtbJWRQU7DMBBF90jcwfIWJU67QAgl6YK0S0CoHGBkTxKLZGx5TGhvj5O2&#10;G0SRWNoz/78nu9wcxkFMGNg6quQqL6RA0s5Y6ir5vt9lD1JwBDIwOMJKHpHlpr69KfdHjyxSmriS&#10;fYz+USnWPY7AufNIadK6MEJMx9ApD/oDOlTrorhX2lFEilmcO2RdNtjC5xDF9pCuTyYBB5bi6bQ4&#10;syoJ3g9WQ0ymaiLzg5KdCXlKLjvcW893SUOqXwnz5DrgnHtJTxOsQfEKIT7DmDSUCayM+6KAU/53&#10;yWw5cuba1mrMm8BNir3hdLG61o5r1zj93/Ltkrp0q+WD6m9QSwECFAAUAAAACACHTuJAfublIPcA&#10;AADhAQAAEwAAAAAAAAABACAAAAABCwAAW0NvbnRlbnRfVHlwZXNdLnhtbFBLAQIUAAoAAAAAAIdO&#10;4kAAAAAAAAAAAAAAAAAGAAAAAAAAAAAAEAAAAOMJAABfcmVscy9QSwECFAAUAAAACACHTuJAihRm&#10;PNEAAACUAQAACwAAAAAAAAABACAAAAAHCgAAX3JlbHMvLnJlbHNQSwECFAAKAAAAAACHTuJAAAAA&#10;AAAAAAAAAAAABAAAAAAAAAAAABAAAAAAAAAAZHJzL1BLAQIUABQAAAAIAIdO4kAJpISR2AAAAAoB&#10;AAAPAAAAAAAAAAEAIAAAACIAAABkcnMvZG93bnJldi54bWxQSwECFAAUAAAACACHTuJA6jnmtpAI&#10;AADFKQAADgAAAAAAAAABACAAAAAnAQAAZHJzL2Uyb0RvYy54bWxQSwUGAAAAAAYABgBZAQAAKQwA&#10;AAAA&#10;" path="m0,98c0,44,43,0,96,0c149,0,192,44,192,98c192,152,149,196,96,196c43,196,0,152,0,98xm167,69c167,69,167,69,167,69c172,70,172,73,168,74c168,74,168,74,101,97c97,99,98,99,94,97c94,97,94,97,59,86c59,86,59,86,98,70c99,69,100,67,99,65c99,65,99,65,99,65c99,63,97,63,95,63c95,63,95,63,49,82c49,82,49,82,49,83c43,87,41,94,40,103c43,104,44,106,44,109c44,112,43,114,41,115c42,130,44,146,31,152c27,150,24,149,20,146c29,134,32,124,34,116c31,114,29,112,29,109c29,106,31,103,34,102c34,94,35,87,42,80c42,80,42,80,26,74c21,73,21,70,26,69c26,69,26,69,93,45c97,44,96,44,101,45c101,45,101,45,167,69xm94,106c94,106,94,106,94,106c98,108,96,108,101,106c101,106,101,106,144,92c144,92,144,92,144,115c144,117,143,120,140,121c113,136,80,136,55,123c54,122,53,120,52,119c54,117,55,114,55,111c55,108,54,105,51,103c51,103,51,103,51,92c51,92,51,92,94,106xm94,106c94,106,94,106,94,106e">
-                <v:path o:connectlocs="0,143827;140652,0;281305,143827;140652,287655;0,143827;244676,101266;244676,101266;246141,108604;147978,142359;137722,142359;86442,126215;143582,102733;145047,95395;145047,95395;139187,92460;71791,120345;71791,121813;58605,151165;64465,159971;60070,168777;45419,223079;29302,214273;49814,170244;42488,159971;49814,149698;61535,117410;38093,108604;38093,101266;136257,66043;147978,66043;244676,101266;137722,155568;137722,155568;147978,155568;210978,135021;210978,168777;205118,177582;80582,180518;76186,174647;80582,162906;74721,151165;74721,135021;137722,155568;137722,155568;137722,155568" o:connectangles="0,0,0,0,0,0,0,0,0,0,0,0,0,0,0,0,0,0,0,0,0,0,0,0,0,0,0,0,0,0,0,0,0,0,0,0,0,0,0,0,0,0,0,0,0"/>
-                <v:fill on="t" focussize="0,0"/>
-                <v:stroke on="f"/>
-                <v:imagedata o:title=""/>
-                <o:lock v:ext="edit" aspectratio="t"/>
+              <v:shape w14:anchorId="3030C4E8" id="Freeform 13" o:spid="_x0000_s1039" style="position:absolute;left:0;text-align:left;margin-left:418.5pt;margin-top:32.25pt;width:22.15pt;height:22.65pt;z-index:251661312;visibility:visible;mso-wrap-style:square;mso-wrap-distance-left:9pt;mso-wrap-distance-top:0;mso-wrap-distance-right:9pt;mso-wrap-distance-bottom:0;mso-position-horizontal:absolute;mso-position-horizontal-relative:text;mso-position-vertical:absolute;mso-position-vertical-relative:page;v-text-anchor:top" coordsize="192,196" o:spt="100" o:gfxdata="UEsDBBQABgAIAAAAIQC2gziS/gAAAOEBAAATAAAAW0NvbnRlbnRfVHlwZXNdLnhtbJSRQU7DMBBF&#10;90jcwfIWJU67QAgl6YK0S0CoHGBkTxKLZGx5TGhvj5O2G0SRWNoz/78nu9wcxkFMGNg6quQqL6RA&#10;0s5Y6ir5vt9lD1JwBDIwOMJKHpHlpr69KfdHjyxSmriSfYz+USnWPY7AufNIadK6MEJMx9ApD/oD&#10;OlTrorhX2lFEilmcO2RdNtjC5xDF9pCuTyYBB5bi6bQ4syoJ3g9WQ0ymaiLzg5KdCXlKLjvcW893&#10;SUOqXwnz5DrgnHtJTxOsQfEKIT7DmDSUCaxw7Rqn8787ZsmRM9e2VmPeBN4uqYvTtW7jvijg9N/y&#10;JsXecLq0q+WD6m8AAAD//wMAUEsDBBQABgAIAAAAIQA4/SH/1gAAAJQBAAALAAAAX3JlbHMvLnJl&#10;bHOkkMFqwzAMhu+DvYPRfXGawxijTi+j0GvpHsDYimMaW0Yy2fr2M4PBMnrbUb/Q94l/f/hMi1qR&#10;JVI2sOt6UJgd+ZiDgffL8ekFlFSbvV0oo4EbChzGx4f9GRdb25HMsYhqlCwG5lrLq9biZkxWOiqY&#10;22YiTra2kYMu1l1tQD30/bPm3wwYN0x18gb45AdQl1tp5j/sFB2T0FQ7R0nTNEV3j6o9feQzro1i&#10;OWA14Fm+Q8a1a8+Bvu/d/dMb2JY5uiPbhG/ktn4cqGU/er3pcvwCAAD//wMAUEsDBBQABgAIAAAA&#10;IQBT5WZ6bQgAAGMpAAAOAAAAZHJzL2Uyb0RvYy54bWzMWtuO2zYQfS/QfxD0WKCxqLuM7AbtpikK&#10;pG2AbD9AluW1UVtSJe16k6/PDC/y0KtZ00Uf+pKs6eHhnENyOEPz7bvnw957qvth1zY3vngT+F7d&#10;VO161zzc+H/df/gx971hLJt1uW+b+sb/Ug/+u9vvv3t77JZ12G7b/bruPQBphuWxu/G349gtF4uh&#10;2taHcnjTdnUDX27a/lCO8LF/WKz78gjoh/0iDIJ0cWz7dde3VT0M0PpefenfSvzNpq7GPzeboR69&#10;/Y0Pvo3y317+u8J/F7dvy+VDX3bbXaXdKP+FF4dy18CgE9T7ciy9x373Auqwq/p2aDfjm6o9LNrN&#10;ZlfVkgOwEcEZm8/bsqslFxBn6CaZhv8Otvrj6XP3qUfXh+5jW/09eE17ty2bh/qnoQP5YFJ9aPpl&#10;vRs/tbtmhLEFqrY4dsNy6o0fBsDxVsff2zXMc/k4tlKQ501/QHSg6j1L3b9MutfPo1dBY5iLKEh8&#10;r4KvwjxLk0SOUC5N5+pxGH+tWwlUPn0cRjVta/hLir72mvIAo97DFG8Oe5jBHxZe4B09UYR6iicT&#10;oDOZFLm3BZv03CakNuk8TkRsgnmYmJiAJ/M4wPuiPym1YfzJiA1QmvcIduM0GKNPQUw4fQTVWaTZ&#10;PDNBpU6LeY8E1ZqHomqzUJbeac54RQXPYsYrqrgIBANFNS8yBopqXsQMkqU6gxRS1ZNiHimkoufM&#10;Mgip6DDJsxslpJpnzBIPqeYF5xOVPE3mdQqp5CwSVZxFshRPGHZU8TSa9ymiiscMu8hSPGSQqOIs&#10;ElU853yiisfMJo6o4iLgoKjkMbM0Iyq5CJhtHFHNY2a/RFRzIZiFEFPRIwYqpqKLhFE9pqqHjFYx&#10;VV3EzJaJqewRo1VsyS44KCp7yKyq2En2mMrOemXJHjBaJVT2mDusqOw5ExMSS3XmuEqo6lwYTqjo&#10;IYdERefOhoRqXkTzMSGhmsfM8kyo5OzRkFDNOaiUSs6efSnVnOOXUs25UyalmouAWZ4pFZ2FoqLz&#10;UFR1VquUys5jWbpz0SqlukPKNZveZZbuHFRGdWejVUaFF1w8zizlQ8H4RZVPmIMrs5QPmdCeUeUh&#10;PM6e8JklvGBCe0aFZ72iugvBEMyp8AkT2nNLd+7syqnuLBSVnVsNOVWdW++5pTq3dXKqOgtlqc5C&#10;UdVZKEt1CrWAUtSUR+XWVEzVc6NLJvjLgyIPSzGsoLp2wOoM6yeowe5VhVcuwQq/ZYxhBtA40sXa&#10;68YgMhqbyu51Y5ARjTMnZBAKjQsnY6xc0BpqEyxiL1HE6kSau5EUmqVwoyk0T+FGVGimwo0qlgvo&#10;O1QELlSxJpDmblQx8ZfmblQxu5fmblRDTTV0o4p5OqJDKu5CNTIr141qpKlCUu2ErqlC4uxkrqlC&#10;cuxijtkxUoUE2MlcU4Uk18lcU4VE1slcU4Vk1clcU43dqGJGilQTN6qYdkpzN6qYW0pzN6qYQEpz&#10;N6qYJUpzN6qYCaI55HouQmK2J83dqGJGJ83dqKaaKuRlTs5oqpB6uZhj8oXOQHrlZK6pQgblZK6p&#10;QpbkZK6pQibkZK6pZm5UMd1BqpDRuKBjSiPN3ahi3iLN3ahibiLN3ajmmmpuUVUHps4hergePr9X&#10;730P7tVXyBeyinLE1MP86R3h7hguZL0t/p/KxOPQPtX3rbQYT/fDRa4FO31dPa521c/115fGUJmr&#10;0SQAVvNAU9/sd7INxprakIEFZX9SHQREqKkH8JAo0nWAtsczrZPLNp79yQaCawvquRl0uo+2nNet&#10;Tu5rDc6A1GI8G1Q1cs7v26GW2p7mQVPAmg20mPb8yWCWsWU+CerQ6sRXYBEG3kBoISthapXb6TSo&#10;WtiZXDVu8CntMg80tQZQvYArxbTLLi42MJU95EYzODAjM41qx1+DTXtM2HONeGEBfkOUAAmdZLF6&#10;GOzZRk1GTY8TdqG8UcvLYItArVZ1LplWYzpFwcuCa3DZYxZmtvEqx601p2cYrl/I8iygosQdNAX7&#10;y37THpOLc406fMGB4jqZVg+D/Wqju986HOVyS0zYep/YwVvHqOBqcBHYQGqJw2USlRzvcEFyuMR2&#10;10V3gUKQzJ0JsFDv0VZFCa6K3OFV4IKfPy0gPWhseY+/M6D36tRwWo2hCi0CMmnipy7d8LyhrVp7&#10;NagbvNpIAgokAqSrKwHD0FYjpHuAMYRtlaEklDLYM2Jar5jaqcusymoJmtWqS0ARuO8o3aWwVVC7&#10;9WwrqEUA2SLo5SQ8/q6Bwdqa1tlGXXdfcdrhD4iArfJtw980WgNq7CkHsE9++5NKG6weE7bKzuxY&#10;X6g07lSHXo6Oaq3b2ZnO/OxGuIiWFK8At7sYz5lWK615OZ9sUgVLRa5sFbSg4+tJlW1ufHJpfemT&#10;pa7OO1UGIgKZi0/warLOWo0QOt464Z/1MQNwzTp2q/ccbgNYXSb8V1uvid1CIwlhHWzCHA5w/0bi&#10;H/w0oGb3dB1niT63XYRQu0BEVojSZeVZKzyakasHfrZ3DSP6CkTA1R/xFH+Zw3PG9l/frojT5eNF&#10;9w28rY/x047qU+tUKl+G14TtBWoGhfdElJM+O69ILODWSe1GqadZPq+2XrE4NY55nqS23GyjvaFf&#10;rvz/XTgBF7Hwl0fZdAMg/T494hra/W79YbffY+U/9A+ru33vPZXwSO9OFB9Ugg9dLLO9/C2iabGb&#10;WuHYIt+h4dMzfPI3LMfn1bO3W8PylWELm1bt+gu8TINHivCYbdv2X33vCA/+bvzhn8eyr31v/1sD&#10;r9oK2M+wRUf5IU4yvD7v6Tcr+k3zeLhrwV1YJGVTAeqNP5o/70b1wBBe+AH/j83nrkJD9Bn9gZd8&#10;Uhv96hCfCtLP0ur0NvL2GwAAAP//AwBQSwMEFAAGAAgAAAAhAEfQNVfeAAAACgEAAA8AAABkcnMv&#10;ZG93bnJldi54bWxMj01PhDAQhu8m/odmTLy5Zb+wImVDTCTejKveuzACWToltCzw7x1P7nEyT973&#10;edPDbDtxwcG3jjSsVxEIpNJVLdUavj5fHxQIHwxVpnOEGhb0cMhub1KTVG6iD7wcQy04hHxiNDQh&#10;9ImUvmzQGr9yPRL/ftxgTeBzqGU1mInDbSc3URRLa1rihsb0+NJgeT6OVsP7W/ydb6Z8dmNd7Iti&#10;t7izXbS+v5vzZxAB5/APw58+q0PGTic3UuVFp0FtH3lL0BDv9iAYUGq9BXFiMnpSILNUXk/IfgEA&#10;AP//AwBQSwECLQAUAAYACAAAACEAtoM4kv4AAADhAQAAEwAAAAAAAAAAAAAAAAAAAAAAW0NvbnRl&#10;bnRfVHlwZXNdLnhtbFBLAQItABQABgAIAAAAIQA4/SH/1gAAAJQBAAALAAAAAAAAAAAAAAAAAC8B&#10;AABfcmVscy8ucmVsc1BLAQItABQABgAIAAAAIQBT5WZ6bQgAAGMpAAAOAAAAAAAAAAAAAAAAAC4C&#10;AABkcnMvZTJvRG9jLnhtbFBLAQItABQABgAIAAAAIQBH0DVX3gAAAAoBAAAPAAAAAAAAAAAAAAAA&#10;AMcKAABkcnMvZG93bnJldi54bWxQSwUGAAAAAAQABADzAAAA0gsAAAAA&#10;" adj="-11796480,,5400" path="m,98c,44,43,,96,v53,,96,44,96,98c192,152,149,196,96,196,43,196,,152,,98xm167,69v,,,,,c172,70,172,73,168,74v,,,,-67,23c97,99,98,99,94,97v,,,,-35,-11c59,86,59,86,98,70v1,-1,2,-3,1,-5c99,65,99,65,99,65v,-2,-2,-2,-4,-2c95,63,95,63,49,82v,,,,,1c43,87,41,94,40,103v3,1,4,3,4,6c44,112,43,114,41,115v1,15,3,31,-10,37c27,150,24,149,20,146v9,-12,12,-22,14,-30c31,114,29,112,29,109v,-3,2,-6,5,-7c34,94,35,87,42,80v,,,,-16,-6c21,73,21,70,26,69v,,,,67,-24c97,44,96,44,101,45v,,,,66,24xm94,106v,,,,,c98,108,96,108,101,106v,,,,43,-14c144,92,144,92,144,115v,2,-1,5,-4,6c113,136,80,136,55,123v-1,-1,-2,-3,-3,-4c54,117,55,114,55,111v,-3,-1,-6,-4,-8c51,103,51,103,51,92v,,,,43,14xm94,106v,,,,,e" fillcolor="#c19f67" stroked="f">
+                <v:stroke joinstyle="miter"/>
+                <v:formulas/>
+                <v:path arrowok="t" o:connecttype="custom" o:connectlocs="0,143828;140653,0;281305,143828;140653,287655;0,143828;244677,101266;244677,101266;246142,108604;147978,142360;137722,142360;86443,126216;143583,102734;145048,95396;145048,95396;139187,92461;71791,120345;71791,121813;58605,151166;64466,159971;60070,168777;45419,223079;29303,214274;49814,170245;42489,159971;49814,149698;61535,117410;38093,108604;38093,101266;136257,66043;147978,66043;244677,101266;137722,155569;137722,155569;147978,155569;210979,135022;210979,168777;205118,177583;80582,180518;76187,174648;80582,162907;74722,151166;74722,135022;137722,155569;137722,155569;137722,155569" o:connectangles="0,0,0,0,0,0,0,0,0,0,0,0,0,0,0,0,0,0,0,0,0,0,0,0,0,0,0,0,0,0,0,0,0,0,0,0,0,0,0,0,0,0,0,0,0" textboxrect="0,0,192,196"/>
+                <o:lock v:ext="edit" aspectratio="t" verticies="t"/>
+                <v:textbox>
+                  <w:txbxContent>
+                    <w:p>
+                      <w:pPr>
+                        <w:jc w:val="center"/>
+                      </w:pPr>
+                    </w:p>
+                  </w:txbxContent>
+                </v:textbox>
+                <w10:wrap anchory="page"/>
               </v:shape>
             </w:pict>
           </mc:Fallback>
@@ -1875,7 +1893,7 @@
         <mc:AlternateContent>
           <mc:Choice Requires="wps">
             <w:drawing>
-              <wp:anchor distT="0" distB="0" distL="114300" distR="114300" simplePos="0" relativeHeight="251660288" behindDoc="0" locked="0" layoutInCell="1" allowOverlap="1" wp14:anchorId="1F38D7BA" wp14:editId="62B8B2EA">
+              <wp:anchor distT="0" distB="0" distL="114300" distR="114300" simplePos="0" relativeHeight="251660288" behindDoc="0" locked="0" layoutInCell="1" allowOverlap="1" wp14:anchorId="1F38D7BA" wp14:editId="0B5E1280">
                 <wp:simplePos x="0" y="0"/>
                 <wp:positionH relativeFrom="column">
                   <wp:posOffset>5762625</wp:posOffset>
@@ -1884,7 +1902,7 @@
                   <wp:posOffset>409575</wp:posOffset>
                 </wp:positionV>
                 <wp:extent cx="280035" cy="287655"/>
-                <wp:effectExtent l="0" t="0" r="0" b="0"/>
+                <wp:effectExtent l="0" t="0" r="5715" b="0"/>
                 <wp:wrapNone/>
                 <wp:docPr id="9" name="Freeform 9"/>
                 <wp:cNvGraphicFramePr>
@@ -2504,6 +2522,15 @@
                           <a:noFill/>
                         </a:ln>
                       </wps:spPr>
+                      <wps:txbx>
+                        <w:txbxContent>
+                          <w:p>
+                            <w:pPr>
+                              <w:jc w:val="center"/>
+                            </w:pPr>
+                          </w:p>
+                        </w:txbxContent>
+                      </wps:txbx>
                       <wps:bodyPr vert="horz" wrap="square" lIns="91440" tIns="45720" rIns="91440" bIns="45720" numCol="1" anchor="t" anchorCtr="0" compatLnSpc="1"/>
                     </wps:wsp>
                   </a:graphicData>
@@ -2511,14 +2538,23 @@
               </wp:anchor>
             </w:drawing>
           </mc:Choice>
-          <mc:Fallback xmlns:wpsCustomData="http://www.wps.cn/officeDocument/2013/wpsCustomData">
+          <mc:Fallback>
             <w:pict>
-              <v:shape id="Freeform 9" o:spid="_x0000_s1026" o:spt="100" style="position:absolute;left:0pt;margin-left:453.75pt;margin-top:32.25pt;height:22.65pt;width:22.05pt;mso-position-vertical-relative:page;z-index:251660288;mso-width-relative:page;mso-height-relative:page;" fillcolor="#C19F67" filled="t" stroked="f" coordsize="191,196" o:gfxdata="UEsDBAoAAAAAAIdO4kAAAAAAAAAAAAAAAAAEAAAAZHJzL1BLAwQUAAAACACHTuJAiQlcNtoAAAAK&#10;AQAADwAAAGRycy9kb3ducmV2LnhtbE2PwU7DMAyG70i8Q2QkbiwpYmUtTXeAgRATBwZCHL3WtN2a&#10;pErSdXt7zAlOluVP//+5WB5NLw7kQ+eshmSmQJCtXN3ZRsPH++PVAkSIaGvsnSUNJwqwLM/PCsxr&#10;N9k3OmxiIzjEhhw1tDEOuZShaslgmLmBLN++nTcYefWNrD1OHG56ea1UKg12lhtaHOi+pWq/GQ2X&#10;fK1OPrw+jy8Bp2G12++ePtcPWl9eJOoORKRj/IPhV5/VoWSnrRttHUSvIVO3c0Y1pDc8GcjmSQpi&#10;y6TKFiDLQv5/ofwBUEsDBBQAAAAIAIdO4kAF+Q4i0QkAAJM1AAAOAAAAZHJzL2Uyb0RvYy54bWzF&#10;W12P27oRfS/Q/yD4sUBj0ZYteZHNRbtpigJpGyDpD9DK8tqoLbmS9iP3198ZckQNtRp7XBToS2LT&#10;w8M5h6Mhh1x9/OXtdIxeyqY91NX9zHyIZ1FZFfX2UD3dz/7148sfs1nUdnm1zY91Vd7Pfpbt7JdP&#10;v//dx9fzXbmo9/VxWzYRgFTt3ev5frbvuvPdfN4W+/KUtx/qc1nBj7u6OeUdfG2e5tsmfwX003G+&#10;iOP1/LVutuemLsq2hdbP7scZITYawHq3OxTl57p4PpVV51Cb8ph3QKndH87t7JP1drcri+6fu11b&#10;dtHxfgZMO/svDAKfH/Hf+aeP+d1Tk5/3h4JcyDUujDid8kMFg3qoz3mXR8/N4R3U6VA0dVvvug9F&#10;fZo7IlYRYGHikTbf9/m5tFxA6vbsRW//d7DFP16+NdFhez/bzKIqP8GEf2nKEqcv2qA6r+f2Doy+&#10;n781yK89f62Lf7dRVT/s8+qp/FN7Bo0hjqB3/ZftoftWH6oOHDTYeR70xi8t4ESPr3+vtzBS/tzV&#10;VrW3XXNCdNAjerOT89NPTvnWRQU0LrI4Xq5mUQE/LbJ0vVrZEfK7vnPx3HZ/LWsLlL98bTs3t1v4&#10;ZGdmS/x+wNzvTkeY5j/Mozh6jczGOguT502AjjfZZNEebNYUK95mwW3W0zhLZhNPwyTMBDyZxgHe&#10;V/1ZcxvBn5TZAKVpjyAB+MEEfSBYvImkj+E6Z8k0McOVNvFq2iPDtRahuNgm3ghQXO8sE7ziehuz&#10;FKC44iZeCFiB5iIWFx11mA5LrrtIccGFF7EWKuUXXHmR4yKU3kzrtdBIvwikjyUoLr0UEItAeSm2&#10;Flz5VJjEBRd+LcTDMtDdpNNzuOS6i1CB7IkExWUXobjqZiUkGMys/oleCxlvyVWXobjs8IRNJs8l&#10;V90YIV0tuewmFnRPQt2FlJVw3WWsQHgjYXHhN0KmSQLhpUc64cJLGTnhwmdCjCZcdxGJ655upkM0&#10;4bJL9FZcdQlppRJ9xUVPhZVixTUX52/FRU+E6YOtwxDsUoSuuOYiEtd8LQTCimueLKc1X3HNpWd5&#10;HWguxMGaay4icclxJZlcb9ZccxGKS26MkKvWXHMRimtujLA6r7noK2FbteaiGyOkvTVXPRF2H2mg&#10;uuBUylUXkbjq0lqTctEleikXXUTSaJ5yzTNBp5RLLs1eyiUXkbjiK2kHyhXPhCcm44qvFtPrTMYV&#10;N7EQnFkguQTFJRcfmYxrLvLjmstQGtEzLrq4Jmdc9Y1AcMNVN9LaB8XSkDxNLKzvm0B3EYvrLu6z&#10;N6Hwwt54w4U3RsjFUMYN3ksbxw0XXobiymfCUrPhwosMTcyll7BMrJIedumMo7RywQrKrKSQMDHX&#10;XsYKtE+Ep9rEXPxEWOfhIWWOYURPbiAh8rgZZNzJFQweLm4mogXFqvgYwTrC0aQ0b4J69QKaagoM&#10;n4ILYHwOxPk0fAougPE54GBzPCWhE5V83x+yFG8VtcGnCM6F8PQGD13OdYsHOnjkAsc2P9yhUH4H&#10;VvirYAzhi8ZLOt+5bAzioHF/GHTZGMijcapChvhCY3sKBrQvI2P8oDUECJ57XTUnjkZHEkPAouto&#10;4iRbcx1RQ0yNjioeLyA6HCBoqOIJgjXXUcVDAmuuo7ogqlDrq5whqlDPa8yxokdnoGZXmfeRq6O6&#10;JKpQe6vQiepSRxUrbOu7jioW0WgOZbLGmYSoJjqqWAtbdB1VrHetuY5qQlShbtX4jpUrokNxqjIn&#10;qlCAqsyJqj+fvpw4sMy0zuioYi1pzXVUsWBEc6gJNb6viSrUfSpzogq1ncqcqEL9pjInqlCjacyx&#10;SkOqUIipzIkqVFsqc6Ka6qhiUWWd0VHFysma66hmRBUqII3vWAMhOlQ5KnOiCpWMypyoZjqqWK9Y&#10;Z3RUsSZBc3dFc3VdxbLDmuuoYmVhzXVUsXiw5jqqG6IKNYBGSFsEIDzu83UdiC3u5XUdiC9cCig7&#10;EGPclOtGIM6471Z1GDZOStK4t7YqafdOfvNklKT99skEpF3w0T63gVvP8Z1yY++UH5E37HzzDrfH&#10;/cfoFa5EsXTe4/9ruzk+1S/lj9padMO1J0SNE274uXh+PBR/Ln99bwzrqhvNAsBijNLQrfbZtlHM&#10;2jZkEECF31wHg6e/YxTrOjSG4/Wt3uUQL/xG6KgBABk482We94P6a9bAeWpVuU8ajIBcFhkN6hol&#10;5491W1oPh3lwTmXuIRqeocFginFoDoFhp+VKq394rk5XD+SC28O7xxAOHLjKlHupVSVn2OUyvD14&#10;wLkdnsyr7tszgaFPPwCKa8PEpRGhWcVAB/V+BJ8sFBx6Z20KG6BcpqJ0LjQrOWig+hH6ORuWkasU&#10;8AAUZ8F18UBBpE+3vvdffHBSR8JvLi8/N4F1P/ZkI9w5WO89cPgYht8oDQVdevQQyLfixRqIcws8&#10;3mj5Lh4Ib8Ow1Wb46db3cgZzR94rgMbwEBRuWQnlCL+F8K7LNJBvpcWSbUEChyfxwz4C1NBMyXvY&#10;5ChGCPoIUOPmYZ+mHgAOnfkqRlkL1lyxVTfBCqDee9rduzFV6FQ+hF6mbtV3GvTYQaMKO+gxCTNq&#10;vCVwCJy6TAP51j53+a3x1UnFOzWbBINFc7qVjktueKqCHr2XlxqHuveq5wQD5TuLO9oJubTlB3SJ&#10;/oZcdh2mxw6S8/toEdcFe0bvsyV0vLwwhOb94EJrkOff+xQo+18sDXR0CidK6uRKXUY7abxYAAng&#10;r0HYDNrrBt+q9P46UC8ZnTq4MVXoNMNwPMe8pEangcd2C+ANwlyHGWHfEMNBZE7C9I14qcxDMVy/&#10;wm8uXoIekzCjRjjx0wYLYYe1Eu3VLjSq5vI6TO+3vZEDUdyIKnC4PbY6hk72z6hTYIB3S88NumiA&#10;xvBSuMhpiXZZcKbk5utKWgrM/ejTrSQPXmJqY6GXlPr4AUKod8231GI9lLsI8lB9LXaxWRcWKqh+&#10;YF/a3lAN074vdJU2PONquLfV7xA0QN77fguqn+Ie3kXFNFDfSku+D84wNYXfXKIKekzCjBqNy/Oq&#10;mSXw0QkLXfvAPTNfMMJWHTxtzS4B9d4b/JNKSFc0qgofbVkfD9U3j9blsPm2ES5CjQeWpvf/krSI&#10;9aRPoAGeeNqrb3/0aYUZXspo6+Nh++VwPOKRZ9s8PT4cm+glhzdzHszmi78VCsyO9g8Fqhq7uUyJ&#10;Lfa9EnyVxL2f8lhvf8JrJfBSE7yJsq+bX2fRK7zScz9r//OcN+UsOv6tgldSNibBMO3sl2SV4kV2&#10;w3955L9Uz6eHGnyDwMirAlDvZ13/8aFzrxDBOzxA9mv1/VygITqIL7nAuzpWCHqvCF8G4t+t1fAu&#10;1affAFBLAwQKAAAAAACHTuJAAAAAAAAAAAAAAAAABgAAAF9yZWxzL1BLAwQUAAAACACHTuJAihRm&#10;PNEAAACUAQAACwAAAF9yZWxzLy5yZWxzpZDBasMwDIbvg72D0X1xmsMYo04vo9Br6R7A2IpjGltG&#10;Mtn69vMOg2X0tqN+oe8T//7wmRa1IkukbGDX9aAwO/IxBwPvl+PTCyipNnu7UEYDNxQ4jI8P+zMu&#10;trYjmWMR1ShZDMy1lletxc2YrHRUMLfNRJxsbSMHXay72oB66Ptnzb8ZMG6Y6uQN8MkPoC630sx/&#10;2Ck6JqGpdo6SpmmK7h5VB7Zlju7INuEbuUazHLAa8CwaB2pZ134EfV+/+6fe00c+47rVfoeM649X&#10;b7ocvwBQSwMEFAAAAAgAh07iQH7m5SD3AAAA4QEAABMAAABbQ29udGVudF9UeXBlc10ueG1slZFB&#10;TsMwEEX3SNzB8hYlTrtACCXpgrRLQKgcYGRPEotkbHlMaG+Pk7YbRJFY2jP/vye73BzGQUwY2Dqq&#10;5CovpEDSzljqKvm+32UPUnAEMjA4wkoekeWmvr0p90ePLFKauJJ9jP5RKdY9jsC580hp0rowQkzH&#10;0CkP+gM6VOuiuFfaUUSKWZw7ZF022MLnEMX2kK5PJgEHluLptDizKgneD1ZDTKZqIvODkp0JeUou&#10;O9xbz3dJQ6pfCfPkOuCce0lPE6xB8QohPsOYNJQJrIz7ooBT/nfJbDly5trWasybwE2KveF0sbrW&#10;jmvXOP3f8u2SunSr5YPqb1BLAQIUABQAAAAIAIdO4kB+5uUg9wAAAOEBAAATAAAAAAAAAAEAIAAA&#10;AEQMAABbQ29udGVudF9UeXBlc10ueG1sUEsBAhQACgAAAAAAh07iQAAAAAAAAAAAAAAAAAYAAAAA&#10;AAAAAAAQAAAAJgsAAF9yZWxzL1BLAQIUABQAAAAIAIdO4kCKFGY80QAAAJQBAAALAAAAAAAAAAEA&#10;IAAAAEoLAABfcmVscy8ucmVsc1BLAQIUAAoAAAAAAIdO4kAAAAAAAAAAAAAAAAAEAAAAAAAAAAAA&#10;EAAAAAAAAABkcnMvUEsBAhQAFAAAAAgAh07iQIkJXDbaAAAACgEAAA8AAAAAAAAAAQAgAAAAIgAA&#10;AGRycy9kb3ducmV2LnhtbFBLAQIUABQAAAAIAIdO4kAF+Q4i0QkAAJM1AAAOAAAAAAAAAAEAIAAA&#10;ACkBAABkcnMvZTJvRG9jLnhtbFBLBQYAAAAABgAGAFkBAABsDQAAAAA=&#10;" path="m0,98c0,44,43,0,96,0c149,0,191,44,191,98c191,152,149,196,96,196c43,196,0,152,0,98xm84,105c84,105,84,105,84,109c84,115,88,113,88,113c88,113,88,113,102,113c106,113,105,109,105,109c105,109,105,109,105,105c105,101,102,101,102,101c102,101,102,101,88,101c83,101,84,105,84,105xm72,63c72,63,72,63,117,63c117,63,117,63,147,63c152,63,151,68,151,68c151,68,151,68,151,88c151,88,151,88,116,103c116,103,116,103,110,103c110,103,110,103,110,99c110,95,105,96,105,96c105,96,105,96,82,96c80,96,79,99,79,99c79,99,79,99,79,103c79,103,79,103,74,103c74,103,74,103,40,88c40,88,40,88,40,69c40,62,43,63,43,63c43,63,43,63,72,63xm109,63c109,63,109,63,117,63c117,63,117,63,118,50c118,44,111,45,111,45c111,45,111,45,78,45c72,46,72,50,72,50c72,50,72,50,72,63c72,63,72,63,81,63c81,63,81,63,81,56c81,52,83,52,83,52c83,52,83,52,107,52c110,52,109,56,109,56c109,56,109,56,109,63xm151,92c151,92,151,92,110,108c110,108,110,108,110,113c110,119,105,119,105,119c105,119,105,119,84,119c80,119,80,113,80,113c80,113,80,113,80,108c80,108,80,108,40,92c40,92,40,92,40,146c40,152,44,151,44,151c44,151,44,151,145,151c151,151,151,145,151,145c151,145,151,145,151,92xm151,92c151,92,151,92,151,92e">
-                <v:path o:connectlocs="0,143827;140750,0;280035,143827;140750,287655;0,143827;123156,154100;123156,159971;129021,165841;149547,165841;153945,159971;153945,154100;149547,148230;129021,148230;123156,154100;105562,92460;171539,92460;215524,92460;221388,99798;221388,129151;170073,151165;161276,151165;161276,145295;153945,140892;120224,140892;115825,145295;115825,151165;108495,151165;58646,129151;58646,101266;63044,92460;105562,92460;159810,92460;171539,92460;173005,73381;162742,66043;114359,66043;105562,73381;105562,92460;118758,92460;118758,82187;121690,76316;156878,76316;159810,82187;159810,92460;221388,135021;161276,158503;161276,165841;153945,174647;123156,174647;117292,165841;117292,158503;58646,135021;58646,214273;64510,221611;212592,221611;221388,212805;221388,135021;221388,135021;221388,135021" o:connectangles="0,0,0,0,0,0,0,0,0,0,0,0,0,0,0,0,0,0,0,0,0,0,0,0,0,0,0,0,0,0,0,0,0,0,0,0,0,0,0,0,0,0,0,0,0,0,0,0,0,0,0,0,0,0,0,0,0,0,0"/>
-                <v:fill on="t" focussize="0,0"/>
-                <v:stroke on="f"/>
-                <v:imagedata o:title=""/>
-                <o:lock v:ext="edit" aspectratio="t"/>
+              <v:shape w14:anchorId="1F38D7BA" id="Freeform 9" o:spid="_x0000_s1040" style="position:absolute;left:0;text-align:left;margin-left:453.75pt;margin-top:32.25pt;width:22.05pt;height:22.65pt;z-index:251660288;visibility:visible;mso-wrap-style:square;mso-wrap-distance-left:9pt;mso-wrap-distance-top:0;mso-wrap-distance-right:9pt;mso-wrap-distance-bottom:0;mso-position-horizontal:absolute;mso-position-horizontal-relative:text;mso-position-vertical:absolute;mso-position-vertical-relative:page;v-text-anchor:top" coordsize="191,196" o:spt="100" o:gfxdata="UEsDBBQABgAIAAAAIQC2gziS/gAAAOEBAAATAAAAW0NvbnRlbnRfVHlwZXNdLnhtbJSRQU7DMBBF&#10;90jcwfIWJU67QAgl6YK0S0CoHGBkTxKLZGx5TGhvj5O2G0SRWNoz/78nu9wcxkFMGNg6quQqL6RA&#10;0s5Y6ir5vt9lD1JwBDIwOMJKHpHlpr69KfdHjyxSmriSfYz+USnWPY7AufNIadK6MEJMx9ApD/oD&#10;OlTrorhX2lFEilmcO2RdNtjC5xDF9pCuTyYBB5bi6bQ4syoJ3g9WQ0ymaiLzg5KdCXlKLjvcW893&#10;SUOqXwnz5DrgnHtJTxOsQfEKIT7DmDSUCaxw7Rqn8787ZsmRM9e2VmPeBN4uqYvTtW7jvijg9N/y&#10;JsXecLq0q+WD6m8AAAD//wMAUEsDBBQABgAIAAAAIQA4/SH/1gAAAJQBAAALAAAAX3JlbHMvLnJl&#10;bHOkkMFqwzAMhu+DvYPRfXGawxijTi+j0GvpHsDYimMaW0Yy2fr2M4PBMnrbUb/Q94l/f/hMi1qR&#10;JVI2sOt6UJgd+ZiDgffL8ekFlFSbvV0oo4EbChzGx4f9GRdb25HMsYhqlCwG5lrLq9biZkxWOiqY&#10;22YiTra2kYMu1l1tQD30/bPm3wwYN0x18gb45AdQl1tp5j/sFB2T0FQ7R0nTNEV3j6o9feQzro1i&#10;OWA14Fm+Q8a1a8+Bvu/d/dMb2JY5uiPbhG/ktn4cqGU/er3pcvwCAAD//wMAUEsDBBQABgAIAAAA&#10;IQBxkUujsAkAADM1AAAOAAAAZHJzL2Uyb0RvYy54bWzEW22P4zYO/n5A/4ORjwd0YzmO7Qx2trib&#10;dosDti/A7v0Aj+NMgiZ2ansms/vrS+rNVMZMmOKA+zITM9Qj8hFFiVL8/ofXwz56qbt+1zb3M/Uu&#10;nkV1U7XrXfN0P/vvl4/fF7OoH8pmXe7bpr6ffa372Q8fvvvH+9Pxrk7abbtf110EIE1/dzrez7bD&#10;cLybz/tqWx/K/l17rBv4ctN2h3KAx+5pvu7KE6Af9vMkjrP5qe3Wx66t6r4H6Y/my9kHjb/Z1NXw&#10;22bT10O0v5+BbYP+2+m/j/h3/uF9effUlcftrrJmlH/DikO5a6BTD/VjOZTRc7d7A3XYVV3bt5vh&#10;XdUe5u1ms6tq7QN4o+Izbz5vy2OtfQFy+qOnqf/fwVa/vnw+/t6h6f3xU1v90UdN+7Atm6f6X/0R&#10;6INBnYHop/Vu+L3dNQP0rZC1+enY3/nW+NADTvR4+qVdwziXz0OrCXnddAdEB1ejV837V897/TpE&#10;FQiTIo4Xy1lUwVdJkWfLpe6hvHONq+d++LluNVD58qkfzLCt4ZMmfR015QF6/QJDvDnsYQT/OY/i&#10;6BSplTYWxsWrgDteZVVEW9DJbBh4nYTqZNM4C6ITT8OkRAUsmcYBv6/ak1Edxp6c6IBL0xbBbPSd&#10;MfysiArHj6I8F+m0Y4oyreLltEWKcs1CUbJVvGKgKN9FwVhF+VZqwUBRxlWcMFgB5ywWJR15mA5L&#10;yjvrYkKJZ7ESEfMJZZ71MQmpV9N8JRLqk4D6mIOi1HMBkQTMc7GVUOZzZhATSnzGxMMi4F3l02O4&#10;oLyzUAHtKQdFaWehKOtqySQYzKx+0mdMxltQ1nkoSjvMsMnkuaCsK8WkqwWlXcUM72nIO5OyUso7&#10;jxUQrzgsSvyKyTRpQDw3pVNKPJeRU0p8wcRoSnlnkSjv+Wo6RFNKO+fekrLOIS1FpC8p6TmzUiwp&#10;5+z4LSnpKTN8sHUYg52L0CXlnEWinGdMICwp5+limvMl5Zyby1nAORMHGeWcRaKU40oyud5klHMW&#10;ilKuuLSXUc5ZKMq5UszqnFHSl8y2KqOkK8WkvYyynjK7jzxgnTEqp6yzSJR1bq3JKemcezklnUWS&#10;cJ5TzguGp5xSzo1eTilnkSjjS24HShkvmBlTUMaXyfQ6U1DGVcwspEVAOQdFKWenTEE5Z/2jnPNQ&#10;EtILSjq7JheU9RXj4Iqyrri1D4qlMXmqmFnfVwHvLBblnd1nr0Limb3xihKvFJOLoYwbrec2jitK&#10;PA9FmS+YpWZFiWc9VDGlnsNSsYh62KUTH7mVC1ZQosWFhIop9zxWwH3KzGoVU/JTZp2HSUoMw4ie&#10;3EBC5FE1yLiTKxhMLqrGogXFKjuNYB2haFyaV0G9egFNNASKDsEFMDoG7HgqOgQXwOgYULA5npLY&#10;E5Vy6w5ZqtfGyuBTBOdCeHqDhy7HtscDHTxygWObL+ZQqLwDLfyWUYbwReWFPd+5rAzkoLI7DLqs&#10;DM6jci5ChvhC5ZVIGeMHtSFA8NzrmosYIFpd5iSGgFaXuYmDrNVljirrqZK5iscLiA4HCBJX8QRB&#10;q8tcxUMCrS5zNbGuQq0vMsa6CvW8RB0rejQGanaRuotcmasL6yrU3iJ06+pC5ipW2Np2matYRKM6&#10;lMkSY1LraipzFWthjS5zFetdrS5zNbWuQt0qsR0rV0SH4lSkbl2FAlSkbl3159OXUxKWmdoYmatY&#10;S2p1matYMKI61IQS2zPrKtR9InXrKtR2InXrKtRvInXrKtRoEnWs0tBVKMRE6tZVqLZE6tbVXOYq&#10;FlXaGJmrWDlpdZmrhXUVKiCJ7VgDITpUOSJ16ypUMiJ162ohcxXrFW2MzFWsSVDdXNFcXVex7NDq&#10;MlexstDqMlexeNDqMldX1lWoASRE6iIA4XGfL2tgvcW9vKyB9RcuBYQNrMe4KZf1YH3Gfbeowbhx&#10;Ejrtt05K6LTfPCmh0377pAKnTfDZfW4Ht57n18XdLILr4kf0G3a+5YDbY/cxOsGVKJbOW/yf6c3x&#10;oX2pv7RaYxivPSFqDHHj19Xz4676d/3trTKsq6Y3DQCLMcanvbA+apmNWS1DDwKo8Mk0UHj6e46i&#10;TQdh2J+TepNDvPDJoiMHAKTgzJdY7jr116yB8VYqMt9ycAZksshZp0bIGb9v+1pbOI6DMaowk2ic&#10;Q6PClMehOgSGHpYrUj95rg6XAzLB7eHNNIQDB8qyzb1WKqIzbHIZXh884NiOM/Oq+fpMYGzjOkBy&#10;dZiYNMKIRR7IoN724JOFwAdnrE5hI5RJzzadM2KhDxIo14Mbs3EZueoCHoDiKJgmHiiI9GnpW/vZ&#10;iZMbJ/zm8vK8CbRd35NCuHPQ1nvgcBqGTzYNBU0cegjkpXixBuTcAo83Wr6JB8LbMJTqDD8tfUtn&#10;MHbWegHQOTwEhVlWQjrCpxDeNJkG8lK7WJItSGDwJH7YhoEaxTZ5j5scQQ9BGwbqXDzu08QdwKEz&#10;XcVs1oI1l5XKBlgA5Ky3u3vTpwjdlg+hlblZ9Q0HDjsQirCDFpMwZ8JbAseC2ybTQF7qcpffJV4d&#10;VLxT00kwWDSnpfa45IZZFbRwVl4SjnXvVcstDJTvJO7sTsikLd+hSfQ35LLrMA47SM5vo4VdF/QZ&#10;vc+W0PDywhCqu84ZaZDn39oUMPs3lgZ7dAonSuLkapuc7aTxYgEogF+DkBHU1w1eKrT+OpCjzJ46&#10;mD5F6HaE4XiOWGmFhgOPbRbAG4i5DnOGfUMMB5E5CeOEeKlMQzFcv8InEy9Bi0mYMyGc+EmDxWKH&#10;tZLdq10QisbyOoyzW9/IASmmRxE43B5rHkMj3Rw1DIzwZum5gRcJ0Dk8Fy58WrK7LDhTMuN1JS0F&#10;6r73aamlBy8xpbHgKLVtfAch1BvxLbWYgzIXQR7K1WIXxbKwEEG5jn1pe0M1bPd9oal2w3NeDTtd&#10;+Q5BAuStd1tQ+RA7eBMV00BOapd8H5xhagqfTKIKWkzCnAmVyfOikbXgZycs9toH7pnpghFKZfB2&#10;a3YJyFmv8CeVkK5sryJ81CVtPJQTn63Lofi2Hi5CnXfMDe//JWlZrydtAg7wxFNfffujT03M+FJG&#10;3+5364+7/R6PPPvu6fFh30UvJbx086BWH/2tUKC21z8UaFpsZjIlSvR7JfgqCb7C098Nr4+v0W4N&#10;Q64PbFH02K6/wpsm8NIRvJyybbtvs+gEL/Dcz/o/n8uunkX7/zTwlspKpRi5g35IlznebXf0m0f6&#10;TfN8eGjBXIiVsqkA9X42uI8Pg3lhCN7YAf8/NZ+PFSqizWgPvJmjubFvEeGrP/RZa43vOn34CwAA&#10;//8DAFBLAwQUAAYACAAAACEAmosD0OEAAAAKAQAADwAAAGRycy9kb3ducmV2LnhtbEyPUUvDMBDH&#10;3wW/QzjBN5dMXF1r0yGCuIEIrWXsMWuytphcSpN19dt7PunTcdyP//3++WZ2lk1mDL1HCcuFAGaw&#10;8brHVkL9+Xq3BhaiQq2sRyPh2wTYFNdXucq0v2Bppiq2jEIwZEpCF+OQcR6azjgVFn4wSLeTH52K&#10;tI4t16O6ULiz/F6IhDvVI33o1GBeOtN8VWcnoZzqt9N7tTuU2229Tz/Q9rvGSnl7Mz8/AYtmjn8w&#10;/OqTOhTkdPRn1IFZCal4XBEqIXmgSUC6WibAjkSKdA28yPn/CsUPAAAA//8DAFBLAQItABQABgAI&#10;AAAAIQC2gziS/gAAAOEBAAATAAAAAAAAAAAAAAAAAAAAAABbQ29udGVudF9UeXBlc10ueG1sUEsB&#10;Ai0AFAAGAAgAAAAhADj9If/WAAAAlAEAAAsAAAAAAAAAAAAAAAAALwEAAF9yZWxzLy5yZWxzUEsB&#10;Ai0AFAAGAAgAAAAhAHGRS6OwCQAAMzUAAA4AAAAAAAAAAAAAAAAALgIAAGRycy9lMm9Eb2MueG1s&#10;UEsBAi0AFAAGAAgAAAAhAJqLA9DhAAAACgEAAA8AAAAAAAAAAAAAAAAACgwAAGRycy9kb3ducmV2&#10;LnhtbFBLBQYAAAAABAAEAPMAAAAYDQAAAAA=&#10;" adj="-11796480,,5400" path="m,98c,44,43,,96,v53,,95,44,95,98c191,152,149,196,96,196,43,196,,152,,98xm84,105v,,,,,4c84,115,88,113,88,113v,,,,14,c106,113,105,109,105,109v,,,,,-4c105,101,102,101,102,101v,,,,-14,c83,101,84,105,84,105xm72,63v,,,,45,c117,63,117,63,147,63v5,,4,5,4,5c151,68,151,68,151,88v,,,,-35,15c116,103,116,103,110,103v,,,,,-4c110,95,105,96,105,96v,,,,-23,c80,96,79,99,79,99v,,,,,4c79,103,79,103,74,103v,,,,-34,-15c40,88,40,88,40,69v,-7,3,-6,3,-6c43,63,43,63,72,63xm109,63v,,,,8,c117,63,117,63,118,50v,-6,-7,-5,-7,-5c111,45,111,45,78,45v-6,1,-6,5,-6,5c72,50,72,50,72,63v,,,,9,c81,63,81,63,81,56v,-4,2,-4,2,-4c83,52,83,52,107,52v3,,2,4,2,4c109,56,109,56,109,63xm151,92v,,,,-41,16c110,108,110,108,110,113v,6,-5,6,-5,6c105,119,105,119,84,119v-4,,-4,-6,-4,-6c80,113,80,113,80,108v,,,,-40,-16c40,92,40,92,40,146v,6,4,5,4,5c44,151,44,151,145,151v6,,6,-6,6,-6c151,145,151,145,151,92xm151,92v,,,,,e" fillcolor="#c19f67" stroked="f">
+                <v:stroke joinstyle="miter"/>
+                <v:formulas/>
+                <v:path arrowok="t" o:connecttype="custom" o:connectlocs="0,143828;140751,0;280035,143828;140751,287655;0,143828;123157,154101;123157,159971;129021,165842;149547,165842;153946,159971;153946,154101;149547,148230;129021,148230;123157,154101;105563,92461;171540,92461;215524,92461;221389,99799;221389,129151;170074,151166;161277,151166;161277,145295;153946,140892;120224,140892;115826,145295;115826,151166;108495,151166;58646,129151;58646,101266;63045,92461;105563,92461;159811,92461;171540,92461;173006,73381;162743,66043;114360,66043;105563,73381;105563,92461;118758,92461;118758,82187;121691,76317;156878,76317;159811,82187;159811,92461;221389,135022;161277,158504;161277,165842;153946,174648;123157,174648;117292,165842;117292,158504;58646,135022;58646,214274;64511,221612;212592,221612;221389,212806;221389,135022;221389,135022;221389,135022" o:connectangles="0,0,0,0,0,0,0,0,0,0,0,0,0,0,0,0,0,0,0,0,0,0,0,0,0,0,0,0,0,0,0,0,0,0,0,0,0,0,0,0,0,0,0,0,0,0,0,0,0,0,0,0,0,0,0,0,0,0,0" textboxrect="0,0,191,196"/>
+                <o:lock v:ext="edit" aspectratio="t" verticies="t"/>
+                <v:textbox>
+                  <w:txbxContent>
+                    <w:p>
+                      <w:pPr>
+                        <w:jc w:val="center"/>
+                      </w:pPr>
+                    </w:p>
+                  </w:txbxContent>
+                </v:textbox>
+                <w10:wrap anchory="page"/>
               </v:shape>
             </w:pict>
           </mc:Fallback>
@@ -2531,7 +2567,7 @@
         <mc:AlternateContent>
           <mc:Choice Requires="wps">
             <w:drawing>
-              <wp:anchor distT="0" distB="0" distL="114300" distR="114300" simplePos="0" relativeHeight="251659264" behindDoc="0" locked="0" layoutInCell="1" allowOverlap="1" wp14:anchorId="62B4ABA0" wp14:editId="4828F330">
+              <wp:anchor distT="0" distB="0" distL="114300" distR="114300" simplePos="0" relativeHeight="251659264" behindDoc="0" locked="0" layoutInCell="1" allowOverlap="1" wp14:anchorId="62B4ABA0" wp14:editId="47B7B656">
                 <wp:simplePos x="0" y="0"/>
                 <wp:positionH relativeFrom="column">
                   <wp:posOffset>6210300</wp:posOffset>
@@ -3124,6 +3160,15 @@
                           <a:noFill/>
                         </a:ln>
                       </wps:spPr>
+                      <wps:txbx>
+                        <w:txbxContent>
+                          <w:p>
+                            <w:pPr>
+                              <w:jc w:val="center"/>
+                            </w:pPr>
+                          </w:p>
+                        </w:txbxContent>
+                      </wps:txbx>
                       <wps:bodyPr vert="horz" wrap="square" lIns="91440" tIns="45720" rIns="91440" bIns="45720" numCol="1" anchor="t" anchorCtr="0" compatLnSpc="1"/>
                     </wps:wsp>
                   </a:graphicData>
@@ -3131,14 +3176,23 @@
               </wp:anchor>
             </w:drawing>
           </mc:Choice>
-          <mc:Fallback xmlns:wpsCustomData="http://www.wps.cn/officeDocument/2013/wpsCustomData">
+          <mc:Fallback>
             <w:pict>
-              <v:shape id="Freeform 9" o:spid="_x0000_s1026" o:spt="100" style="position:absolute;left:0pt;margin-left:489pt;margin-top:32.25pt;height:22.65pt;width:22.65pt;mso-position-vertical-relative:page;z-index:251659264;mso-width-relative:page;mso-height-relative:page;" fillcolor="#C19F67" filled="t" stroked="f" coordsize="264,264" o:gfxdata="UEsDBAoAAAAAAIdO4kAAAAAAAAAAAAAAAAAEAAAAZHJzL1BLAwQUAAAACACHTuJALXWre9kAAAAL&#10;AQAADwAAAGRycy9kb3ducmV2LnhtbE2PzW7CMBCE75X6DtZW6q3YgUKTNA6if5f20gISVxNv44h4&#10;HcWGwNvXOdHbrGY0+02xPNuWnbD3jSMJyUQAQ6qcbqiWsN18PKTAfFCkVesIJVzQw7K8vSlUrt1A&#10;P3hah5rFEvK5kmBC6HLOfWXQKj9xHVL0fl1vVYhnX3PdqyGW25ZPhVhwqxqKH4zq8NVgdVgfrYSv&#10;ITFv74neis/MfO+QNy8rcZHy/i4Rz8ACnsM1DCN+RIcyMu3dkbRnrYTsKY1bgoTF4xzYGBDT2QzY&#10;flRZCrws+P8N5R9QSwMEFAAAAAgAh07iQH4fFocBCgAA/DIAAA4AAABkcnMvZTJvRG9jLnhtbK1b&#10;3Y7byg2+L9B3EHxZoLFGtv4W2Ry0m6YokLYBkj6AVpbXRm3JlbQ/OU9/yBlK4mjFYxroza5Nczj8&#10;Po5GJEf6+Mvb+RS8VG13bOr7lfkQroKqLpvdsX66X/3nx5c/Z6ug64t6V5yaurpf/ay61S+f/viH&#10;j6+XuypqDs1pV7UBGKm7u9fL/erQ95e79borD9W56D40l6qGH/dNey56+No+rXdt8QrWz6d1FIbJ&#10;+rVpd5e2KauuA+ln9+OKLLYag81+fyyrz035fK7q3lltq1PRA6TucLx0q0/W2/2+Kvt/7/dd1Qen&#10;+xUg7e1fmAQ+P+Lf9aePxd1TW1wOx5JcKDQuzDCdi2MNk46mPhd9ETy3x3emzseybbpm338om/Pa&#10;AbGMAAoTzrj5figulcUCVHeXkfTu/2e2/NfLtzY47u5XW4h7XZwh4l/aqsL4BTnS83rp7kDr++Vb&#10;iwC7y9em/G8X1M3Doaifqr90FyAZFhKMbv62O/bfmmPdg4cGB6+90filAzvB4+s/mx3MVDz3jaXt&#10;bd+e0ToQErzZ6Pwco1O99UEJwihLkzheBSX8RJ9xhuJuGFw+d/3fq8YaKl6+dr0L7g4+2dDsCN8P&#10;CP7+fII4/2kdhMFrECVbWgijCsAZVcwmCg5LStFMadHShimFy3a2TAV8WfYIkF/3KJkpLXqUMiWc&#10;bhEbrIZxOoGjnKmIHBlOtjHpMjjD+Y7zZZeMx7fJBFOccNEUp9xIlBvOuWjK41w0xUkXTXHSTSJx&#10;xXlPhCUVebRLpiJOe2KWaY882kVTnHazEUIY+bwLCCPOu9lKfnnEp9Hycog48WabCBg95lNhaUWc&#10;ebMVqN941Eu2NhrqNx71abIMccOpj4W9auMzL2wyG878Nl0ma8OJz3PBKc67aInTnks+cdYlS1tO&#10;ehYv+7TlnMfCstpyzjMjWOKUSxfOllOeCetzyxkX19SWUy46xSk3SbYcPbzPjzt7JnC+5ZybVLhH&#10;xJx0EwkIY856ZATaY067iYSdIea8RyZehhhz4nH/WLwNYi4xEiH7xZk30tUce9SLfHHqjRTG2OM+&#10;EXbSxONespVw7vE+t3ivTzzuU+HqSTj3JhH2GUilJlalSzrh1MumOPX5ZjmKice86BVnXjTlEy9s&#10;7yknXjKVct6l/SHltIuWOOuiJY904TaRctKlFCTlnJtQ2B5STrpoinNuQmFVpZx0yVTGORdNZR7p&#10;QvgyTrpsirMuZjMZp92EAu8Z513MZjKfeOGumnHixWwm85iHXXJx/8s482Yr7KW5R70R9uWcUy/y&#10;lXvci7Y491J+m3vUi6Y49dLiyn3mhbtF7jEv7fC5xzzsRovM5x7zki0TetRLxkzocS9b88iHknbR&#10;NRNy9qNws3zHgJ2BbfNmI1SIcH0xtd+xpgqBCVUxMKEXhFAIqAnFKEBP4WnoGhSHoZFQvtXUSYBP&#10;AfQ+sEOBjYVL02HTAtsK0Jr44RofxR1o4a+CMkQDlTe2S3JNGchG5VilDFyicqpSBqpQ2XZ6APbv&#10;+4y1PGpDte46L1fUCaPRgTSEEqpulXXCaXRADSE1OqhYPyNUqJA1zmCNbNV1ULEMtuo6qBFBhVpW&#10;5QxBhXJVo471KjoDFalKfVi5OqhYd1rrOqhYW1p1HdQNQd3ooGKViNahENRAxVLQquugYr1n1XVQ&#10;saaz6jqoWLdZdR1UrM1QHaovDVQsv6y6DipWWFZdBzUmqFAmqZwhqFAJadSxFEJnoNhRqRNUqGdU&#10;6gQVahaVOkGFukSlTlATHVQsPhAq1Bca61hhWHUd1JSgQqWgsk5QoRpQqRNUyPg16pjzo++Q1avU&#10;CWqmg4qpu7Wug4rZuVXXQcUE3KrroGKOjeqQRWugYhpt1XVQMVW26jqomA5bdR1UzHitug6qTWpR&#10;H9NWDVgTElrMTHUDCC8mn7oBhBjzS90AwowpJBvg8ifKEVs4FZsfOrb20PERx0DWWPSYWg4fg1c4&#10;1cLmycH9R/m5eal+NFajn47F4KiFZp1+L58fj+Vfq1/fa7s9FKazFrC3BOzTuaeTob1RiBg8W/43&#10;NyLCtH5uxjoPQn/CQTo57Rv0v5F5pAEs4TSOKuv7MCuaZOLBfRKrABANM0vuKpzN6oSi+6emq6wz&#10;UyyIVchLEYSjA7yaFJYwG8pPffY0UhVgQ2nYzDy2eUcfhzUCbUIm1Zn3hiwbWpYqzbsrdOY9tv4W&#10;vHdSSAogLkrzNMTuSJOf16U3mYfeDV+25L2BsmdJPGW0Vy9HOCm0RMDpwaIpl+3OcUEn6maGDKS4&#10;nrNu/UAjyhNT2kFiHUnYeIRgvjPlttr5xOkgviHKw5gZ4SSeRYekU0p5PQo0JM58LpyncNjAiSO0&#10;kHWDVEkQNGaAICgDuCHIG610trbcFbwd72fXvd+Sed8QHhDjpJ4U21ejUOU8JQkzMy7iM+HNnmPr&#10;cfRmWOSUgPlkYSMWNKeK6CorkEzaEd6qxzYzmvE4IeEN6wUb0WDGX3cknG0Kg9Rd3yrGxyE2Qxlp&#10;cXMafyMl3+HEUL0ahyFQj7DVOEwK1z+XupDCKaLaPDZbgRsDaTczZDt2KIYFyMXUfIEjPPUEJnKR&#10;jVxvauDH4JMHMEM02yPwIQIrHjPKq0tnTEtcf2qcYeOZGsWwGbsZbsCAh6ELdCS0k/orC44unfYN&#10;YTBUg5nUpt6js2P0/RvmIJ5q2essDUvGlcvTDLRQAQuP9DiDfikZPGBCluCQk5vCI6wlsVsApK26&#10;1Ax1ZuYz0LKciakau2UCf8jAkSClNeHQqvzPhyFeNK9I9ffdwVDk3bhICiBYUEh4wybqjRiZcYCc&#10;mUWhjheeBo9mFoU8PdXZpqzA38jwJAfWpL8726OWUaqy7g8ZXJekdFccS9nrFy2Vf3M/uaFpUie9&#10;JR0n87P9i6RmtmMP4lvy5WHMLF8OhxTUuxDgXNftFLfky+MYb33bAyzcdOChH7bsx/uaS6N1IcYn&#10;Jq0pLw1BdpzY3zjxScZpYuUMtEPOcn6qaw00xzmGQXxLHIYxs5CSeBZ/kt6ykGjIbJ0qpO8Jkut8&#10;umin9OZKoU8pNemP1wklAHMxPpqDgbvlru2PGWdQid8j97YD6m3QaYGBLipfA3ReYvxdfcyEpgae&#10;Z3OxHUI9qQjOmfkMknho3YwtwuszDHGYOTtcVzNo76Lse+1/I5b8MWMcVOL3caAVCD9g59BWjWML&#10;0WpPD793zem4+3I8nbB12LVPjw+nNngp4BWIB5N/cakWDPHUTvawum5wGDAOP6PEPr+Pj+y79wAe&#10;m91PeHwf3h6BJ/4PTfvrKniFdyfuV93/nou2WgWnf9Tw6H8O5TpEpLdftnGKh6kt/+WR/1I/nx8a&#10;8A02tKIuwer9qh8+PvTuXQ14WQLAfq2/X0pURAfxZQJ4KcK6Si9w4FsX/LvVml5a+fQbUEsDBAoA&#10;AAAAAIdO4kAAAAAAAAAAAAAAAAAGAAAAX3JlbHMvUEsDBBQAAAAIAIdO4kCKFGY80QAAAJQBAAAL&#10;AAAAX3JlbHMvLnJlbHOlkMFqwzAMhu+DvYPRfXGawxijTi+j0GvpHsDYimMaW0Yy2fr28w6DZfS2&#10;o36h7xP//vCZFrUiS6RsYNf1oDA78jEHA++X49MLKKk2e7tQRgM3FDiMjw/7My62tiOZYxHVKFkM&#10;zLWWV63FzZisdFQwt81EnGxtIwddrLvagHro+2fNvxkwbpjq5A3wyQ+gLrfSzH/YKTomoal2jpKm&#10;aYruHlUHtmWO7sg24Ru5RrMcsBrwLBoHalnXfgR9X7/7p97TRz7jutV+h4zrj1dvuhy/AFBLAwQU&#10;AAAACACHTuJAfublIPcAAADhAQAAEwAAAFtDb250ZW50X1R5cGVzXS54bWyVkUFOwzAQRfdI3MHy&#10;FiVOu0AIJemCtEtAqBxgZE8Si2RseUxob4+TthtEkVjaM/+/J7vcHMZBTBjYOqrkKi+kQNLOWOoq&#10;+b7fZQ9ScAQyMDjCSh6R5aa+vSn3R48sUpq4kn2M/lEp1j2OwLnzSGnSujBCTMfQKQ/6AzpU66K4&#10;V9pRRIpZnDtkXTbYwucQxfaQrk8mAQeW4um0OLMqCd4PVkNMpmoi84OSnQl5Si473FvPd0lDql8J&#10;8+Q64Jx7SU8TrEHxCiE+w5g0lAmsjPuigFP+d8lsOXLm2tZqzJvATYq94XSxutaOa9c4/d/y7ZK6&#10;dKvlg+pvUEsBAhQAFAAAAAgAh07iQH7m5SD3AAAA4QEAABMAAAAAAAAAAQAgAAAAcwwAAFtDb250&#10;ZW50X1R5cGVzXS54bWxQSwECFAAKAAAAAACHTuJAAAAAAAAAAAAAAAAABgAAAAAAAAAAABAAAABV&#10;CwAAX3JlbHMvUEsBAhQAFAAAAAgAh07iQIoUZjzRAAAAlAEAAAsAAAAAAAAAAQAgAAAAeQsAAF9y&#10;ZWxzLy5yZWxzUEsBAhQACgAAAAAAh07iQAAAAAAAAAAAAAAAAAQAAAAAAAAAAAAQAAAAAAAAAGRy&#10;cy9QSwECFAAUAAAACACHTuJALXWre9kAAAALAQAADwAAAAAAAAABACAAAAAiAAAAZHJzL2Rvd25y&#10;ZXYueG1sUEsBAhQAFAAAAAgAh07iQH4fFocBCgAA/DIAAA4AAAAAAAAAAQAgAAAAKAEAAGRycy9l&#10;Mm9Eb2MueG1sUEsFBgAAAAAGAAYAWQEAAJsNAAAAAA==&#10;" path="m0,132c0,59,59,0,132,0c205,0,264,59,264,132c264,205,205,264,132,264c59,264,0,205,0,132xm117,59c118,59,118,59,118,59c134,59,149,59,164,59c164,59,164,59,164,59c166,59,167,59,167,60c167,61,167,61,167,61c167,87,167,114,167,139c167,140,167,141,167,141c167,144,169,146,172,146c176,146,178,144,178,140c178,114,178,87,178,61c178,58,178,55,176,52c173,48,169,47,164,47c143,47,121,47,99,47c98,47,96,47,94,47c91,47,88,48,85,51c83,54,81,57,81,61c82,87,82,114,82,140c82,149,82,159,81,168c81,170,82,172,84,174c97,186,109,199,122,211c123,213,125,214,127,215c132,217,137,215,141,211c153,199,166,187,178,174c180,173,181,171,181,169c182,167,182,166,181,164c179,162,177,162,175,162c148,162,122,162,94,162c94,162,94,162,93,162c93,161,93,161,93,160c93,128,93,94,93,61c93,61,93,61,93,61c94,59,94,59,96,59c98,59,101,59,104,59c104,59,104,59,105,59c105,59,105,59,105,60c105,87,105,113,105,139c105,140,106,141,106,141c106,144,107,145,109,146c111,147,113,146,115,145c117,144,117,142,117,139c117,113,117,87,117,60c117,59,117,59,117,59xm101,174c121,174,141,174,162,174c162,174,162,174,162,174c152,184,142,194,132,203c132,204,132,204,130,203c121,194,111,184,101,174c101,174,101,174,101,174xe">
-                <v:path o:connectlocs="0,143827;143827,0;287655,143827;143827,287655;0,143827;127483,64286;128573,64286;178694,64286;178694,64286;181963,65376;181963,66465;181963,151454;181963,153633;187411,159081;193949,152544;193949,66465;191770,56659;178694,51211;107870,51211;102422,51211;92616,55569;88257,66465;89347,152544;88257,183053;91526,189590;132931,229906;138379,234264;153633,229906;193949,189590;197218,184142;197218,178694;190680,176515;102422,176515;101333,176515;101333,174336;101333,66465;101333,66465;104601,64286;113318,64286;114408,64286;114408,65376;114408,151454;115497,153633;118766,159081;125304,157992;127483,151454;127483,65376;127483,64286;110049,189590;176515,189590;176515,189590;143827,221189;141648,221189;110049,189590;110049,189590" o:connectangles="0,0,0,0,0,0,0,0,0,0,0,0,0,0,0,0,0,0,0,0,0,0,0,0,0,0,0,0,0,0,0,0,0,0,0,0,0,0,0,0,0,0,0,0,0,0,0,0,0,0,0,0,0,0,0"/>
-                <v:fill on="t" focussize="0,0"/>
-                <v:stroke on="f"/>
-                <v:imagedata o:title=""/>
-                <o:lock v:ext="edit" aspectratio="t"/>
+              <v:shape w14:anchorId="62B4ABA0" id="_x0000_s1041" style="position:absolute;left:0;text-align:left;margin-left:489pt;margin-top:32.25pt;width:22.65pt;height:22.65pt;z-index:251659264;visibility:visible;mso-wrap-style:square;mso-wrap-distance-left:9pt;mso-wrap-distance-top:0;mso-wrap-distance-right:9pt;mso-wrap-distance-bottom:0;mso-position-horizontal:absolute;mso-position-horizontal-relative:text;mso-position-vertical:absolute;mso-position-vertical-relative:page;v-text-anchor:top" coordsize="264,264" o:spt="100" o:gfxdata="UEsDBBQABgAIAAAAIQC2gziS/gAAAOEBAAATAAAAW0NvbnRlbnRfVHlwZXNdLnhtbJSRQU7DMBBF&#10;90jcwfIWJU67QAgl6YK0S0CoHGBkTxKLZGx5TGhvj5O2G0SRWNoz/78nu9wcxkFMGNg6quQqL6RA&#10;0s5Y6ir5vt9lD1JwBDIwOMJKHpHlpr69KfdHjyxSmriSfYz+USnWPY7AufNIadK6MEJMx9ApD/oD&#10;OlTrorhX2lFEilmcO2RdNtjC5xDF9pCuTyYBB5bi6bQ4syoJ3g9WQ0ymaiLzg5KdCXlKLjvcW893&#10;SUOqXwnz5DrgnHtJTxOsQfEKIT7DmDSUCaxw7Rqn8787ZsmRM9e2VmPeBN4uqYvTtW7jvijg9N/y&#10;JsXecLq0q+WD6m8AAAD//wMAUEsDBBQABgAIAAAAIQA4/SH/1gAAAJQBAAALAAAAX3JlbHMvLnJl&#10;bHOkkMFqwzAMhu+DvYPRfXGawxijTi+j0GvpHsDYimMaW0Yy2fr2M4PBMnrbUb/Q94l/f/hMi1qR&#10;JVI2sOt6UJgd+ZiDgffL8ekFlFSbvV0oo4EbChzGx4f9GRdb25HMsYhqlCwG5lrLq9biZkxWOiqY&#10;22YiTra2kYMu1l1tQD30/bPm3wwYN0x18gb45AdQl1tp5j/sFB2T0FQ7R0nTNEV3j6o9feQzro1i&#10;OWA14Fm+Q8a1a8+Bvu/d/dMb2JY5uiPbhG/ktn4cqGU/er3pcvwCAAD//wMAUEsDBBQABgAIAAAA&#10;IQCOP/hv4wkAAJsyAAAOAAAAZHJzL2Uyb0RvYy54bWysW9uO48gNfQ+QfxD8GGDHKtnWpTE9i6R3&#10;ZxFgkiwwkw9Qy3LbiC15JfVl9utDliiZVItrOshLt02zTpGHpRLJkj7++HY6Bi9l0x7q6n7hPoSL&#10;oKyKenuonu4X//72+Yd0EbRdXm3zY12V94vvZbv48dOf//Tx9XxXRvW+Pm7LJgCQqr17Pd8v9l13&#10;vlsu22JfnvL2Q30uK/hxVzenvIOvzdNy2+SvgH46LqMwjJevdbM9N3VRti1If+p/XHzy+LtdWXT/&#10;2u3asguO9wuwrfN/G//3Ef8uP33M756a/Lw/FGRG/j9YccoPFUw6Qv2Ud3nw3BzeQZ0ORVO39a77&#10;UNSnZb3bHYrS+wDeuHDizdd9fi69L0BOex5pav9/sMU/X76ef23Q9Pb8pS7+0wZV/bDPq6fyr+0Z&#10;6IOgLkD08/bQ/Vofqg7mdsja8vXc3o2j8UsLOMHj6z/qLcQ5f+5qT8jbrjkhOrgavHnev4+8l29d&#10;UIAwSpN4s1kEBfxEn3GG/G4YXDy33S9l7YHyly9t14dtC5886dugyk8w6zcI8e50hAj+ZRmEwWsQ&#10;xWsK8agC7owqbhUF+zmlaKI0i7RiSuE8zpqpgC3zFoHn1y2KJ0qzFiVMCaeb9Q2uyHE6haOMqagc&#10;OU62c8m8c47zvcnmTXKCb5cqUJxwFYpT7jTKHedchRKcq1CcdBWKk+5ijSvOe6wsqUjQrkFFnPbY&#10;zdMeCdpVKE67WykhjCTviocR592tNbsE8Uk0vxwiTrxbx4qPgvlEWVoRZ96tFepXgnoNa2WhfiWo&#10;T+J5F1ec+o2yV60k88oms+LMr5N5slac+CxTjOK8q0ic9kyzibOuIa056elm3qY153yjLKs15zx1&#10;ChKnXLtw1pzyVFmfa864uqbWnHLVKE65i9P56K0556nC+Zpz7hLlHrHhpLtI8XDDWY+cQvuG0+4i&#10;ZWfYcN4jt5l3ccOJx/1j9jaIucR4i9Pt4sw77WreCOpVvjj1TgvjRnAfKztpLLjXsGLOPd7nZu/1&#10;seA+Ua6emHPvYmWfgVTqwqp2Sceceh2KU5+t5qMYC+ZVqzjzKpQkXtneE068BpVw3rX9IeG0q0ic&#10;dRVJkK7cJhJOupaCJJxzFyrbQ8JJV6E45y5UVlXCSdegUs65CpUK0pXwpZx0HYqzrmYzKafdhQrv&#10;KeddzWZSSbxyV0058Wo2kwrmYZec3f9SzrxbK3tpJqjX8veMU6/ylQnuVSzOvZbfZoJ6FYpTry2u&#10;TDKv3C0ywby2w2eCediNZpnPBPMalgsF9RqYCwX3OpogH0raWdNcyNmPwtX8HQN2BrbNu5VSIcL1&#10;xdT+AM0UAheaYuBCEYRQCagL1ShAT+Fp6Brk+6GRULxV1EmATwH0PrBDgY2Fc91i0wLbCtCa+NY3&#10;PvI70MJfFWWIBiqvfJfkmjKQjcobkzJwicqJSRmoQuXMpIy1PGpDtd53Xv7YRazXvbrNSUdeQtVt&#10;Qic/nc1RR546m6tYP6PtUCFbjMEa2avbXMUy2KvbXI3IVahlTcaQq1CuWtSxXkVjoCI1qQ8r1+Yq&#10;1p0e3eYq1pZe3ebqilxd2VzFKhHRoRC0uIqloFe3uYr1nle3uYo1nVe3uYp1m1e3uYq1GapD9WVx&#10;Fcsvr25zFSssr25zdUOuQplkMoZchUrIoo6lEBoDxY5JnVyFesakTq5CzWJSJ1ehLjGpk6uxzVUs&#10;PtBVqC8s6FhheHWbqwm5CpWCCZ1chWrApE6uQsZvUcecH22HrN6kTq6mNlcxdffoNlcxO/fqNlcx&#10;AffqNlcxx0Z1yKItrmIa7dVtrmKq7NVtrmI67NVtrmLG69VtrvqkFvUxbbU460LyFjNT2wDyF5NP&#10;2wDyGPNL2wDyGVNINgDSRkiIKEds4FRsepzYLAI4TnzEMZA15h2mlsPH4BVOtbB5su//o/xUv5Tf&#10;aq/RXY7F4KiFZr38Xjw/Hoq/lb+/1+73UJjOI2BvCdinE81ehnijEH0QWPJbPyLCtH4K440HoZxw&#10;kF6MloDyG8EjDYCE0/RUeduHWRGSiQfzSWxygGiYIPVX4WTWXqiaf6zb0htziQWx6qBYGekAqy4K&#10;cz47yk8lexapyWFHadgEHtu8o43DGoE2IZPa4MWQeaB5qRG+v0In1mPrb8b6XgpJAcTFCE9D/I50&#10;sfO69CZ46N3wZUvWOyh75sSXjPbq5QgnhZ4IOD2Yheqz3alf0Im6mSEHKa4wtl8/0IgSYko7SGwj&#10;CRuPEMx3UP1WO504GcQ3RHkYMyGcxJPokPSSUl6PAg3ZpJKL3lI4bODEkbeQdYPUSBA0ZoAgKAM4&#10;EOSNXjpZW/0VvB7vZ9etXxO8BMIDYpxUSLF9NQpNxlOSMIHpIz4R3mw5th5Ha4ZFTgmYJAsbsaB5&#10;qYiusgLJpB8hVj22mRFGcELCG9YLNqIBRq47Ek42hUHaX98mxschPkMZaenndHIjJdvhxNC8Goch&#10;UI+w1ThMCtc/l/YhhVNEMzw2W4EbB2k3A/IdOxTDAuRiar7AEZ55Ahf1kY2cTyoHfhw+eQAzRJM9&#10;Ah8i8OIxo7y6dMa0BPIAbuxKQI0Tw2bcz3CDD3gYOkNHTDupXFlwdNlr3xAGRzWYSyRLY/TlDXMQ&#10;X2rZ6ywNS6Yvl0c6RrFcAOMM9qXk8IAJWYJDTh4HPMKaE/cLgLRNl5qjzsx0BlqWEzFVY7dMIIcM&#10;HClSWhO9tyb7s2GIiOYVqf2+OwBF4sZFUnCCBYWEN2yiYsTITO9QDzMrtPHC0+ARZlbI01MbNmUF&#10;ciPDkxxYk3J39kcto9SELocMpmtSuiuOpez1i5bKv6mdHOgyaS+9JR0n+Mn+RVI32bEH8S358jBm&#10;ki+HQwoqLgQ41+13ilvy5XGMWN/+AAs3HXjohy378b7Wp9G2EOMTkx5K3l6AnV4sN058kvEysXEG&#10;2iEnOT/VtQ6a49yHQXxLHIYxk5CSeBJ/kt6ykGjIZJ0apO8J0ut8umgv6c2VQp9SatIfrxNKAKZi&#10;fDQHA3fLXVuOGWcwid97LrYD6m3QaYGDLipfA3Re4uSuPmZClwaewCzEN5qBelIRnDPzGTTx0LoZ&#10;W4QCc3aGIQ4TY4frauLauyhLTPmNfJBjxjiYxO/jQCsQfsDOoa8axxai1748/N7Wx8P28+F4xNZh&#10;2zw9Phyb4CWHlxseXPa5T7VgiFA7+sPqqsZhwDj8jBL//D4+so+vSrR33dvjW3DYYjaFYUHRY739&#10;Dk/0w8sd8BLAvm5+XwSv8KLE/aL97TlvykVw/HsFbwNkUMFDkDr/Zb1J8Hy14b888l+q59NDDebC&#10;HpdXBaDeL7rh40PXv5gBb0aA/1+qr+cCFdFmtAfegPDW09sa+IoF/+61Lu+UfPovAAAA//8DAFBL&#10;AwQUAAYACAAAACEAG9vODuEAAAALAQAADwAAAGRycy9kb3ducmV2LnhtbEyPQU/CQBCF7yb+h82Y&#10;eJOtoFBKt4RoDAdiAgj3oTu21e5s092W+u/dnvT2Ju/lzffS9WBq0VPrKssKHicRCOLc6ooLBaeP&#10;t4cYhPPIGmvLpOCHHKyz25sUE22vfKD+6AsRStglqKD0vkmkdHlJBt3ENsTB+7StQR/OtpC6xWso&#10;N7WcRtFcGqw4fCixoZeS8u9jZxQsTl28+Trv99vDloqi3+ndK74rdX83bFYgPA3+LwwjfkCHLDBd&#10;bMfaiVrBchGHLV7B/OkZxBiIprMZiMuoljHILJX/N2S/AAAA//8DAFBLAQItABQABgAIAAAAIQC2&#10;gziS/gAAAOEBAAATAAAAAAAAAAAAAAAAAAAAAABbQ29udGVudF9UeXBlc10ueG1sUEsBAi0AFAAG&#10;AAgAAAAhADj9If/WAAAAlAEAAAsAAAAAAAAAAAAAAAAALwEAAF9yZWxzLy5yZWxzUEsBAi0AFAAG&#10;AAgAAAAhAI4/+G/jCQAAmzIAAA4AAAAAAAAAAAAAAAAALgIAAGRycy9lMm9Eb2MueG1sUEsBAi0A&#10;FAAGAAgAAAAhABvbzg7hAAAACwEAAA8AAAAAAAAAAAAAAAAAPQwAAGRycy9kb3ducmV2LnhtbFBL&#10;BQYAAAAABAAEAPMAAABLDQAAAAA=&#10;" adj="-11796480,,5400" path="m,132c,59,59,,132,v73,,132,59,132,132c264,205,205,264,132,264,59,264,,205,,132xm117,59v1,,1,,1,c134,59,149,59,164,59v,,,,,c166,59,167,59,167,60v,1,,1,,1c167,87,167,114,167,139v,1,,2,,2c167,144,169,146,172,146v4,,6,-2,6,-6c178,114,178,87,178,61v,-3,,-6,-2,-9c173,48,169,47,164,47v-21,,-43,,-65,c98,47,96,47,94,47v-3,,-6,1,-9,4c83,54,81,57,81,61v1,26,1,53,1,79c82,149,82,159,81,168v,2,1,4,3,6c97,186,109,199,122,211v1,2,3,3,5,4c132,217,137,215,141,211v12,-12,25,-24,37,-37c180,173,181,171,181,169v1,-2,1,-3,,-5c179,162,177,162,175,162v-27,,-53,,-81,c94,162,94,162,93,162v,-1,,-1,,-2c93,128,93,94,93,61v,,,,,c94,59,94,59,96,59v2,,5,,8,c104,59,104,59,105,59v,,,,,1c105,87,105,113,105,139v,1,1,2,1,2c106,144,107,145,109,146v2,1,4,,6,-1c117,144,117,142,117,139v,-26,,-52,,-79c117,59,117,59,117,59xm101,174v20,,40,,61,c162,174,162,174,162,174v-10,10,-20,20,-30,29c132,204,132,204,130,203v-9,-9,-19,-19,-29,-29c101,174,101,174,101,174xe" fillcolor="#c19f67" stroked="f">
+                <v:stroke joinstyle="miter"/>
+                <v:formulas/>
+                <v:path arrowok="t" o:connecttype="custom" o:connectlocs="0,143828;143828,0;287655,143828;143828,287655;0,143828;127483,64287;128573,64287;178695,64287;178695,64287;181964,65376;181964,66466;181964,151455;181964,153634;187412,159082;193949,152544;193949,66466;191770,56659;178695,51211;107871,51211;102423,51211;92616,55570;88258,66466;89347,152544;88258,183053;91527,189591;132931,229906;138379,234264;153634,229906;193949,189591;197218,184143;197218,178695;190680,176516;102423,176516;101333,176516;101333,174336;101333,66466;101333,66466;104602,64287;113319,64287;114408,64287;114408,65376;114408,151455;115498,153634;118767,159082;125304,157992;127483,151455;127483,65376;127483,64287;110050,189591;176516,189591;176516,189591;143828,221189;141648,221189;110050,189591;110050,189591" o:connectangles="0,0,0,0,0,0,0,0,0,0,0,0,0,0,0,0,0,0,0,0,0,0,0,0,0,0,0,0,0,0,0,0,0,0,0,0,0,0,0,0,0,0,0,0,0,0,0,0,0,0,0,0,0,0,0" textboxrect="0,0,264,264"/>
+                <o:lock v:ext="edit" aspectratio="t" verticies="t"/>
+                <v:textbox>
+                  <w:txbxContent>
+                    <w:p>
+                      <w:pPr>
+                        <w:jc w:val="center"/>
+                      </w:pPr>
+                    </w:p>
+                  </w:txbxContent>
+                </v:textbox>
+                <w10:wrap anchory="page"/>
               </v:shape>
             </w:pict>
           </mc:Fallback>
@@ -3352,7 +3406,7 @@
                                     </pic:cNvPicPr>
                                   </pic:nvPicPr>
                                   <pic:blipFill>
-                                    <a:blip r:embed="rId9"/>
+                                    <a:blip r:embed="rId11"/>
                                     <a:stretch>
                                       <a:fillRect/>
                                     </a:stretch>
@@ -3393,7 +3447,7 @@
                                     <pic:cNvPicPr/>
                                   </pic:nvPicPr>
                                   <pic:blipFill>
-                                    <a:blip r:embed="rId10">
+                                    <a:blip r:embed="rId12">
                                       <a:extLst>
                                         <a:ext uri="{28A0092B-C50C-407E-A947-70E740481C1C}">
                                           <a14:useLocalDpi xmlns:a14="http://schemas.microsoft.com/office/drawing/2010/main" val="0"/>
@@ -3735,7 +3789,21 @@
                                 <w:rFonts w:ascii="微软雅黑" w:hAnsi="微软雅黑" w:hint="eastAsia"/>
                                 <w:color w:val="262626" w:themeColor="text1" w:themeTint="D9"/>
                               </w:rPr>
-                              <w:t>姓    名： 朱轩慧</w:t>
+                              <w:t>姓    名：</w:t>
+                            </w:r>
+                            <w:r>
+                              <w:rPr>
+                                <w:rFonts w:ascii="微软雅黑" w:hAnsi="微软雅黑" w:hint="eastAsia"/>
+                                <w:color w:val="262626" w:themeColor="text1" w:themeTint="D9"/>
+                              </w:rPr>
+                              <w:t xml:space="preserve"> </w:t>
+                            </w:r>
+                            <w:r>
+                              <w:rPr>
+                                <w:rFonts w:ascii="微软雅黑" w:hAnsi="微软雅黑" w:hint="eastAsia"/>
+                                <w:color w:val="262626" w:themeColor="text1" w:themeTint="D9"/>
+                              </w:rPr>
+                              <w:t>朱轩慧</w:t>
                             </w:r>
                           </w:p>
                           <w:p>
@@ -3751,7 +3819,21 @@
                                 <w:rFonts w:ascii="微软雅黑" w:hAnsi="微软雅黑" w:hint="eastAsia"/>
                                 <w:color w:val="262626" w:themeColor="text1" w:themeTint="D9"/>
                               </w:rPr>
-                              <w:t>民    族： 汉族</w:t>
+                              <w:t>民    族：</w:t>
+                            </w:r>
+                            <w:r>
+                              <w:rPr>
+                                <w:rFonts w:ascii="微软雅黑" w:hAnsi="微软雅黑" w:hint="eastAsia"/>
+                                <w:color w:val="262626" w:themeColor="text1" w:themeTint="D9"/>
+                              </w:rPr>
+                              <w:t xml:space="preserve"> </w:t>
+                            </w:r>
+                            <w:r>
+                              <w:rPr>
+                                <w:rFonts w:ascii="微软雅黑" w:hAnsi="微软雅黑" w:hint="eastAsia"/>
+                                <w:color w:val="262626" w:themeColor="text1" w:themeTint="D9"/>
+                              </w:rPr>
+                              <w:t>汉族</w:t>
                             </w:r>
                           </w:p>
                           <w:p>
@@ -3767,7 +3849,14 @@
                                 <w:rFonts w:ascii="微软雅黑" w:hAnsi="微软雅黑" w:hint="eastAsia"/>
                                 <w:color w:val="262626" w:themeColor="text1" w:themeTint="D9"/>
                               </w:rPr>
-                              <w:t>电    话：132****7105</w:t>
+                              <w:t>电    话：</w:t>
+                            </w:r>
+                            <w:r>
+                              <w:rPr>
+                                <w:rFonts w:ascii="微软雅黑" w:hAnsi="微软雅黑" w:hint="eastAsia"/>
+                                <w:color w:val="262626" w:themeColor="text1" w:themeTint="D9"/>
+                              </w:rPr>
+                              <w:t>13201217105</w:t>
                             </w:r>
                           </w:p>
                           <w:p>
@@ -3783,7 +3872,28 @@
                                 <w:rFonts w:ascii="微软雅黑" w:hAnsi="微软雅黑" w:hint="eastAsia"/>
                                 <w:color w:val="262626" w:themeColor="text1" w:themeTint="D9"/>
                               </w:rPr>
-                              <w:t>邮    箱：13201217105@163.com</w:t>
+                              <w:t>邮    箱：</w:t>
+                            </w:r>
+                            <w:r>
+                              <w:rPr>
+                                <w:rFonts w:ascii="微软雅黑" w:hAnsi="微软雅黑" w:hint="eastAsia"/>
+                                <w:color w:val="262626" w:themeColor="text1" w:themeTint="D9"/>
+                              </w:rPr>
+                              <w:t>13201217105@163</w:t>
+                            </w:r>
+                            <w:r>
+                              <w:rPr>
+                                <w:rFonts w:ascii="微软雅黑" w:hAnsi="微软雅黑" w:hint="eastAsia"/>
+                                <w:color w:val="262626" w:themeColor="text1" w:themeTint="D9"/>
+                              </w:rPr>
+                              <w:t>.</w:t>
+                            </w:r>
+                            <w:r>
+                              <w:rPr>
+                                <w:rFonts w:ascii="微软雅黑" w:hAnsi="微软雅黑" w:hint="eastAsia"/>
+                                <w:color w:val="262626" w:themeColor="text1" w:themeTint="D9"/>
+                              </w:rPr>
+                              <w:t>com</w:t>
                             </w:r>
                           </w:p>
                         </w:txbxContent>
@@ -3815,7 +3925,21 @@
                           <w:rFonts w:ascii="微软雅黑" w:hAnsi="微软雅黑" w:hint="eastAsia"/>
                           <w:color w:val="262626" w:themeColor="text1" w:themeTint="D9"/>
                         </w:rPr>
-                        <w:t>姓    名： 朱轩慧</w:t>
+                        <w:t>姓    名：</w:t>
+                      </w:r>
+                      <w:r>
+                        <w:rPr>
+                          <w:rFonts w:ascii="微软雅黑" w:hAnsi="微软雅黑" w:hint="eastAsia"/>
+                          <w:color w:val="262626" w:themeColor="text1" w:themeTint="D9"/>
+                        </w:rPr>
+                        <w:t xml:space="preserve"> </w:t>
+                      </w:r>
+                      <w:r>
+                        <w:rPr>
+                          <w:rFonts w:ascii="微软雅黑" w:hAnsi="微软雅黑" w:hint="eastAsia"/>
+                          <w:color w:val="262626" w:themeColor="text1" w:themeTint="D9"/>
+                        </w:rPr>
+                        <w:t>朱轩慧</w:t>
                       </w:r>
                     </w:p>
                     <w:p>
@@ -3831,7 +3955,21 @@
                           <w:rFonts w:ascii="微软雅黑" w:hAnsi="微软雅黑" w:hint="eastAsia"/>
                           <w:color w:val="262626" w:themeColor="text1" w:themeTint="D9"/>
                         </w:rPr>
-                        <w:t>民    族： 汉族</w:t>
+                        <w:t>民    族：</w:t>
+                      </w:r>
+                      <w:r>
+                        <w:rPr>
+                          <w:rFonts w:ascii="微软雅黑" w:hAnsi="微软雅黑" w:hint="eastAsia"/>
+                          <w:color w:val="262626" w:themeColor="text1" w:themeTint="D9"/>
+                        </w:rPr>
+                        <w:t xml:space="preserve"> </w:t>
+                      </w:r>
+                      <w:r>
+                        <w:rPr>
+                          <w:rFonts w:ascii="微软雅黑" w:hAnsi="微软雅黑" w:hint="eastAsia"/>
+                          <w:color w:val="262626" w:themeColor="text1" w:themeTint="D9"/>
+                        </w:rPr>
+                        <w:t>汉族</w:t>
                       </w:r>
                     </w:p>
                     <w:p>
@@ -3847,7 +3985,14 @@
                           <w:rFonts w:ascii="微软雅黑" w:hAnsi="微软雅黑" w:hint="eastAsia"/>
                           <w:color w:val="262626" w:themeColor="text1" w:themeTint="D9"/>
                         </w:rPr>
-                        <w:t>电    话：132****7105</w:t>
+                        <w:t>电    话：</w:t>
+                      </w:r>
+                      <w:r>
+                        <w:rPr>
+                          <w:rFonts w:ascii="微软雅黑" w:hAnsi="微软雅黑" w:hint="eastAsia"/>
+                          <w:color w:val="262626" w:themeColor="text1" w:themeTint="D9"/>
+                        </w:rPr>
+                        <w:t>13201217105</w:t>
                       </w:r>
                     </w:p>
                     <w:p>
@@ -3863,7 +4008,28 @@
                           <w:rFonts w:ascii="微软雅黑" w:hAnsi="微软雅黑" w:hint="eastAsia"/>
                           <w:color w:val="262626" w:themeColor="text1" w:themeTint="D9"/>
                         </w:rPr>
-                        <w:t>邮    箱：13201217105@163.com</w:t>
+                        <w:t>邮    箱：</w:t>
+                      </w:r>
+                      <w:r>
+                        <w:rPr>
+                          <w:rFonts w:ascii="微软雅黑" w:hAnsi="微软雅黑" w:hint="eastAsia"/>
+                          <w:color w:val="262626" w:themeColor="text1" w:themeTint="D9"/>
+                        </w:rPr>
+                        <w:t>13201217105@163</w:t>
+                      </w:r>
+                      <w:r>
+                        <w:rPr>
+                          <w:rFonts w:ascii="微软雅黑" w:hAnsi="微软雅黑" w:hint="eastAsia"/>
+                          <w:color w:val="262626" w:themeColor="text1" w:themeTint="D9"/>
+                        </w:rPr>
+                        <w:t>.</w:t>
+                      </w:r>
+                      <w:r>
+                        <w:rPr>
+                          <w:rFonts w:ascii="微软雅黑" w:hAnsi="微软雅黑" w:hint="eastAsia"/>
+                          <w:color w:val="262626" w:themeColor="text1" w:themeTint="D9"/>
+                        </w:rPr>
+                        <w:t>com</w:t>
                       </w:r>
                     </w:p>
                   </w:txbxContent>
@@ -4302,23 +4468,6 @@
           <w:b/>
           <w:bCs/>
         </w:rPr>
-        <w:t xml:space="preserve">个人简介：聚焦 AI 应用开发、LLM 工程化与全栈敏捷交付，具备 Python、FastAPI、RAG、LangChain、LangGraph、Supabase 等项目实践，能够围绕真实业务痛点完成从模型编排、后端服务、前端交互到云端部署上线的闭环落地；熟悉 Trae、Cursor、Copilot 等 AI 辅助开发工具驱动 MVP 快速迭代，并具备挪威 UiT 全英文交换经历与跨文化技术沟通能力。</w:t>
-      </w:r>
-    </w:p>
-    <w:p>
-      <w:pPr>
-        <w:rPr>
-          <w:rFonts w:hint="eastAsia"/>
-          <w:b/>
-          <w:bCs/>
-        </w:rPr>
-      </w:pPr>
-      <w:r>
-        <w:rPr>
-          <w:rFonts w:hint="eastAsia"/>
-          <w:b/>
-          <w:bCs/>
-        </w:rPr>
         <w:t>AI</w:t>
       </w:r>
       <w:r>
@@ -5009,6 +5158,277 @@
       </w:pPr>
       <w:r>
         <w:rPr>
+          <w:rFonts w:hint="eastAsia"/>
+        </w:rPr>
+        <w:t xml:space="preserve">1. </w:t>
+      </w:r>
+      <w:r>
+        <w:rPr>
+          <w:rFonts w:hint="eastAsia"/>
+        </w:rPr>
+        <w:t>多源文档智能检索与问答平台（项目实践）</w:t>
+      </w:r>
+    </w:p>
+    <w:p>
+      <w:pPr>
+        <w:rPr>
+          <w:rFonts w:hint="eastAsia"/>
+        </w:rPr>
+      </w:pPr>
+      <w:r>
+        <w:rPr>
+          <w:rFonts w:hint="eastAsia"/>
+        </w:rPr>
+        <w:t>技术栈</w:t>
+      </w:r>
+      <w:r>
+        <w:rPr>
+          <w:rFonts w:hint="eastAsia"/>
+        </w:rPr>
+        <w:t>: Python, FastAPI, LangChain, LangGraph, ChromaDB, Redis, Docker</w:t>
+      </w:r>
+    </w:p>
+    <w:p>
+      <w:pPr>
+        <w:rPr>
+          <w:rFonts w:hint="eastAsia"/>
+        </w:rPr>
+      </w:pPr>
+      <w:r>
+        <w:rPr>
+          <w:rFonts w:hint="eastAsia"/>
+        </w:rPr>
+        <w:t>负责多源文档</w:t>
+      </w:r>
+      <w:r>
+        <w:rPr>
+          <w:rFonts w:hint="eastAsia"/>
+        </w:rPr>
+        <w:t xml:space="preserve"> RAG </w:t>
+      </w:r>
+      <w:r>
+        <w:rPr>
+          <w:rFonts w:hint="eastAsia"/>
+        </w:rPr>
+        <w:t>问答链路的设计与实现，完成文档解析、切分、向量化入库、语义检索、答案生成及来源引用等核心模块；通过多轮会话记忆与检索结果重排提升复杂问题下的回答相关性和可解释性，并基于</w:t>
+      </w:r>
+      <w:r>
+        <w:rPr>
+          <w:rFonts w:hint="eastAsia"/>
+        </w:rPr>
+        <w:t xml:space="preserve"> FastAPI </w:t>
+      </w:r>
+      <w:r>
+        <w:rPr>
+          <w:rFonts w:hint="eastAsia"/>
+        </w:rPr>
+        <w:t>完成接</w:t>
+      </w:r>
+      <w:r>
+        <w:rPr>
+          <w:rFonts w:hint="eastAsia"/>
+        </w:rPr>
+        <w:lastRenderedPageBreak/>
+        <w:t>口封装与</w:t>
+      </w:r>
+      <w:r>
+        <w:rPr>
+          <w:rFonts w:hint="eastAsia"/>
+        </w:rPr>
+        <w:t xml:space="preserve"> Docker </w:t>
+      </w:r>
+      <w:r>
+        <w:rPr>
+          <w:rFonts w:hint="eastAsia"/>
+        </w:rPr>
+        <w:t>本地部署，形成可复用的</w:t>
+      </w:r>
+      <w:r>
+        <w:rPr>
+          <w:rFonts w:hint="eastAsia"/>
+        </w:rPr>
+        <w:t xml:space="preserve"> AI </w:t>
+      </w:r>
+      <w:r>
+        <w:rPr>
+          <w:rFonts w:hint="eastAsia"/>
+        </w:rPr>
+        <w:t>应用原型。</w:t>
+      </w:r>
+    </w:p>
+    <w:p>
+      <w:pPr>
+        <w:rPr>
+          <w:rFonts w:hint="eastAsia"/>
+        </w:rPr>
+      </w:pPr>
+      <w:r>
+        <w:rPr>
+          <w:rFonts w:hint="eastAsia"/>
+        </w:rPr>
+        <w:t xml:space="preserve">2. </w:t>
+      </w:r>
+      <w:r>
+        <w:rPr>
+          <w:rFonts w:hint="eastAsia"/>
+        </w:rPr>
+        <w:t>《新世界庄园：破笼之宴》沉浸式</w:t>
+      </w:r>
+      <w:r>
+        <w:rPr>
+          <w:rFonts w:hint="eastAsia"/>
+        </w:rPr>
+        <w:t xml:space="preserve"> RPG </w:t>
+      </w:r>
+      <w:r>
+        <w:rPr>
+          <w:rFonts w:hint="eastAsia"/>
+        </w:rPr>
+        <w:t>交互与数据平台（在线项目）</w:t>
+      </w:r>
+    </w:p>
+    <w:p>
+      <w:pPr>
+        <w:rPr>
+          <w:rFonts w:hint="eastAsia"/>
+        </w:rPr>
+      </w:pPr>
+      <w:r>
+        <w:rPr>
+          <w:rFonts w:hint="eastAsia"/>
+        </w:rPr>
+        <w:t>技术栈</w:t>
+      </w:r>
+      <w:r>
+        <w:rPr>
+          <w:rFonts w:hint="eastAsia"/>
+        </w:rPr>
+        <w:t xml:space="preserve">: HTML5, CSS3, JavaScript, Supabase, Vercel, DNS / </w:t>
+      </w:r>
+      <w:r>
+        <w:rPr>
+          <w:rFonts w:hint="eastAsia"/>
+        </w:rPr>
+        <w:t>域名工程化</w:t>
+      </w:r>
+    </w:p>
+    <w:p>
+      <w:pPr>
+        <w:rPr>
+          <w:rFonts w:hint="eastAsia"/>
+        </w:rPr>
+      </w:pPr>
+      <w:r>
+        <w:rPr>
+          <w:rFonts w:hint="eastAsia"/>
+        </w:rPr>
+        <w:t>负责在线项目的数据架构与核心交互落地，基于</w:t>
+      </w:r>
+      <w:r>
+        <w:rPr>
+          <w:rFonts w:hint="eastAsia"/>
+        </w:rPr>
+        <w:t xml:space="preserve"> Supabase </w:t>
+      </w:r>
+      <w:r>
+        <w:rPr>
+          <w:rFonts w:hint="eastAsia"/>
+        </w:rPr>
+        <w:t>搭建</w:t>
+      </w:r>
+      <w:r>
+        <w:rPr>
+          <w:rFonts w:hint="eastAsia"/>
+        </w:rPr>
+        <w:t xml:space="preserve"> Serverless </w:t>
+      </w:r>
+      <w:r>
+        <w:rPr>
+          <w:rFonts w:hint="eastAsia"/>
+        </w:rPr>
+        <w:t>数据底座，完成数据库、鉴权与</w:t>
+      </w:r>
+      <w:r>
+        <w:rPr>
+          <w:rFonts w:hint="eastAsia"/>
+        </w:rPr>
+        <w:t xml:space="preserve"> RLS </w:t>
+      </w:r>
+      <w:r>
+        <w:rPr>
+          <w:rFonts w:hint="eastAsia"/>
+        </w:rPr>
+        <w:t>策略设计，实现玩家交互数据持久化与权限隔离；独立完成前端实现、域名解析、</w:t>
+      </w:r>
+      <w:r>
+        <w:rPr>
+          <w:rFonts w:hint="eastAsia"/>
+        </w:rPr>
+        <w:t xml:space="preserve">HTTPS </w:t>
+      </w:r>
+      <w:r>
+        <w:rPr>
+          <w:rFonts w:hint="eastAsia"/>
+        </w:rPr>
+        <w:t>与</w:t>
+      </w:r>
+      <w:r>
+        <w:rPr>
+          <w:rFonts w:hint="eastAsia"/>
+        </w:rPr>
+        <w:t xml:space="preserve"> Vercel CI/CD </w:t>
+      </w:r>
+      <w:r>
+        <w:rPr>
+          <w:rFonts w:hint="eastAsia"/>
+        </w:rPr>
+        <w:t>部署，打通从开发、联调到上线的交付链路，推动项目从</w:t>
+      </w:r>
+      <w:r>
+        <w:rPr>
+          <w:rFonts w:hint="eastAsia"/>
+        </w:rPr>
+        <w:t xml:space="preserve"> 0 </w:t>
+      </w:r>
+      <w:r>
+        <w:rPr>
+          <w:rFonts w:hint="eastAsia"/>
+        </w:rPr>
+        <w:t>到</w:t>
+      </w:r>
+      <w:r>
+        <w:rPr>
+          <w:rFonts w:hint="eastAsia"/>
+        </w:rPr>
+        <w:t xml:space="preserve"> 1 </w:t>
+      </w:r>
+      <w:r>
+        <w:rPr>
+          <w:rFonts w:hint="eastAsia"/>
+        </w:rPr>
+        <w:t>发布为可访问的在线</w:t>
+      </w:r>
+      <w:r>
+        <w:rPr>
+          <w:rFonts w:hint="eastAsia"/>
+        </w:rPr>
+        <w:t xml:space="preserve"> MVP</w:t>
+      </w:r>
+      <w:r>
+        <w:rPr>
+          <w:rFonts w:hint="eastAsia"/>
+        </w:rPr>
+        <w:t>。</w:t>
+      </w:r>
+    </w:p>
+    <w:p>
+      <w:pPr>
+        <w:rPr>
+          <w:rFonts w:hint="eastAsia"/>
+        </w:rPr>
+      </w:pPr>
+      <w:r>
+        <w:rPr>
           <w:noProof/>
         </w:rPr>
         <mc:AlternateContent>
@@ -5206,201 +5626,6 @@
                           </wps:spPr>
                           <wps:txbx>
                             <w:txbxContent>
-                              <w:p>
-                                <w:pPr>
-                                  <w:rPr>
-                                    <w:rFonts w:hint="eastAsia"/>
-                                  </w:rPr>
-                                </w:pPr>
-                                <w:r>
-                                  <w:rPr>
-                                    <w:rFonts w:hint="eastAsia"/>
-                                  </w:rPr>
-                                  <w:t xml:space="preserve">1. 多源文档智能检索与问答平台（项目实践）</w:t>
-                                </w:r>
-                              </w:p>
-                              <w:p>
-                                <w:pPr>
-                                  <w:rPr>
-                                    <w:rFonts w:hint="eastAsia"/>
-                                  </w:rPr>
-                                </w:pPr>
-                                <w:r>
-                                  <w:rPr>
-                                    <w:rFonts w:hint="eastAsia"/>
-                                  </w:rPr>
-                                  <w:t xml:space="preserve">技术栈: Python, FastAPI, LangChain, LangGraph, ChromaDB, Redis, Docker</w:t>
-                                </w:r>
-                              </w:p>
-                              <w:p>
-                                <w:pPr>
-                                  <w:rPr>
-                                    <w:rFonts w:hint="eastAsia"/>
-                                  </w:rPr>
-                                </w:pPr>
-                                <w:r>
-                                  <w:rPr>
-                                    <w:rFonts w:hint="eastAsia"/>
-                                  </w:rPr>
-                                  <w:t xml:space="preserve">• 设计混合检索与 Rerank 召回链路，结合向量检索、关键词召回与重排机制抑制长文档噪声和语义漂移，提升复杂问答的相关性与抗幻觉能力。</w:t>
-                                </w:r>
-                              </w:p>
-                              <w:p>
-                                <w:pPr>
-                                  <w:rPr>
-                                    <w:rFonts w:hint="eastAsia"/>
-                                  </w:rPr>
-                                </w:pPr>
-                                <w:r>
-                                  <w:rPr>
-                                    <w:rFonts w:hint="eastAsia"/>
-                                  </w:rPr>
-                                  <w:t xml:space="preserve">• 引入 Redis 多轮会话缓存与上下文隔离策略，复用历史记忆并减少重复检索开销，优化高并发场景下的响应速度与对话连续性。</w:t>
-                                </w:r>
-                              </w:p>
-                              <w:p>
-                                <w:pPr>
-                                  <w:rPr>
-                                    <w:rFonts w:hint="eastAsia"/>
-                                  </w:rPr>
-                                </w:pPr>
-                                <w:r>
-                                  <w:rPr>
-                                    <w:rFonts w:hint="eastAsia"/>
-                                  </w:rPr>
-                                  <w:t xml:space="preserve">• 封装 FastAPI 服务并完成 Docker 容器化部署，统一开发、测试与交付环境，降低环境差异带来的部署成本和维护复杂度。</w:t>
-                                </w:r>
-                              </w:p>
-                              <w:p>
-                                <w:pPr>
-                                  <w:rPr>
-                                    <w:rFonts w:hint="eastAsia"/>
-                                  </w:rPr>
-                                </w:pPr>
-                                <w:r>
-                                  <w:rPr>
-                                    <w:rFonts w:hint="eastAsia"/>
-                                  </w:rPr>
-                                  <w:t xml:space="preserve">2. 基于 LangGraph 的多智能体任务编排系统（项目实践）</w:t>
-                                </w:r>
-                              </w:p>
-                              <w:p>
-                                <w:pPr>
-                                  <w:rPr>
-                                    <w:rFonts w:hint="eastAsia"/>
-                                  </w:rPr>
-                                </w:pPr>
-                                <w:r>
-                                  <w:rPr>
-                                    <w:rFonts w:hint="eastAsia"/>
-                                  </w:rPr>
-                                  <w:t xml:space="preserve">技术栈: Python, FastAPI, LangGraph, LangChain, Pydantic, SSE</w:t>
-                                </w:r>
-                              </w:p>
-                              <w:p>
-                                <w:pPr>
-                                  <w:rPr>
-                                    <w:rFonts w:hint="eastAsia"/>
-                                  </w:rPr>
-                                </w:pPr>
-                                <w:r>
-                                  <w:rPr>
-                                    <w:rFonts w:hint="eastAsia"/>
-                                  </w:rPr>
-                                  <w:t xml:space="preserve">• 构建基于 LangGraph State Graph 的 Planner / Router / Executor 协同架构，将任务拆解、路由决策与执行状态解耦，提升复杂任务流的可扩展性与容错性。</w:t>
-                                </w:r>
-                              </w:p>
-                              <w:p>
-                                <w:pPr>
-                                  <w:rPr>
-                                    <w:rFonts w:hint="eastAsia"/>
-                                  </w:rPr>
-                                </w:pPr>
-                                <w:r>
-                                  <w:rPr>
-                                    <w:rFonts w:hint="eastAsia"/>
-                                  </w:rPr>
-                                  <w:t xml:space="preserve">• 使用 Pydantic 约束 Agent 间输入输出协议与状态持久化结构，减少多角色协作中的状态污染和结果不确定性，提升链路稳定性。</w:t>
-                                </w:r>
-                              </w:p>
-                              <w:p>
-                                <w:pPr>
-                                  <w:rPr>
-                                    <w:rFonts w:hint="eastAsia"/>
-                                  </w:rPr>
-                                </w:pPr>
-                                <w:r>
-                                  <w:rPr>
-                                    <w:rFonts w:hint="eastAsia"/>
-                                  </w:rPr>
-                                  <w:t xml:space="preserve">• 实现基于 SSE 的打字机式流式响应与上下文持久化机制，缩短用户等待感知，并保持长链路任务的连续反馈体验。</w:t>
-                                </w:r>
-                              </w:p>
-                              <w:p>
-                                <w:pPr>
-                                  <w:rPr>
-                                    <w:rFonts w:hint="eastAsia"/>
-                                  </w:rPr>
-                                </w:pPr>
-                                <w:r>
-                                  <w:rPr>
-                                    <w:rFonts w:hint="eastAsia"/>
-                                  </w:rPr>
-                                  <w:t xml:space="preserve">3. 《新世界庄园：破笼之宴》沉浸式 RPG 交互与数据平台（在线项目）</w:t>
-                                </w:r>
-                              </w:p>
-                              <w:p>
-                                <w:pPr>
-                                  <w:rPr>
-                                    <w:rFonts w:hint="eastAsia"/>
-                                  </w:rPr>
-                                </w:pPr>
-                                <w:r>
-                                  <w:rPr>
-                                    <w:rFonts w:hint="eastAsia"/>
-                                  </w:rPr>
-                                  <w:t xml:space="preserve">技术栈: HTML5, CSS3, JavaScript, Supabase, Vercel, DNS / 域名工程化</w:t>
-                                </w:r>
-                              </w:p>
-                              <w:p>
-                                <w:pPr>
-                                  <w:rPr>
-                                    <w:rFonts w:hint="eastAsia"/>
-                                  </w:rPr>
-                                </w:pPr>
-                                <w:r>
-                                  <w:rPr>
-                                    <w:rFonts w:hint="eastAsia"/>
-                                  </w:rPr>
-                                  <w:t xml:space="preserve">• 基于 Supabase 搭建 Serverless 数据底座，完成云端数据库、鉴权与 RLS 行级安全策略设计，实现交互数据的秒级响应、持久化存储与权限隔离。</w:t>
-                                </w:r>
-                              </w:p>
-                              <w:p>
-                                <w:pPr>
-                                  <w:rPr>
-                                    <w:rFonts w:hint="eastAsia"/>
-                                  </w:rPr>
-                                </w:pPr>
-                                <w:r>
-                                  <w:rPr>
-                                    <w:rFonts w:hint="eastAsia"/>
-                                  </w:rPr>
-                                  <w:t xml:space="preserve">• 独立完成前端页面实现与 BaaS 能力接入，围绕沉浸式 RPG 场景快速迭代 MVP，验证从创意原型到在线产品的全栈敏捷交付能力。</w:t>
-                                </w:r>
-                              </w:p>
-                              <w:p>
-                                <w:pPr>
-                                  <w:rPr>
-                                    <w:rFonts w:hint="eastAsia"/>
-                                  </w:rPr>
-                                </w:pPr>
-                                <w:r>
-                                  <w:rPr>
-                                    <w:rFonts w:hint="eastAsia"/>
-                                  </w:rPr>
-                                  <w:t xml:space="preserve">• 打通 www.xinshijie1945.com 域名解析、A/CNAME 配置、HTTPS 证书启用与 Vercel CI/CD 自动化部署链路，形成从 0 到 1 的产品上线闭环经验。</w:t>
-                                </w:r>
-                              </w:p>
                               <w:p>
                                 <w:pPr>
                                   <w:adjustRightInd w:val="0"/>
@@ -6153,71 +6378,6 @@
                           <w:p>
                             <w:pPr>
                               <w:spacing w:line="400" w:lineRule="exact"/>
-                              <w:rPr>
-                                <w:rFonts w:ascii="微软雅黑" w:hAnsi="微软雅黑" w:hint="eastAsia"/>
-                                <w:color w:val="262626" w:themeColor="text1" w:themeTint="D9"/>
-                              </w:rPr>
-                            </w:pPr>
-                            <w:r>
-                              <w:rPr>
-                                <w:rFonts w:ascii="微软雅黑" w:hAnsi="微软雅黑" w:hint="eastAsia"/>
-                                <w:color w:val="262626" w:themeColor="text1" w:themeTint="D9"/>
-                              </w:rPr>
-                              <w:t>2025.12-2026.03</w:t>
-                            </w:r>
-                            <w:r>
-                              <w:rPr>
-                                <w:rFonts w:ascii="微软雅黑" w:hAnsi="微软雅黑"/>
-                                <w:color w:val="262626" w:themeColor="text1" w:themeTint="D9"/>
-                              </w:rPr>
-                              <w:tab/>
-                            </w:r>
-                            <w:r>
-                              <w:rPr>
-                                <w:rFonts w:ascii="微软雅黑" w:hAnsi="微软雅黑"/>
-                                <w:color w:val="262626" w:themeColor="text1" w:themeTint="D9"/>
-                              </w:rPr>
-                              <w:tab/>
-                            </w:r>
-                            <w:r>
-                              <w:rPr>
-                                <w:rFonts w:ascii="微软雅黑" w:hAnsi="微软雅黑"/>
-                                <w:color w:val="262626" w:themeColor="text1" w:themeTint="D9"/>
-                              </w:rPr>
-                              <w:tab/>
-                            </w:r>
-                            <w:r>
-                              <w:rPr>
-                                <w:rFonts w:ascii="微软雅黑" w:hAnsi="微软雅黑" w:hint="eastAsia"/>
-                                <w:color w:val="262626" w:themeColor="text1" w:themeTint="D9"/>
-                              </w:rPr>
-                              <w:t>新疆兵团勘测设计院股份有限公司</w:t>
-                            </w:r>
-                            <w:r>
-                              <w:rPr>
-                                <w:rFonts w:ascii="微软雅黑" w:hAnsi="微软雅黑"/>
-                                <w:color w:val="262626" w:themeColor="text1" w:themeTint="D9"/>
-                              </w:rPr>
-                              <w:tab/>
-                            </w:r>
-                            <w:r>
-                              <w:rPr>
-                                <w:rFonts w:ascii="微软雅黑" w:hAnsi="微软雅黑"/>
-                                <w:color w:val="262626" w:themeColor="text1" w:themeTint="D9"/>
-                              </w:rPr>
-                              <w:tab/>
-                            </w:r>
-                            <w:r>
-                              <w:rPr>
-                                <w:rFonts w:ascii="微软雅黑" w:hAnsi="微软雅黑" w:hint="eastAsia"/>
-                                <w:color w:val="262626" w:themeColor="text1" w:themeTint="D9"/>
-                              </w:rPr>
-                              <w:t>数字工程院产品研发中心</w:t>
-                            </w:r>
-                          </w:p>
-                          <w:p>
-                            <w:pPr>
-                              <w:spacing w:line="400" w:lineRule="exact"/>
                               <w:ind w:left="2520"/>
                               <w:rPr>
                                 <w:rFonts w:ascii="微软雅黑" w:hAnsi="微软雅黑" w:hint="eastAsia"/>
@@ -6229,14 +6389,7 @@
                                 <w:rFonts w:ascii="微软雅黑" w:hAnsi="微软雅黑" w:hint="eastAsia"/>
                                 <w:color w:val="262626" w:themeColor="text1" w:themeTint="D9"/>
                               </w:rPr>
-                              <w:t>主要工作内容：</w:t>
-                            </w:r>
-                            <w:r>
-                              <w:rPr>
-                                <w:rFonts w:ascii="微软雅黑" w:hAnsi="微软雅黑"/>
-                                <w:color w:val="262626" w:themeColor="text1" w:themeTint="D9"/>
-                              </w:rPr>
-                              <w:t>参与数字招标平台客户端的前后端开发（前端无界微前端，后端 JeecgBoot）；协助赋能平台基础能力建设，参与 Drone CI/CD 流水线配置，顺利完成模块交付并支持平台上线。</w:t>
+                              <w:t>主要工作内容：负责无界微前端页面开发、JeecgBoot 后端联调及接口排查，推动数字招标平台需求落地；参与公共功能模块建设，提升能力复用和交付效率；配置 Drone CI/CD 完成构建发布，支持模块按计划上线。</w:t>
                             </w:r>
                           </w:p>
                         </w:txbxContent>
@@ -6258,74 +6411,13 @@
           </mc:Choice>
           <mc:Fallback>
             <w:pict>
-              <v:shape w14:anchorId="695137D3" id="_x0000_s1062" type="#_x0000_t202" style="position:absolute;left:0;text-align:left;margin-left:10.8pt;margin-top:26.7pt;width:509.75pt;height:90.3pt;z-index:251696128;visibility:visible;mso-wrap-style:square;mso-width-percent:0;mso-height-percent:0;mso-wrap-distance-left:9pt;mso-wrap-distance-top:3.6pt;mso-wrap-distance-right:9pt;mso-wrap-distance-bottom:3.6pt;mso-position-horizontal:absolute;mso-position-horizontal-relative:text;mso-position-vertical:absolute;mso-position-vertical-relative:text;mso-width-percent:0;mso-height-percent:0;mso-width-relative:margin;mso-height-relative:margin;v-text-anchor:top" o:gfxdata="UEsDBBQABgAIAAAAIQC2gziS/gAAAOEBAAATAAAAW0NvbnRlbnRfVHlwZXNdLnhtbJSRQU7DMBBF&#10;90jcwfIWJU67QAgl6YK0S0CoHGBkTxKLZGx5TGhvj5O2G0SRWNoz/78nu9wcxkFMGNg6quQqL6RA&#10;0s5Y6ir5vt9lD1JwBDIwOMJKHpHlpr69KfdHjyxSmriSfYz+USnWPY7AufNIadK6MEJMx9ApD/oD&#10;OlTrorhX2lFEilmcO2RdNtjC5xDF9pCuTyYBB5bi6bQ4syoJ3g9WQ0ymaiLzg5KdCXlKLjvcW893&#10;SUOqXwnz5DrgnHtJTxOsQfEKIT7DmDSUCaxw7Rqn8787ZsmRM9e2VmPeBN4uqYvTtW7jvijg9N/y&#10;JsXecLq0q+WD6m8AAAD//wMAUEsDBBQABgAIAAAAIQA4/SH/1gAAAJQBAAALAAAAX3JlbHMvLnJl&#10;bHOkkMFqwzAMhu+DvYPRfXGawxijTi+j0GvpHsDYimMaW0Yy2fr2M4PBMnrbUb/Q94l/f/hMi1qR&#10;JVI2sOt6UJgd+ZiDgffL8ekFlFSbvV0oo4EbChzGx4f9GRdb25HMsYhqlCwG5lrLq9biZkxWOiqY&#10;22YiTra2kYMu1l1tQD30/bPm3wwYN0x18gb45AdQl1tp5j/sFB2T0FQ7R0nTNEV3j6o9feQzro1i&#10;OWA14Fm+Q8a1a8+Bvu/d/dMb2JY5uiPbhG/ktn4cqGU/er3pcvwCAAD//wMAUEsDBBQABgAIAAAA&#10;IQCm/HwM8QEAAL4DAAAOAAAAZHJzL2Uyb0RvYy54bWysU9tuGyEQfa/Uf0C81+t1bcdZeR2liVJV&#10;Si9S2g8Ys6wXFRgK2Lvu13fAG8dK36rygBgGDnPOHNY3g9HsIH1QaGteTqacSSuwUXZX8x/fH96t&#10;OAsRbAMaraz5UQZ+s3n7Zt27Ss6wQ91IzwjEhqp3Ne9idFVRBNFJA2GCTlpKtugNRAr9rmg89IRu&#10;dDGbTpdFj75xHoUMgXbvT0m+yfhtK0X82rZBRqZrTrXFPPs8b9NcbNZQ7Ty4TomxDPiHKgwoS4+e&#10;oe4hAtt79ReUUcJjwDZOBJoC21YJmTkQm3L6is1TB05mLiROcGeZwv+DFV8OT+6bZ3H4gAM1MJMI&#10;7hHFz8As3nVgd/LWe+w7CQ09XCbJit6FaryapA5VSCDb/jM21GTYR8xAQ+tNUoV4MkKnBhzPossh&#10;MkGby/nV+9VswZmgXFnOl6syt6WA6vm68yF+lGhYWtTcU1czPBweQ0zlQPV8JL1m8UFpnTurLetr&#10;fr0g/FcZoyIZTytT89U0jcwLKm1HeonRiVsctgNTDVU3S4cS3S02RyLs8WQo+gC06ND/5qwnM9U8&#10;/NqDl5zpT5ZEuy7n8+S+HMwXVzMK/GVme5kBKwiq5pGz0/IuZseeGNySuK3KtF8qGWsmk2Q1RkMn&#10;F17G+dTLt9v8AQAA//8DAFBLAwQUAAYACAAAACEA618ZI94AAAAKAQAADwAAAGRycy9kb3ducmV2&#10;LnhtbEyPQU/CQBCF7yb+h82QeJPdQiFYuyVG41UjCgm3oTu0Dd3ZprvQ+u9dTnKcfC/vfZOvR9uK&#10;C/W+cawhmSoQxKUzDVcafr7fH1cgfEA22DomDb/kYV3c3+WYGTfwF102oRKxhH2GGuoQukxKX9Zk&#10;0U9dRxzZ0fUWQzz7Spoeh1huWzlTaiktNhwXauzotabytDlbDduP436Xqs/qzS66wY1Ksn2SWj9M&#10;xpdnEIHG8B+Gq35UhyI6HdyZjRethlmyjEkNi3kK4spVmiQgDpHMUwWyyOXtC8UfAAAA//8DAFBL&#10;AQItABQABgAIAAAAIQC2gziS/gAAAOEBAAATAAAAAAAAAAAAAAAAAAAAAABbQ29udGVudF9UeXBl&#10;c10ueG1sUEsBAi0AFAAGAAgAAAAhADj9If/WAAAAlAEAAAsAAAAAAAAAAAAAAAAALwEAAF9yZWxz&#10;Ly5yZWxzUEsBAi0AFAAGAAgAAAAhAKb8fAzxAQAAvgMAAA4AAAAAAAAAAAAAAAAALgIAAGRycy9l&#10;Mm9Eb2MueG1sUEsBAi0AFAAGAAgAAAAhAOtfGSPeAAAACgEAAA8AAAAAAAAAAAAAAAAASwQAAGRy&#10;cy9kb3ducmV2LnhtbFBLBQYAAAAABAAEAPMAAABWBQAAAAA=&#10;" filled="f" stroked="f">
+              <v:shapetype w14:anchorId="695137D3" id="_x0000_t202" coordsize="21600,21600" o:spt="202" path="m,l,21600r21600,l21600,xe">
+                <v:stroke joinstyle="miter"/>
+                <v:path gradientshapeok="t" o:connecttype="rect"/>
+              </v:shapetype>
+              <v:shape id="_x0000_s1065" type="#_x0000_t202" style="position:absolute;left:0;text-align:left;margin-left:10.8pt;margin-top:26.7pt;width:509.75pt;height:90.3pt;z-index:251696128;visibility:visible;mso-wrap-style:square;mso-width-percent:0;mso-height-percent:0;mso-wrap-distance-left:9pt;mso-wrap-distance-top:3.6pt;mso-wrap-distance-right:9pt;mso-wrap-distance-bottom:3.6pt;mso-position-horizontal:absolute;mso-position-horizontal-relative:text;mso-position-vertical:absolute;mso-position-vertical-relative:text;mso-width-percent:0;mso-height-percent:0;mso-width-relative:margin;mso-height-relative:margin;v-text-anchor:top" o:gfxdata="UEsDBBQABgAIAAAAIQC2gziS/gAAAOEBAAATAAAAW0NvbnRlbnRfVHlwZXNdLnhtbJSRQU7DMBBF&#10;90jcwfIWJU67QAgl6YK0S0CoHGBkTxKLZGx5TGhvj5O2G0SRWNoz/78nu9wcxkFMGNg6quQqL6RA&#10;0s5Y6ir5vt9lD1JwBDIwOMJKHpHlpr69KfdHjyxSmriSfYz+USnWPY7AufNIadK6MEJMx9ApD/oD&#10;OlTrorhX2lFEilmcO2RdNtjC5xDF9pCuTyYBB5bi6bQ4syoJ3g9WQ0ymaiLzg5KdCXlKLjvcW893&#10;SUOqXwnz5DrgnHtJTxOsQfEKIT7DmDSUCaxw7Rqn8787ZsmRM9e2VmPeBN4uqYvTtW7jvijg9N/y&#10;JsXecLq0q+WD6m8AAAD//wMAUEsDBBQABgAIAAAAIQA4/SH/1gAAAJQBAAALAAAAX3JlbHMvLnJl&#10;bHOkkMFqwzAMhu+DvYPRfXGawxijTi+j0GvpHsDYimMaW0Yy2fr2M4PBMnrbUb/Q94l/f/hMi1qR&#10;JVI2sOt6UJgd+ZiDgffL8ekFlFSbvV0oo4EbChzGx4f9GRdb25HMsYhqlCwG5lrLq9biZkxWOiqY&#10;22YiTra2kYMu1l1tQD30/bPm3wwYN0x18gb45AdQl1tp5j/sFB2T0FQ7R0nTNEV3j6o9feQzro1i&#10;OWA14Fm+Q8a1a8+Bvu/d/dMb2JY5uiPbhG/ktn4cqGU/er3pcvwCAAD//wMAUEsDBBQABgAIAAAA&#10;IQCm/HwM8QEAAL4DAAAOAAAAZHJzL2Uyb0RvYy54bWysU9tuGyEQfa/Uf0C81+t1bcdZeR2liVJV&#10;Si9S2g8Ys6wXFRgK2Lvu13fAG8dK36rygBgGDnPOHNY3g9HsIH1QaGteTqacSSuwUXZX8x/fH96t&#10;OAsRbAMaraz5UQZ+s3n7Zt27Ss6wQ91IzwjEhqp3Ne9idFVRBNFJA2GCTlpKtugNRAr9rmg89IRu&#10;dDGbTpdFj75xHoUMgXbvT0m+yfhtK0X82rZBRqZrTrXFPPs8b9NcbNZQ7Ty4TomxDPiHKgwoS4+e&#10;oe4hAtt79ReUUcJjwDZOBJoC21YJmTkQm3L6is1TB05mLiROcGeZwv+DFV8OT+6bZ3H4gAM1MJMI&#10;7hHFz8As3nVgd/LWe+w7CQ09XCbJit6FaryapA5VSCDb/jM21GTYR8xAQ+tNUoV4MkKnBhzPossh&#10;MkGby/nV+9VswZmgXFnOl6syt6WA6vm68yF+lGhYWtTcU1czPBweQ0zlQPV8JL1m8UFpnTurLetr&#10;fr0g/FcZoyIZTytT89U0jcwLKm1HeonRiVsctgNTDVU3S4cS3S02RyLs8WQo+gC06ND/5qwnM9U8&#10;/NqDl5zpT5ZEuy7n8+S+HMwXVzMK/GVme5kBKwiq5pGz0/IuZseeGNySuK3KtF8qGWsmk2Q1RkMn&#10;F17G+dTLt9v8AQAA//8DAFBLAwQUAAYACAAAACEA618ZI94AAAAKAQAADwAAAGRycy9kb3ducmV2&#10;LnhtbEyPQU/CQBCF7yb+h82QeJPdQiFYuyVG41UjCgm3oTu0Dd3ZprvQ+u9dTnKcfC/vfZOvR9uK&#10;C/W+cawhmSoQxKUzDVcafr7fH1cgfEA22DomDb/kYV3c3+WYGTfwF102oRKxhH2GGuoQukxKX9Zk&#10;0U9dRxzZ0fUWQzz7Spoeh1huWzlTaiktNhwXauzotabytDlbDduP436Xqs/qzS66wY1Ksn2SWj9M&#10;xpdnEIHG8B+Gq35UhyI6HdyZjRethlmyjEkNi3kK4spVmiQgDpHMUwWyyOXtC8UfAAAA//8DAFBL&#10;AQItABQABgAIAAAAIQC2gziS/gAAAOEBAAATAAAAAAAAAAAAAAAAAAAAAABbQ29udGVudF9UeXBl&#10;c10ueG1sUEsBAi0AFAAGAAgAAAAhADj9If/WAAAAlAEAAAsAAAAAAAAAAAAAAAAALwEAAF9yZWxz&#10;Ly5yZWxzUEsBAi0AFAAGAAgAAAAhAKb8fAzxAQAAvgMAAA4AAAAAAAAAAAAAAAAALgIAAGRycy9l&#10;Mm9Eb2MueG1sUEsBAi0AFAAGAAgAAAAhAOtfGSPeAAAACgEAAA8AAAAAAAAAAAAAAAAASwQAAGRy&#10;cy9kb3ducmV2LnhtbFBLBQYAAAAABAAEAPMAAABWBQAAAAA=&#10;" filled="f" stroked="f">
                 <v:textbox>
                   <w:txbxContent>
-                    <w:p>
-                      <w:pPr>
-                        <w:spacing w:line="400" w:lineRule="exact"/>
-                        <w:rPr>
-                          <w:rFonts w:ascii="微软雅黑" w:hAnsi="微软雅黑" w:hint="eastAsia"/>
-                          <w:color w:val="262626" w:themeColor="text1" w:themeTint="D9"/>
-                        </w:rPr>
-                      </w:pPr>
-                      <w:r>
-                        <w:rPr>
-                          <w:rFonts w:ascii="微软雅黑" w:hAnsi="微软雅黑" w:hint="eastAsia"/>
-                          <w:color w:val="262626" w:themeColor="text1" w:themeTint="D9"/>
-                        </w:rPr>
-                        <w:t>2025.12-2026.03</w:t>
-                      </w:r>
-                      <w:r>
-                        <w:rPr>
-                          <w:rFonts w:ascii="微软雅黑" w:hAnsi="微软雅黑"/>
-                          <w:color w:val="262626" w:themeColor="text1" w:themeTint="D9"/>
-                        </w:rPr>
-                        <w:tab/>
-                      </w:r>
-                      <w:r>
-                        <w:rPr>
-                          <w:rFonts w:ascii="微软雅黑" w:hAnsi="微软雅黑"/>
-                          <w:color w:val="262626" w:themeColor="text1" w:themeTint="D9"/>
-                        </w:rPr>
-                        <w:tab/>
-                      </w:r>
-                      <w:r>
-                        <w:rPr>
-                          <w:rFonts w:ascii="微软雅黑" w:hAnsi="微软雅黑"/>
-                          <w:color w:val="262626" w:themeColor="text1" w:themeTint="D9"/>
-                        </w:rPr>
-                        <w:tab/>
-                      </w:r>
-                      <w:r>
-                        <w:rPr>
-                          <w:rFonts w:ascii="微软雅黑" w:hAnsi="微软雅黑" w:hint="eastAsia"/>
-                          <w:color w:val="262626" w:themeColor="text1" w:themeTint="D9"/>
-                        </w:rPr>
-                        <w:t>新疆兵团勘测设计院股份有限公司</w:t>
-                      </w:r>
-                      <w:r>
-                        <w:rPr>
-                          <w:rFonts w:ascii="微软雅黑" w:hAnsi="微软雅黑"/>
-                          <w:color w:val="262626" w:themeColor="text1" w:themeTint="D9"/>
-                        </w:rPr>
-                        <w:tab/>
-                      </w:r>
-                      <w:r>
-                        <w:rPr>
-                          <w:rFonts w:ascii="微软雅黑" w:hAnsi="微软雅黑"/>
-                          <w:color w:val="262626" w:themeColor="text1" w:themeTint="D9"/>
-                        </w:rPr>
-                        <w:tab/>
-                      </w:r>
-                      <w:r>
-                        <w:rPr>
-                          <w:rFonts w:ascii="微软雅黑" w:hAnsi="微软雅黑" w:hint="eastAsia"/>
-                          <w:color w:val="262626" w:themeColor="text1" w:themeTint="D9"/>
-                        </w:rPr>
-                        <w:t>数字工程院产品研发中心</w:t>
-                      </w:r>
-                    </w:p>
                     <w:p>
                       <w:pPr>
                         <w:spacing w:line="400" w:lineRule="exact"/>
@@ -6340,14 +6432,7 @@
                           <w:rFonts w:ascii="微软雅黑" w:hAnsi="微软雅黑" w:hint="eastAsia"/>
                           <w:color w:val="262626" w:themeColor="text1" w:themeTint="D9"/>
                         </w:rPr>
-                        <w:t>主要工作内容：</w:t>
-                      </w:r>
-                      <w:r>
-                        <w:rPr>
-                          <w:rFonts w:ascii="微软雅黑" w:hAnsi="微软雅黑"/>
-                          <w:color w:val="262626" w:themeColor="text1" w:themeTint="D9"/>
-                        </w:rPr>
-                        <w:t>参与数字招标平台客户端的前后端开发（前端无界微前端，后端 JeecgBoot）；协助赋能平台基础能力建设，参与 Drone CI/CD 流水线配置，顺利完成模块交付并支持平台上线。</w:t>
+                        <w:t>主要工作内容：负责无界微前端页面开发、JeecgBoot 后端联调及接口排查，推动数字招标平台需求落地；参与公共功能模块建设，提升能力复用和交付效率；配置 Drone CI/CD 完成构建发布，支持模块按计划上线。</w:t>
                       </w:r>
                     </w:p>
                   </w:txbxContent>

</xml_diff>